<commit_message>
Thêm sửa, xóa cho đợt minh chứng, văn bản & thông báo và người dùng
- Minh chứng: trang sửa đợt (thông tin, sửa/thêm/xóa tiêu chí), xóa đợt kèm tệp;
  không xóa được tiêu chí đã có minh chứng.
- Văn bản: trang sửa (gỡ/thêm tệp, tùy chọn yêu cầu ký nhận lại), xóa ở chi tiết
  và danh sách; sửa/xóa danh mục (chặn khi còn văn bản).
- Người dùng: trang sửa thông tin; chỉ xóa được tài khoản chưa phát sinh dữ liệu,
  nếu có dữ liệu thì liệt kê và đề nghị Khóa.
- next.config: hỗ trợ NEXT_DIST_DIR để build kiểm tra khi server dev đang chạy.
- Cập nhật tài liệu Giai-thich-ma-nguon.docx.

Co-Authored-By: Claude Opus 5.5 <noreply@anthropic.com>
</commit_message>
<xml_diff>
--- a/docs/Giai-thich-ma-nguon.docx
+++ b/docs/Giai-thich-ma-nguon.docx
@@ -126,7 +126,7 @@
     <w:sdt>
       <w:sdtPr>
         <w:alias w:val="Mục lục"/>
-        <w:id w:val="428239329"/>
+        <w:id w:val="-1994322326"/>
       </w:sdtPr>
       <w:sdtEndPr/>
       <w:sdtContent>
@@ -154,7 +154,7 @@
           <w:r>
             <w:fldChar w:fldCharType="separate"/>
           </w:r>
-          <w:hyperlink w:anchor="_Toc244117604" w:history="1">
+          <w:hyperlink w:anchor="_Toc244179370" w:history="1">
             <w:r>
               <w:rPr>
                 <w:rStyle w:val="Hyperlink"/>
@@ -178,7 +178,7 @@
               <w:rPr>
                 <w:noProof/>
               </w:rPr>
-              <w:instrText xml:space="preserve"> PAGEREF _Toc244117604 \h </w:instrText>
+              <w:instrText xml:space="preserve"> PAGEREF _Toc244179370 \h </w:instrText>
             </w:r>
             <w:r>
               <w:rPr>
@@ -220,7 +220,7 @@
               <w14:ligatures w14:val="standardContextual"/>
             </w:rPr>
           </w:pPr>
-          <w:hyperlink w:anchor="_Toc244117605" w:history="1">
+          <w:hyperlink w:anchor="_Toc244179371" w:history="1">
             <w:r>
               <w:rPr>
                 <w:rStyle w:val="Hyperlink"/>
@@ -244,7 +244,7 @@
               <w:rPr>
                 <w:noProof/>
               </w:rPr>
-              <w:instrText xml:space="preserve"> PAGEREF _Toc244117605 \h </w:instrText>
+              <w:instrText xml:space="preserve"> PAGEREF _Toc244179371 \h </w:instrText>
             </w:r>
             <w:r>
               <w:rPr>
@@ -286,7 +286,7 @@
               <w14:ligatures w14:val="standardContextual"/>
             </w:rPr>
           </w:pPr>
-          <w:hyperlink w:anchor="_Toc244117606" w:history="1">
+          <w:hyperlink w:anchor="_Toc244179372" w:history="1">
             <w:r>
               <w:rPr>
                 <w:rStyle w:val="Hyperlink"/>
@@ -310,7 +310,7 @@
               <w:rPr>
                 <w:noProof/>
               </w:rPr>
-              <w:instrText xml:space="preserve"> PAGEREF _Toc244117606 \h </w:instrText>
+              <w:instrText xml:space="preserve"> PAGEREF _Toc244179372 \h </w:instrText>
             </w:r>
             <w:r>
               <w:rPr>
@@ -352,7 +352,7 @@
               <w14:ligatures w14:val="standardContextual"/>
             </w:rPr>
           </w:pPr>
-          <w:hyperlink w:anchor="_Toc244117607" w:history="1">
+          <w:hyperlink w:anchor="_Toc244179373" w:history="1">
             <w:r>
               <w:rPr>
                 <w:rStyle w:val="Hyperlink"/>
@@ -376,7 +376,7 @@
               <w:rPr>
                 <w:noProof/>
               </w:rPr>
-              <w:instrText xml:space="preserve"> PAGEREF _Toc244117607 \h </w:instrText>
+              <w:instrText xml:space="preserve"> PAGEREF _Toc244179373 \h </w:instrText>
             </w:r>
             <w:r>
               <w:rPr>
@@ -418,7 +418,7 @@
               <w14:ligatures w14:val="standardContextual"/>
             </w:rPr>
           </w:pPr>
-          <w:hyperlink w:anchor="_Toc244117608" w:history="1">
+          <w:hyperlink w:anchor="_Toc244179374" w:history="1">
             <w:r>
               <w:rPr>
                 <w:rStyle w:val="Hyperlink"/>
@@ -442,7 +442,7 @@
               <w:rPr>
                 <w:noProof/>
               </w:rPr>
-              <w:instrText xml:space="preserve"> PAGEREF _Toc244117608 \h </w:instrText>
+              <w:instrText xml:space="preserve"> PAGEREF _Toc244179374 \h </w:instrText>
             </w:r>
             <w:r>
               <w:rPr>
@@ -484,7 +484,7 @@
               <w14:ligatures w14:val="standardContextual"/>
             </w:rPr>
           </w:pPr>
-          <w:hyperlink w:anchor="_Toc244117609" w:history="1">
+          <w:hyperlink w:anchor="_Toc244179375" w:history="1">
             <w:r>
               <w:rPr>
                 <w:rStyle w:val="Hyperlink"/>
@@ -508,7 +508,7 @@
               <w:rPr>
                 <w:noProof/>
               </w:rPr>
-              <w:instrText xml:space="preserve"> PAGEREF _Toc244117609 \h </w:instrText>
+              <w:instrText xml:space="preserve"> PAGEREF _Toc244179375 \h </w:instrText>
             </w:r>
             <w:r>
               <w:rPr>
@@ -550,7 +550,7 @@
               <w14:ligatures w14:val="standardContextual"/>
             </w:rPr>
           </w:pPr>
-          <w:hyperlink w:anchor="_Toc244117610" w:history="1">
+          <w:hyperlink w:anchor="_Toc244179376" w:history="1">
             <w:r>
               <w:rPr>
                 <w:rStyle w:val="Hyperlink"/>
@@ -574,7 +574,7 @@
               <w:rPr>
                 <w:noProof/>
               </w:rPr>
-              <w:instrText xml:space="preserve"> PAGEREF _Toc244117610 \h </w:instrText>
+              <w:instrText xml:space="preserve"> PAGEREF _Toc244179376 \h </w:instrText>
             </w:r>
             <w:r>
               <w:rPr>
@@ -616,7 +616,7 @@
               <w14:ligatures w14:val="standardContextual"/>
             </w:rPr>
           </w:pPr>
-          <w:hyperlink w:anchor="_Toc244117611" w:history="1">
+          <w:hyperlink w:anchor="_Toc244179377" w:history="1">
             <w:r>
               <w:rPr>
                 <w:rStyle w:val="Hyperlink"/>
@@ -640,7 +640,7 @@
               <w:rPr>
                 <w:noProof/>
               </w:rPr>
-              <w:instrText xml:space="preserve"> PAGEREF _Toc244117611 \h </w:instrText>
+              <w:instrText xml:space="preserve"> PAGEREF _Toc244179377 \h </w:instrText>
             </w:r>
             <w:r>
               <w:rPr>
@@ -682,7 +682,7 @@
               <w14:ligatures w14:val="standardContextual"/>
             </w:rPr>
           </w:pPr>
-          <w:hyperlink w:anchor="_Toc244117612" w:history="1">
+          <w:hyperlink w:anchor="_Toc244179378" w:history="1">
             <w:r>
               <w:rPr>
                 <w:rStyle w:val="Hyperlink"/>
@@ -706,7 +706,7 @@
               <w:rPr>
                 <w:noProof/>
               </w:rPr>
-              <w:instrText xml:space="preserve"> PAGEREF _Toc244117612 \h </w:instrText>
+              <w:instrText xml:space="preserve"> PAGEREF _Toc244179378 \h </w:instrText>
             </w:r>
             <w:r>
               <w:rPr>
@@ -748,7 +748,7 @@
               <w14:ligatures w14:val="standardContextual"/>
             </w:rPr>
           </w:pPr>
-          <w:hyperlink w:anchor="_Toc244117613" w:history="1">
+          <w:hyperlink w:anchor="_Toc244179379" w:history="1">
             <w:r>
               <w:rPr>
                 <w:rStyle w:val="Hyperlink"/>
@@ -772,7 +772,7 @@
               <w:rPr>
                 <w:noProof/>
               </w:rPr>
-              <w:instrText xml:space="preserve"> PAGEREF _Toc244117613 \h </w:instrText>
+              <w:instrText xml:space="preserve"> PAGEREF _Toc244179379 \h </w:instrText>
             </w:r>
             <w:r>
               <w:rPr>
@@ -789,7 +789,7 @@
               <w:rPr>
                 <w:noProof/>
               </w:rPr>
-              <w:t>7</w:t>
+              <w:t>8</w:t>
             </w:r>
             <w:r>
               <w:rPr>
@@ -814,7 +814,7 @@
               <w14:ligatures w14:val="standardContextual"/>
             </w:rPr>
           </w:pPr>
-          <w:hyperlink w:anchor="_Toc244117614" w:history="1">
+          <w:hyperlink w:anchor="_Toc244179380" w:history="1">
             <w:r>
               <w:rPr>
                 <w:rStyle w:val="Hyperlink"/>
@@ -838,7 +838,7 @@
               <w:rPr>
                 <w:noProof/>
               </w:rPr>
-              <w:instrText xml:space="preserve"> PAGEREF _Toc244117614 \h </w:instrText>
+              <w:instrText xml:space="preserve"> PAGEREF _Toc244179380 \h </w:instrText>
             </w:r>
             <w:r>
               <w:rPr>
@@ -880,7 +880,7 @@
               <w14:ligatures w14:val="standardContextual"/>
             </w:rPr>
           </w:pPr>
-          <w:hyperlink w:anchor="_Toc244117615" w:history="1">
+          <w:hyperlink w:anchor="_Toc244179381" w:history="1">
             <w:r>
               <w:rPr>
                 <w:rStyle w:val="Hyperlink"/>
@@ -904,7 +904,7 @@
               <w:rPr>
                 <w:noProof/>
               </w:rPr>
-              <w:instrText xml:space="preserve"> PAGEREF _Toc244117615 \h </w:instrText>
+              <w:instrText xml:space="preserve"> PAGEREF _Toc244179381 \h </w:instrText>
             </w:r>
             <w:r>
               <w:rPr>
@@ -946,7 +946,7 @@
               <w14:ligatures w14:val="standardContextual"/>
             </w:rPr>
           </w:pPr>
-          <w:hyperlink w:anchor="_Toc244117616" w:history="1">
+          <w:hyperlink w:anchor="_Toc244179382" w:history="1">
             <w:r>
               <w:rPr>
                 <w:rStyle w:val="Hyperlink"/>
@@ -970,7 +970,7 @@
               <w:rPr>
                 <w:noProof/>
               </w:rPr>
-              <w:instrText xml:space="preserve"> PAGEREF _Toc244117616 \h </w:instrText>
+              <w:instrText xml:space="preserve"> PAGEREF _Toc244179382 \h </w:instrText>
             </w:r>
             <w:r>
               <w:rPr>
@@ -987,7 +987,7 @@
               <w:rPr>
                 <w:noProof/>
               </w:rPr>
-              <w:t>9</w:t>
+              <w:t>10</w:t>
             </w:r>
             <w:r>
               <w:rPr>
@@ -1012,7 +1012,7 @@
               <w14:ligatures w14:val="standardContextual"/>
             </w:rPr>
           </w:pPr>
-          <w:hyperlink w:anchor="_Toc244117617" w:history="1">
+          <w:hyperlink w:anchor="_Toc244179383" w:history="1">
             <w:r>
               <w:rPr>
                 <w:rStyle w:val="Hyperlink"/>
@@ -1036,7 +1036,7 @@
               <w:rPr>
                 <w:noProof/>
               </w:rPr>
-              <w:instrText xml:space="preserve"> PAGEREF _Toc244117617 \h </w:instrText>
+              <w:instrText xml:space="preserve"> PAGEREF _Toc244179383 \h </w:instrText>
             </w:r>
             <w:r>
               <w:rPr>
@@ -1053,7 +1053,73 @@
               <w:rPr>
                 <w:noProof/>
               </w:rPr>
-              <w:t>9</w:t>
+              <w:t>10</w:t>
+            </w:r>
+            <w:r>
+              <w:rPr>
+                <w:noProof/>
+              </w:rPr>
+              <w:fldChar w:fldCharType="end"/>
+            </w:r>
+          </w:hyperlink>
+        </w:p>
+        <w:p>
+          <w:pPr>
+            <w:pStyle w:val="TOC2"/>
+            <w:tabs>
+              <w:tab w:val="right" w:leader="dot" w:pos="9344"/>
+            </w:tabs>
+            <w:rPr>
+              <w:rFonts w:asciiTheme="minorHAnsi" w:eastAsiaTheme="minorEastAsia" w:hAnsiTheme="minorHAnsi" w:cstheme="minorBidi"/>
+              <w:noProof/>
+              <w:kern w:val="2"/>
+              <w:sz w:val="24"/>
+              <w:szCs w:val="24"/>
+              <w14:ligatures w14:val="standardContextual"/>
+            </w:rPr>
+          </w:pPr>
+          <w:hyperlink w:anchor="_Toc244179384" w:history="1">
+            <w:r>
+              <w:rPr>
+                <w:rStyle w:val="Hyperlink"/>
+                <w:noProof/>
+              </w:rPr>
+              <w:t>3.2. Sửa, xóa văn bản và danh mục</w:t>
+            </w:r>
+            <w:r>
+              <w:rPr>
+                <w:noProof/>
+              </w:rPr>
+              <w:tab/>
+            </w:r>
+            <w:r>
+              <w:rPr>
+                <w:noProof/>
+              </w:rPr>
+              <w:fldChar w:fldCharType="begin"/>
+            </w:r>
+            <w:r>
+              <w:rPr>
+                <w:noProof/>
+              </w:rPr>
+              <w:instrText xml:space="preserve"> PAGEREF _Toc244179384 \h </w:instrText>
+            </w:r>
+            <w:r>
+              <w:rPr>
+                <w:noProof/>
+              </w:rPr>
+            </w:r>
+            <w:r>
+              <w:rPr>
+                <w:noProof/>
+              </w:rPr>
+              <w:fldChar w:fldCharType="separate"/>
+            </w:r>
+            <w:r>
+              <w:rPr>
+                <w:noProof/>
+              </w:rPr>
+              <w:t>10</w:t>
             </w:r>
             <w:r>
               <w:rPr>
@@ -1078,7 +1144,7 @@
               <w14:ligatures w14:val="standardContextual"/>
             </w:rPr>
           </w:pPr>
-          <w:hyperlink w:anchor="_Toc244117618" w:history="1">
+          <w:hyperlink w:anchor="_Toc244179385" w:history="1">
             <w:r>
               <w:rPr>
                 <w:rStyle w:val="Hyperlink"/>
@@ -1102,7 +1168,7 @@
               <w:rPr>
                 <w:noProof/>
               </w:rPr>
-              <w:instrText xml:space="preserve"> PAGEREF _Toc244117618 \h </w:instrText>
+              <w:instrText xml:space="preserve"> PAGEREF _Toc244179385 \h </w:instrText>
             </w:r>
             <w:r>
               <w:rPr>
@@ -1119,7 +1185,7 @@
               <w:rPr>
                 <w:noProof/>
               </w:rPr>
-              <w:t>10</w:t>
+              <w:t>11</w:t>
             </w:r>
             <w:r>
               <w:rPr>
@@ -1144,7 +1210,7 @@
               <w14:ligatures w14:val="standardContextual"/>
             </w:rPr>
           </w:pPr>
-          <w:hyperlink w:anchor="_Toc244117619" w:history="1">
+          <w:hyperlink w:anchor="_Toc244179386" w:history="1">
             <w:r>
               <w:rPr>
                 <w:rStyle w:val="Hyperlink"/>
@@ -1168,7 +1234,7 @@
               <w:rPr>
                 <w:noProof/>
               </w:rPr>
-              <w:instrText xml:space="preserve"> PAGEREF _Toc244117619 \h </w:instrText>
+              <w:instrText xml:space="preserve"> PAGEREF _Toc244179386 \h </w:instrText>
             </w:r>
             <w:r>
               <w:rPr>
@@ -1185,7 +1251,7 @@
               <w:rPr>
                 <w:noProof/>
               </w:rPr>
-              <w:t>10</w:t>
+              <w:t>11</w:t>
             </w:r>
             <w:r>
               <w:rPr>
@@ -1210,7 +1276,7 @@
               <w14:ligatures w14:val="standardContextual"/>
             </w:rPr>
           </w:pPr>
-          <w:hyperlink w:anchor="_Toc244117620" w:history="1">
+          <w:hyperlink w:anchor="_Toc244179387" w:history="1">
             <w:r>
               <w:rPr>
                 <w:rStyle w:val="Hyperlink"/>
@@ -1234,7 +1300,7 @@
               <w:rPr>
                 <w:noProof/>
               </w:rPr>
-              <w:instrText xml:space="preserve"> PAGEREF _Toc244117620 \h </w:instrText>
+              <w:instrText xml:space="preserve"> PAGEREF _Toc244179387 \h </w:instrText>
             </w:r>
             <w:r>
               <w:rPr>
@@ -1251,7 +1317,7 @@
               <w:rPr>
                 <w:noProof/>
               </w:rPr>
-              <w:t>10</w:t>
+              <w:t>11</w:t>
             </w:r>
             <w:r>
               <w:rPr>
@@ -1276,7 +1342,7 @@
               <w14:ligatures w14:val="standardContextual"/>
             </w:rPr>
           </w:pPr>
-          <w:hyperlink w:anchor="_Toc244117621" w:history="1">
+          <w:hyperlink w:anchor="_Toc244179388" w:history="1">
             <w:r>
               <w:rPr>
                 <w:rStyle w:val="Hyperlink"/>
@@ -1300,7 +1366,7 @@
               <w:rPr>
                 <w:noProof/>
               </w:rPr>
-              <w:instrText xml:space="preserve"> PAGEREF _Toc244117621 \h </w:instrText>
+              <w:instrText xml:space="preserve"> PAGEREF _Toc244179388 \h </w:instrText>
             </w:r>
             <w:r>
               <w:rPr>
@@ -1317,7 +1383,7 @@
               <w:rPr>
                 <w:noProof/>
               </w:rPr>
-              <w:t>10</w:t>
+              <w:t>11</w:t>
             </w:r>
             <w:r>
               <w:rPr>
@@ -1342,7 +1408,7 @@
               <w14:ligatures w14:val="standardContextual"/>
             </w:rPr>
           </w:pPr>
-          <w:hyperlink w:anchor="_Toc244117622" w:history="1">
+          <w:hyperlink w:anchor="_Toc244179389" w:history="1">
             <w:r>
               <w:rPr>
                 <w:rStyle w:val="Hyperlink"/>
@@ -1366,7 +1432,7 @@
               <w:rPr>
                 <w:noProof/>
               </w:rPr>
-              <w:instrText xml:space="preserve"> PAGEREF _Toc244117622 \h </w:instrText>
+              <w:instrText xml:space="preserve"> PAGEREF _Toc244179389 \h </w:instrText>
             </w:r>
             <w:r>
               <w:rPr>
@@ -1383,7 +1449,7 @@
               <w:rPr>
                 <w:noProof/>
               </w:rPr>
-              <w:t>12</w:t>
+              <w:t>13</w:t>
             </w:r>
             <w:r>
               <w:rPr>
@@ -1408,7 +1474,7 @@
               <w14:ligatures w14:val="standardContextual"/>
             </w:rPr>
           </w:pPr>
-          <w:hyperlink w:anchor="_Toc244117623" w:history="1">
+          <w:hyperlink w:anchor="_Toc244179390" w:history="1">
             <w:r>
               <w:rPr>
                 <w:rStyle w:val="Hyperlink"/>
@@ -1432,7 +1498,7 @@
               <w:rPr>
                 <w:noProof/>
               </w:rPr>
-              <w:instrText xml:space="preserve"> PAGEREF _Toc244117623 \h </w:instrText>
+              <w:instrText xml:space="preserve"> PAGEREF _Toc244179390 \h </w:instrText>
             </w:r>
             <w:r>
               <w:rPr>
@@ -1449,7 +1515,7 @@
               <w:rPr>
                 <w:noProof/>
               </w:rPr>
-              <w:t>12</w:t>
+              <w:t>13</w:t>
             </w:r>
             <w:r>
               <w:rPr>
@@ -1474,7 +1540,7 @@
               <w14:ligatures w14:val="standardContextual"/>
             </w:rPr>
           </w:pPr>
-          <w:hyperlink w:anchor="_Toc244117624" w:history="1">
+          <w:hyperlink w:anchor="_Toc244179391" w:history="1">
             <w:r>
               <w:rPr>
                 <w:rStyle w:val="Hyperlink"/>
@@ -1498,7 +1564,7 @@
               <w:rPr>
                 <w:noProof/>
               </w:rPr>
-              <w:instrText xml:space="preserve"> PAGEREF _Toc244117624 \h </w:instrText>
+              <w:instrText xml:space="preserve"> PAGEREF _Toc244179391 \h </w:instrText>
             </w:r>
             <w:r>
               <w:rPr>
@@ -1515,7 +1581,73 @@
               <w:rPr>
                 <w:noProof/>
               </w:rPr>
-              <w:t>12</w:t>
+              <w:t>13</w:t>
+            </w:r>
+            <w:r>
+              <w:rPr>
+                <w:noProof/>
+              </w:rPr>
+              <w:fldChar w:fldCharType="end"/>
+            </w:r>
+          </w:hyperlink>
+        </w:p>
+        <w:p>
+          <w:pPr>
+            <w:pStyle w:val="TOC2"/>
+            <w:tabs>
+              <w:tab w:val="right" w:leader="dot" w:pos="9344"/>
+            </w:tabs>
+            <w:rPr>
+              <w:rFonts w:asciiTheme="minorHAnsi" w:eastAsiaTheme="minorEastAsia" w:hAnsiTheme="minorHAnsi" w:cstheme="minorBidi"/>
+              <w:noProof/>
+              <w:kern w:val="2"/>
+              <w:sz w:val="24"/>
+              <w:szCs w:val="24"/>
+              <w14:ligatures w14:val="standardContextual"/>
+            </w:rPr>
+          </w:pPr>
+          <w:hyperlink w:anchor="_Toc244179392" w:history="1">
+            <w:r>
+              <w:rPr>
+                <w:rStyle w:val="Hyperlink"/>
+                <w:noProof/>
+              </w:rPr>
+              <w:t>5.3. Sửa, xóa đợt minh chứng</w:t>
+            </w:r>
+            <w:r>
+              <w:rPr>
+                <w:noProof/>
+              </w:rPr>
+              <w:tab/>
+            </w:r>
+            <w:r>
+              <w:rPr>
+                <w:noProof/>
+              </w:rPr>
+              <w:fldChar w:fldCharType="begin"/>
+            </w:r>
+            <w:r>
+              <w:rPr>
+                <w:noProof/>
+              </w:rPr>
+              <w:instrText xml:space="preserve"> PAGEREF _Toc244179392 \h </w:instrText>
+            </w:r>
+            <w:r>
+              <w:rPr>
+                <w:noProof/>
+              </w:rPr>
+            </w:r>
+            <w:r>
+              <w:rPr>
+                <w:noProof/>
+              </w:rPr>
+              <w:fldChar w:fldCharType="separate"/>
+            </w:r>
+            <w:r>
+              <w:rPr>
+                <w:noProof/>
+              </w:rPr>
+              <w:t>14</w:t>
             </w:r>
             <w:r>
               <w:rPr>
@@ -1540,7 +1672,7 @@
               <w14:ligatures w14:val="standardContextual"/>
             </w:rPr>
           </w:pPr>
-          <w:hyperlink w:anchor="_Toc244117625" w:history="1">
+          <w:hyperlink w:anchor="_Toc244179393" w:history="1">
             <w:r>
               <w:rPr>
                 <w:rStyle w:val="Hyperlink"/>
@@ -1564,7 +1696,7 @@
               <w:rPr>
                 <w:noProof/>
               </w:rPr>
-              <w:instrText xml:space="preserve"> PAGEREF _Toc244117625 \h </w:instrText>
+              <w:instrText xml:space="preserve"> PAGEREF _Toc244179393 \h </w:instrText>
             </w:r>
             <w:r>
               <w:rPr>
@@ -1581,7 +1713,7 @@
               <w:rPr>
                 <w:noProof/>
               </w:rPr>
-              <w:t>14</w:t>
+              <w:t>15</w:t>
             </w:r>
             <w:r>
               <w:rPr>
@@ -1606,7 +1738,7 @@
               <w14:ligatures w14:val="standardContextual"/>
             </w:rPr>
           </w:pPr>
-          <w:hyperlink w:anchor="_Toc244117626" w:history="1">
+          <w:hyperlink w:anchor="_Toc244179394" w:history="1">
             <w:r>
               <w:rPr>
                 <w:rStyle w:val="Hyperlink"/>
@@ -1630,7 +1762,7 @@
               <w:rPr>
                 <w:noProof/>
               </w:rPr>
-              <w:instrText xml:space="preserve"> PAGEREF _Toc244117626 \h </w:instrText>
+              <w:instrText xml:space="preserve"> PAGEREF _Toc244179394 \h </w:instrText>
             </w:r>
             <w:r>
               <w:rPr>
@@ -1647,7 +1779,7 @@
               <w:rPr>
                 <w:noProof/>
               </w:rPr>
-              <w:t>14</w:t>
+              <w:t>15</w:t>
             </w:r>
             <w:r>
               <w:rPr>
@@ -1672,7 +1804,7 @@
               <w14:ligatures w14:val="standardContextual"/>
             </w:rPr>
           </w:pPr>
-          <w:hyperlink w:anchor="_Toc244117627" w:history="1">
+          <w:hyperlink w:anchor="_Toc244179395" w:history="1">
             <w:r>
               <w:rPr>
                 <w:rStyle w:val="Hyperlink"/>
@@ -1696,7 +1828,7 @@
               <w:rPr>
                 <w:noProof/>
               </w:rPr>
-              <w:instrText xml:space="preserve"> PAGEREF _Toc244117627 \h </w:instrText>
+              <w:instrText xml:space="preserve"> PAGEREF _Toc244179395 \h </w:instrText>
             </w:r>
             <w:r>
               <w:rPr>
@@ -1713,7 +1845,7 @@
               <w:rPr>
                 <w:noProof/>
               </w:rPr>
-              <w:t>14</w:t>
+              <w:t>15</w:t>
             </w:r>
             <w:r>
               <w:rPr>
@@ -1738,7 +1870,7 @@
               <w14:ligatures w14:val="standardContextual"/>
             </w:rPr>
           </w:pPr>
-          <w:hyperlink w:anchor="_Toc244117628" w:history="1">
+          <w:hyperlink w:anchor="_Toc244179396" w:history="1">
             <w:r>
               <w:rPr>
                 <w:rStyle w:val="Hyperlink"/>
@@ -1762,7 +1894,7 @@
               <w:rPr>
                 <w:noProof/>
               </w:rPr>
-              <w:instrText xml:space="preserve"> PAGEREF _Toc244117628 \h </w:instrText>
+              <w:instrText xml:space="preserve"> PAGEREF _Toc244179396 \h </w:instrText>
             </w:r>
             <w:r>
               <w:rPr>
@@ -1779,7 +1911,7 @@
               <w:rPr>
                 <w:noProof/>
               </w:rPr>
-              <w:t>14</w:t>
+              <w:t>15</w:t>
             </w:r>
             <w:r>
               <w:rPr>
@@ -1804,7 +1936,7 @@
               <w14:ligatures w14:val="standardContextual"/>
             </w:rPr>
           </w:pPr>
-          <w:hyperlink w:anchor="_Toc244117629" w:history="1">
+          <w:hyperlink w:anchor="_Toc244179397" w:history="1">
             <w:r>
               <w:rPr>
                 <w:rStyle w:val="Hyperlink"/>
@@ -1828,7 +1960,7 @@
               <w:rPr>
                 <w:noProof/>
               </w:rPr>
-              <w:instrText xml:space="preserve"> PAGEREF _Toc244117629 \h </w:instrText>
+              <w:instrText xml:space="preserve"> PAGEREF _Toc244179397 \h </w:instrText>
             </w:r>
             <w:r>
               <w:rPr>
@@ -1845,7 +1977,7 @@
               <w:rPr>
                 <w:noProof/>
               </w:rPr>
-              <w:t>15</w:t>
+              <w:t>16</w:t>
             </w:r>
             <w:r>
               <w:rPr>
@@ -1870,7 +2002,7 @@
               <w14:ligatures w14:val="standardContextual"/>
             </w:rPr>
           </w:pPr>
-          <w:hyperlink w:anchor="_Toc244117630" w:history="1">
+          <w:hyperlink w:anchor="_Toc244179398" w:history="1">
             <w:r>
               <w:rPr>
                 <w:rStyle w:val="Hyperlink"/>
@@ -1894,7 +2026,7 @@
               <w:rPr>
                 <w:noProof/>
               </w:rPr>
-              <w:instrText xml:space="preserve"> PAGEREF _Toc244117630 \h </w:instrText>
+              <w:instrText xml:space="preserve"> PAGEREF _Toc244179398 \h </w:instrText>
             </w:r>
             <w:r>
               <w:rPr>
@@ -1911,7 +2043,7 @@
               <w:rPr>
                 <w:noProof/>
               </w:rPr>
-              <w:t>16</w:t>
+              <w:t>17</w:t>
             </w:r>
             <w:r>
               <w:rPr>
@@ -1936,7 +2068,7 @@
               <w14:ligatures w14:val="standardContextual"/>
             </w:rPr>
           </w:pPr>
-          <w:hyperlink w:anchor="_Toc244117631" w:history="1">
+          <w:hyperlink w:anchor="_Toc244179399" w:history="1">
             <w:r>
               <w:rPr>
                 <w:rStyle w:val="Hyperlink"/>
@@ -1960,7 +2092,7 @@
               <w:rPr>
                 <w:noProof/>
               </w:rPr>
-              <w:instrText xml:space="preserve"> PAGEREF _Toc244117631 \h </w:instrText>
+              <w:instrText xml:space="preserve"> PAGEREF _Toc244179399 \h </w:instrText>
             </w:r>
             <w:r>
               <w:rPr>
@@ -1977,7 +2109,7 @@
               <w:rPr>
                 <w:noProof/>
               </w:rPr>
-              <w:t>16</w:t>
+              <w:t>17</w:t>
             </w:r>
             <w:r>
               <w:rPr>
@@ -2002,7 +2134,7 @@
               <w14:ligatures w14:val="standardContextual"/>
             </w:rPr>
           </w:pPr>
-          <w:hyperlink w:anchor="_Toc244117632" w:history="1">
+          <w:hyperlink w:anchor="_Toc244179400" w:history="1">
             <w:r>
               <w:rPr>
                 <w:rStyle w:val="Hyperlink"/>
@@ -2026,7 +2158,7 @@
               <w:rPr>
                 <w:noProof/>
               </w:rPr>
-              <w:instrText xml:space="preserve"> PAGEREF _Toc244117632 \h </w:instrText>
+              <w:instrText xml:space="preserve"> PAGEREF _Toc244179400 \h </w:instrText>
             </w:r>
             <w:r>
               <w:rPr>
@@ -2043,7 +2175,7 @@
               <w:rPr>
                 <w:noProof/>
               </w:rPr>
-              <w:t>16</w:t>
+              <w:t>17</w:t>
             </w:r>
             <w:r>
               <w:rPr>
@@ -2068,7 +2200,7 @@
               <w14:ligatures w14:val="standardContextual"/>
             </w:rPr>
           </w:pPr>
-          <w:hyperlink w:anchor="_Toc244117633" w:history="1">
+          <w:hyperlink w:anchor="_Toc244179401" w:history="1">
             <w:r>
               <w:rPr>
                 <w:rStyle w:val="Hyperlink"/>
@@ -2092,7 +2224,7 @@
               <w:rPr>
                 <w:noProof/>
               </w:rPr>
-              <w:instrText xml:space="preserve"> PAGEREF _Toc244117633 \h </w:instrText>
+              <w:instrText xml:space="preserve"> PAGEREF _Toc244179401 \h </w:instrText>
             </w:r>
             <w:r>
               <w:rPr>
@@ -2109,7 +2241,7 @@
               <w:rPr>
                 <w:noProof/>
               </w:rPr>
-              <w:t>16</w:t>
+              <w:t>17</w:t>
             </w:r>
             <w:r>
               <w:rPr>
@@ -2134,7 +2266,7 @@
               <w14:ligatures w14:val="standardContextual"/>
             </w:rPr>
           </w:pPr>
-          <w:hyperlink w:anchor="_Toc244117634" w:history="1">
+          <w:hyperlink w:anchor="_Toc244179402" w:history="1">
             <w:r>
               <w:rPr>
                 <w:rStyle w:val="Hyperlink"/>
@@ -2158,7 +2290,7 @@
               <w:rPr>
                 <w:noProof/>
               </w:rPr>
-              <w:instrText xml:space="preserve"> PAGEREF _Toc244117634 \h </w:instrText>
+              <w:instrText xml:space="preserve"> PAGEREF _Toc244179402 \h </w:instrText>
             </w:r>
             <w:r>
               <w:rPr>
@@ -2175,7 +2307,7 @@
               <w:rPr>
                 <w:noProof/>
               </w:rPr>
-              <w:t>18</w:t>
+              <w:t>19</w:t>
             </w:r>
             <w:r>
               <w:rPr>
@@ -2200,7 +2332,7 @@
               <w14:ligatures w14:val="standardContextual"/>
             </w:rPr>
           </w:pPr>
-          <w:hyperlink w:anchor="_Toc244117635" w:history="1">
+          <w:hyperlink w:anchor="_Toc244179403" w:history="1">
             <w:r>
               <w:rPr>
                 <w:rStyle w:val="Hyperlink"/>
@@ -2224,7 +2356,7 @@
               <w:rPr>
                 <w:noProof/>
               </w:rPr>
-              <w:instrText xml:space="preserve"> PAGEREF _Toc244117635 \h </w:instrText>
+              <w:instrText xml:space="preserve"> PAGEREF _Toc244179403 \h </w:instrText>
             </w:r>
             <w:r>
               <w:rPr>
@@ -2241,7 +2373,7 @@
               <w:rPr>
                 <w:noProof/>
               </w:rPr>
-              <w:t>18</w:t>
+              <w:t>19</w:t>
             </w:r>
             <w:r>
               <w:rPr>
@@ -2266,7 +2398,7 @@
               <w14:ligatures w14:val="standardContextual"/>
             </w:rPr>
           </w:pPr>
-          <w:hyperlink w:anchor="_Toc244117636" w:history="1">
+          <w:hyperlink w:anchor="_Toc244179404" w:history="1">
             <w:r>
               <w:rPr>
                 <w:rStyle w:val="Hyperlink"/>
@@ -2290,7 +2422,7 @@
               <w:rPr>
                 <w:noProof/>
               </w:rPr>
-              <w:instrText xml:space="preserve"> PAGEREF _Toc244117636 \h </w:instrText>
+              <w:instrText xml:space="preserve"> PAGEREF _Toc244179404 \h </w:instrText>
             </w:r>
             <w:r>
               <w:rPr>
@@ -2307,7 +2439,7 @@
               <w:rPr>
                 <w:noProof/>
               </w:rPr>
-              <w:t>18</w:t>
+              <w:t>19</w:t>
             </w:r>
             <w:r>
               <w:rPr>
@@ -2332,7 +2464,7 @@
               <w14:ligatures w14:val="standardContextual"/>
             </w:rPr>
           </w:pPr>
-          <w:hyperlink w:anchor="_Toc244117637" w:history="1">
+          <w:hyperlink w:anchor="_Toc244179405" w:history="1">
             <w:r>
               <w:rPr>
                 <w:rStyle w:val="Hyperlink"/>
@@ -2356,7 +2488,7 @@
               <w:rPr>
                 <w:noProof/>
               </w:rPr>
-              <w:instrText xml:space="preserve"> PAGEREF _Toc244117637 \h </w:instrText>
+              <w:instrText xml:space="preserve"> PAGEREF _Toc244179405 \h </w:instrText>
             </w:r>
             <w:r>
               <w:rPr>
@@ -2373,7 +2505,7 @@
               <w:rPr>
                 <w:noProof/>
               </w:rPr>
-              <w:t>18</w:t>
+              <w:t>19</w:t>
             </w:r>
             <w:r>
               <w:rPr>
@@ -2398,7 +2530,7 @@
               <w14:ligatures w14:val="standardContextual"/>
             </w:rPr>
           </w:pPr>
-          <w:hyperlink w:anchor="_Toc244117638" w:history="1">
+          <w:hyperlink w:anchor="_Toc244179406" w:history="1">
             <w:r>
               <w:rPr>
                 <w:rStyle w:val="Hyperlink"/>
@@ -2422,7 +2554,7 @@
               <w:rPr>
                 <w:noProof/>
               </w:rPr>
-              <w:instrText xml:space="preserve"> PAGEREF _Toc244117638 \h </w:instrText>
+              <w:instrText xml:space="preserve"> PAGEREF _Toc244179406 \h </w:instrText>
             </w:r>
             <w:r>
               <w:rPr>
@@ -2439,7 +2571,7 @@
               <w:rPr>
                 <w:noProof/>
               </w:rPr>
-              <w:t>19</w:t>
+              <w:t>20</w:t>
             </w:r>
             <w:r>
               <w:rPr>
@@ -2464,7 +2596,7 @@
               <w14:ligatures w14:val="standardContextual"/>
             </w:rPr>
           </w:pPr>
-          <w:hyperlink w:anchor="_Toc244117639" w:history="1">
+          <w:hyperlink w:anchor="_Toc244179407" w:history="1">
             <w:r>
               <w:rPr>
                 <w:rStyle w:val="Hyperlink"/>
@@ -2488,7 +2620,7 @@
               <w:rPr>
                 <w:noProof/>
               </w:rPr>
-              <w:instrText xml:space="preserve"> PAGEREF _Toc244117639 \h </w:instrText>
+              <w:instrText xml:space="preserve"> PAGEREF _Toc244179407 \h </w:instrText>
             </w:r>
             <w:r>
               <w:rPr>
@@ -2505,7 +2637,7 @@
               <w:rPr>
                 <w:noProof/>
               </w:rPr>
-              <w:t>19</w:t>
+              <w:t>20</w:t>
             </w:r>
             <w:r>
               <w:rPr>
@@ -2530,7 +2662,7 @@
               <w14:ligatures w14:val="standardContextual"/>
             </w:rPr>
           </w:pPr>
-          <w:hyperlink w:anchor="_Toc244117640" w:history="1">
+          <w:hyperlink w:anchor="_Toc244179408" w:history="1">
             <w:r>
               <w:rPr>
                 <w:rStyle w:val="Hyperlink"/>
@@ -2554,7 +2686,7 @@
               <w:rPr>
                 <w:noProof/>
               </w:rPr>
-              <w:instrText xml:space="preserve"> PAGEREF _Toc244117640 \h </w:instrText>
+              <w:instrText xml:space="preserve"> PAGEREF _Toc244179408 \h </w:instrText>
             </w:r>
             <w:r>
               <w:rPr>
@@ -2571,7 +2703,7 @@
               <w:rPr>
                 <w:noProof/>
               </w:rPr>
-              <w:t>19</w:t>
+              <w:t>20</w:t>
             </w:r>
             <w:r>
               <w:rPr>
@@ -2596,7 +2728,7 @@
               <w14:ligatures w14:val="standardContextual"/>
             </w:rPr>
           </w:pPr>
-          <w:hyperlink w:anchor="_Toc244117641" w:history="1">
+          <w:hyperlink w:anchor="_Toc244179409" w:history="1">
             <w:r>
               <w:rPr>
                 <w:rStyle w:val="Hyperlink"/>
@@ -2620,7 +2752,7 @@
               <w:rPr>
                 <w:noProof/>
               </w:rPr>
-              <w:instrText xml:space="preserve"> PAGEREF _Toc244117641 \h </w:instrText>
+              <w:instrText xml:space="preserve"> PAGEREF _Toc244179409 \h </w:instrText>
             </w:r>
             <w:r>
               <w:rPr>
@@ -2637,7 +2769,7 @@
               <w:rPr>
                 <w:noProof/>
               </w:rPr>
-              <w:t>19</w:t>
+              <w:t>20</w:t>
             </w:r>
             <w:r>
               <w:rPr>
@@ -2662,7 +2794,7 @@
               <w14:ligatures w14:val="standardContextual"/>
             </w:rPr>
           </w:pPr>
-          <w:hyperlink w:anchor="_Toc244117642" w:history="1">
+          <w:hyperlink w:anchor="_Toc244179410" w:history="1">
             <w:r>
               <w:rPr>
                 <w:rStyle w:val="Hyperlink"/>
@@ -2686,7 +2818,7 @@
               <w:rPr>
                 <w:noProof/>
               </w:rPr>
-              <w:instrText xml:space="preserve"> PAGEREF _Toc244117642 \h </w:instrText>
+              <w:instrText xml:space="preserve"> PAGEREF _Toc244179410 \h </w:instrText>
             </w:r>
             <w:r>
               <w:rPr>
@@ -2703,7 +2835,7 @@
               <w:rPr>
                 <w:noProof/>
               </w:rPr>
-              <w:t>19</w:t>
+              <w:t>20</w:t>
             </w:r>
             <w:r>
               <w:rPr>
@@ -2728,7 +2860,7 @@
               <w14:ligatures w14:val="standardContextual"/>
             </w:rPr>
           </w:pPr>
-          <w:hyperlink w:anchor="_Toc244117643" w:history="1">
+          <w:hyperlink w:anchor="_Toc244179411" w:history="1">
             <w:r>
               <w:rPr>
                 <w:rStyle w:val="Hyperlink"/>
@@ -2752,7 +2884,7 @@
               <w:rPr>
                 <w:noProof/>
               </w:rPr>
-              <w:instrText xml:space="preserve"> PAGEREF _Toc244117643 \h </w:instrText>
+              <w:instrText xml:space="preserve"> PAGEREF _Toc244179411 \h </w:instrText>
             </w:r>
             <w:r>
               <w:rPr>
@@ -2769,7 +2901,7 @@
               <w:rPr>
                 <w:noProof/>
               </w:rPr>
-              <w:t>20</w:t>
+              <w:t>21</w:t>
             </w:r>
             <w:r>
               <w:rPr>
@@ -2794,7 +2926,7 @@
               <w14:ligatures w14:val="standardContextual"/>
             </w:rPr>
           </w:pPr>
-          <w:hyperlink w:anchor="_Toc244117644" w:history="1">
+          <w:hyperlink w:anchor="_Toc244179412" w:history="1">
             <w:r>
               <w:rPr>
                 <w:rStyle w:val="Hyperlink"/>
@@ -2818,7 +2950,7 @@
               <w:rPr>
                 <w:noProof/>
               </w:rPr>
-              <w:instrText xml:space="preserve"> PAGEREF _Toc244117644 \h </w:instrText>
+              <w:instrText xml:space="preserve"> PAGEREF _Toc244179412 \h </w:instrText>
             </w:r>
             <w:r>
               <w:rPr>
@@ -2835,7 +2967,7 @@
               <w:rPr>
                 <w:noProof/>
               </w:rPr>
-              <w:t>20</w:t>
+              <w:t>21</w:t>
             </w:r>
             <w:r>
               <w:rPr>
@@ -2860,7 +2992,7 @@
               <w14:ligatures w14:val="standardContextual"/>
             </w:rPr>
           </w:pPr>
-          <w:hyperlink w:anchor="_Toc244117645" w:history="1">
+          <w:hyperlink w:anchor="_Toc244179413" w:history="1">
             <w:r>
               <w:rPr>
                 <w:rStyle w:val="Hyperlink"/>
@@ -2884,7 +3016,7 @@
               <w:rPr>
                 <w:noProof/>
               </w:rPr>
-              <w:instrText xml:space="preserve"> PAGEREF _Toc244117645 \h </w:instrText>
+              <w:instrText xml:space="preserve"> PAGEREF _Toc244179413 \h </w:instrText>
             </w:r>
             <w:r>
               <w:rPr>
@@ -2901,7 +3033,7 @@
               <w:rPr>
                 <w:noProof/>
               </w:rPr>
-              <w:t>20</w:t>
+              <w:t>21</w:t>
             </w:r>
             <w:r>
               <w:rPr>
@@ -2926,7 +3058,7 @@
               <w14:ligatures w14:val="standardContextual"/>
             </w:rPr>
           </w:pPr>
-          <w:hyperlink w:anchor="_Toc244117646" w:history="1">
+          <w:hyperlink w:anchor="_Toc244179414" w:history="1">
             <w:r>
               <w:rPr>
                 <w:rStyle w:val="Hyperlink"/>
@@ -2950,7 +3082,7 @@
               <w:rPr>
                 <w:noProof/>
               </w:rPr>
-              <w:instrText xml:space="preserve"> PAGEREF _Toc244117646 \h </w:instrText>
+              <w:instrText xml:space="preserve"> PAGEREF _Toc244179414 \h </w:instrText>
             </w:r>
             <w:r>
               <w:rPr>
@@ -2967,7 +3099,7 @@
               <w:rPr>
                 <w:noProof/>
               </w:rPr>
-              <w:t>21</w:t>
+              <w:t>22</w:t>
             </w:r>
             <w:r>
               <w:rPr>
@@ -2992,7 +3124,7 @@
               <w14:ligatures w14:val="standardContextual"/>
             </w:rPr>
           </w:pPr>
-          <w:hyperlink w:anchor="_Toc244117647" w:history="1">
+          <w:hyperlink w:anchor="_Toc244179415" w:history="1">
             <w:r>
               <w:rPr>
                 <w:rStyle w:val="Hyperlink"/>
@@ -3016,7 +3148,7 @@
               <w:rPr>
                 <w:noProof/>
               </w:rPr>
-              <w:instrText xml:space="preserve"> PAGEREF _Toc244117647 \h </w:instrText>
+              <w:instrText xml:space="preserve"> PAGEREF _Toc244179415 \h </w:instrText>
             </w:r>
             <w:r>
               <w:rPr>
@@ -3033,7 +3165,7 @@
               <w:rPr>
                 <w:noProof/>
               </w:rPr>
-              <w:t>22</w:t>
+              <w:t>23</w:t>
             </w:r>
             <w:r>
               <w:rPr>
@@ -3058,7 +3190,7 @@
               <w14:ligatures w14:val="standardContextual"/>
             </w:rPr>
           </w:pPr>
-          <w:hyperlink w:anchor="_Toc244117648" w:history="1">
+          <w:hyperlink w:anchor="_Toc244179416" w:history="1">
             <w:r>
               <w:rPr>
                 <w:rStyle w:val="Hyperlink"/>
@@ -3082,7 +3214,7 @@
               <w:rPr>
                 <w:noProof/>
               </w:rPr>
-              <w:instrText xml:space="preserve"> PAGEREF _Toc244117648 \h </w:instrText>
+              <w:instrText xml:space="preserve"> PAGEREF _Toc244179416 \h </w:instrText>
             </w:r>
             <w:r>
               <w:rPr>
@@ -3099,7 +3231,7 @@
               <w:rPr>
                 <w:noProof/>
               </w:rPr>
-              <w:t>22</w:t>
+              <w:t>23</w:t>
             </w:r>
             <w:r>
               <w:rPr>
@@ -3124,7 +3256,7 @@
               <w14:ligatures w14:val="standardContextual"/>
             </w:rPr>
           </w:pPr>
-          <w:hyperlink w:anchor="_Toc244117649" w:history="1">
+          <w:hyperlink w:anchor="_Toc244179417" w:history="1">
             <w:r>
               <w:rPr>
                 <w:rStyle w:val="Hyperlink"/>
@@ -3148,7 +3280,7 @@
               <w:rPr>
                 <w:noProof/>
               </w:rPr>
-              <w:instrText xml:space="preserve"> PAGEREF _Toc244117649 \h </w:instrText>
+              <w:instrText xml:space="preserve"> PAGEREF _Toc244179417 \h </w:instrText>
             </w:r>
             <w:r>
               <w:rPr>
@@ -3165,7 +3297,7 @@
               <w:rPr>
                 <w:noProof/>
               </w:rPr>
-              <w:t>22</w:t>
+              <w:t>23</w:t>
             </w:r>
             <w:r>
               <w:rPr>
@@ -3190,7 +3322,7 @@
               <w14:ligatures w14:val="standardContextual"/>
             </w:rPr>
           </w:pPr>
-          <w:hyperlink w:anchor="_Toc244117650" w:history="1">
+          <w:hyperlink w:anchor="_Toc244179418" w:history="1">
             <w:r>
               <w:rPr>
                 <w:rStyle w:val="Hyperlink"/>
@@ -3214,7 +3346,7 @@
               <w:rPr>
                 <w:noProof/>
               </w:rPr>
-              <w:instrText xml:space="preserve"> PAGEREF _Toc244117650 \h </w:instrText>
+              <w:instrText xml:space="preserve"> PAGEREF _Toc244179418 \h </w:instrText>
             </w:r>
             <w:r>
               <w:rPr>
@@ -3231,7 +3363,7 @@
               <w:rPr>
                 <w:noProof/>
               </w:rPr>
-              <w:t>22</w:t>
+              <w:t>23</w:t>
             </w:r>
             <w:r>
               <w:rPr>
@@ -3286,7 +3418,7 @@
         <w:pStyle w:val="Heading1"/>
         <w:pageBreakBefore/>
       </w:pPr>
-      <w:bookmarkStart w:id="0" w:name="_Toc244117604"/>
+      <w:bookmarkStart w:id="0" w:name="_Toc244179370"/>
       <w:r>
         <w:lastRenderedPageBreak/>
         <w:t>1. Tổng quan hệ thống</w:t>
@@ -3297,7 +3429,7 @@
       <w:pPr>
         <w:pStyle w:val="Heading2"/>
       </w:pPr>
-      <w:bookmarkStart w:id="1" w:name="_Toc244117605"/>
+      <w:bookmarkStart w:id="1" w:name="_Toc244179371"/>
       <w:r>
         <w:t>1.1. Mục đích</w:t>
       </w:r>
@@ -4104,7 +4236,7 @@
       <w:pPr>
         <w:pStyle w:val="Heading2"/>
       </w:pPr>
-      <w:bookmarkStart w:id="2" w:name="_Toc244117606"/>
+      <w:bookmarkStart w:id="2" w:name="_Toc244179372"/>
       <w:r>
         <w:t>1.2. Công nghệ sử dụng</w:t>
       </w:r>
@@ -4826,7 +4958,7 @@
       <w:pPr>
         <w:pStyle w:val="Heading2"/>
       </w:pPr>
-      <w:bookmarkStart w:id="3" w:name="_Toc244117607"/>
+      <w:bookmarkStart w:id="3" w:name="_Toc244179373"/>
       <w:r>
         <w:t>1.3. Kiến trúc và luồng xử lý một yêu cầu</w:t>
       </w:r>
@@ -5079,7 +5211,7 @@
       <w:pPr>
         <w:pStyle w:val="Heading2"/>
       </w:pPr>
-      <w:bookmarkStart w:id="4" w:name="_Toc244117608"/>
+      <w:bookmarkStart w:id="4" w:name="_Toc244179374"/>
       <w:r>
         <w:t>1.4. Cấu trúc thư mục</w:t>
       </w:r>
@@ -5905,7 +6037,7 @@
         <w:pStyle w:val="Heading1"/>
         <w:pageBreakBefore/>
       </w:pPr>
-      <w:bookmarkStart w:id="5" w:name="_Toc244117609"/>
+      <w:bookmarkStart w:id="5" w:name="_Toc244179375"/>
       <w:r>
         <w:lastRenderedPageBreak/>
         <w:t>2. Nền tảng dùng chung</w:t>
@@ -5916,7 +6048,7 @@
       <w:pPr>
         <w:pStyle w:val="Heading2"/>
       </w:pPr>
-      <w:bookmarkStart w:id="6" w:name="_Toc244117610"/>
+      <w:bookmarkStart w:id="6" w:name="_Toc244179376"/>
       <w:r>
         <w:t>2.1. Cơ sở dữ liệu (Prisma)</w:t>
       </w:r>
@@ -6847,7 +6979,7 @@
       <w:pPr>
         <w:pStyle w:val="Heading2"/>
       </w:pPr>
-      <w:bookmarkStart w:id="7" w:name="_Toc244117611"/>
+      <w:bookmarkStart w:id="7" w:name="_Toc244179377"/>
       <w:r>
         <w:t>2.2. Đăng nhập và phiên làm việc</w:t>
       </w:r>
@@ -7769,7 +7901,7 @@
       <w:pPr>
         <w:pStyle w:val="Heading2"/>
       </w:pPr>
-      <w:bookmarkStart w:id="8" w:name="_Toc244117612"/>
+      <w:bookmarkStart w:id="8" w:name="_Toc244179378"/>
       <w:r>
         <w:t>2.3. Phân quyền</w:t>
       </w:r>
@@ -8116,54 +8248,10 @@
     </w:p>
     <w:p>
       <w:pPr>
-        <w:spacing w:after="120" w:line="300" w:lineRule="auto"/>
-        <w:jc w:val="both"/>
-      </w:pPr>
-      <w:r>
-        <w:t xml:space="preserve">Trước đây hệ thống có 2 vai trò Trưởng khoa (HEAD) và Trợ lý khoa (ASSISTANT); nay đã gộp thành Quản lý khoa. Hàm </w:t>
-      </w:r>
-      <w:r>
-        <w:rPr>
-          <w:rFonts w:ascii="Consolas" w:eastAsia="Consolas" w:hAnsi="Consolas" w:cs="Consolas"/>
-          <w:color w:val="1D4ED8"/>
-          <w:sz w:val="21"/>
-          <w:szCs w:val="21"/>
-        </w:rPr>
-        <w:t>normalizeRole()</w:t>
-      </w:r>
-      <w:r>
-        <w:t xml:space="preserve"> tự quy đổi giá trị cũ còn sót trong CSDL, và script </w:t>
-      </w:r>
-      <w:r>
-        <w:rPr>
-          <w:rFonts w:ascii="Consolas" w:eastAsia="Consolas" w:hAnsi="Consolas" w:cs="Consolas"/>
-          <w:color w:val="1D4ED8"/>
-          <w:sz w:val="21"/>
-          <w:szCs w:val="21"/>
-        </w:rPr>
-        <w:t>scripts/migrate-data.ts</w:t>
-      </w:r>
-      <w:r>
-        <w:t xml:space="preserve"> chuyển hẳn dữ liệu.</w:t>
-      </w:r>
-    </w:p>
-    <w:p>
-      <w:pPr>
-        <w:pStyle w:val="Heading2"/>
-      </w:pPr>
-      <w:bookmarkStart w:id="9" w:name="_Toc244117613"/>
-      <w:r>
-        <w:t>2.4. Server Action, form và thông báo</w:t>
-      </w:r>
-      <w:bookmarkEnd w:id="9"/>
-    </w:p>
-    <w:p>
-      <w:pPr>
-        <w:spacing w:after="120" w:line="300" w:lineRule="auto"/>
-        <w:jc w:val="both"/>
-      </w:pPr>
-      <w:r>
-        <w:t>Mọi form ghi dữ liệu dùng chung một khuôn mẫu:</w:t>
+        <w:pStyle w:val="Heading3"/>
+      </w:pPr>
+      <w:r>
+        <w:t>Quản lý người dùng (src/app/(portal)/nguoi-dung)</w:t>
       </w:r>
     </w:p>
     <w:p>
@@ -8176,40 +8264,7 @@
         <w:spacing w:after="60" w:line="288" w:lineRule="auto"/>
       </w:pPr>
       <w:r>
-        <w:rPr>
-          <w:rFonts w:ascii="Consolas" w:eastAsia="Consolas" w:hAnsi="Consolas" w:cs="Consolas"/>
-          <w:color w:val="1D4ED8"/>
-          <w:sz w:val="21"/>
-          <w:szCs w:val="21"/>
-        </w:rPr>
-        <w:t>src/lib/action-state.ts</w:t>
-      </w:r>
-      <w:r>
-        <w:t xml:space="preserve">: kiểu kết quả </w:t>
-      </w:r>
-      <w:r>
-        <w:rPr>
-          <w:rFonts w:ascii="Consolas" w:eastAsia="Consolas" w:hAnsi="Consolas" w:cs="Consolas"/>
-          <w:color w:val="1D4ED8"/>
-          <w:sz w:val="21"/>
-          <w:szCs w:val="21"/>
-        </w:rPr>
-        <w:t>{ ok, message }</w:t>
-      </w:r>
-      <w:r>
-        <w:t xml:space="preserve"> và hàm </w:t>
-      </w:r>
-      <w:r>
-        <w:rPr>
-          <w:rFonts w:ascii="Consolas" w:eastAsia="Consolas" w:hAnsi="Consolas" w:cs="Consolas"/>
-          <w:color w:val="1D4ED8"/>
-          <w:sz w:val="21"/>
-          <w:szCs w:val="21"/>
-        </w:rPr>
-        <w:t>attempt()</w:t>
-      </w:r>
-      <w:r>
-        <w:t xml:space="preserve"> – bọc action, bắt lỗi rồi trả thông báo tiếng Việt thay vì làm sập trang.</w:t>
+        <w:t>Quản trị viên tạo tài khoản, đổi vai trò, khóa/mở khóa, đặt lại mật khẩu về mặc định.</w:t>
       </w:r>
     </w:p>
     <w:p>
@@ -8223,15 +8278,25 @@
       </w:pPr>
       <w:r>
         <w:rPr>
+          <w:b/>
+          <w:bCs/>
+        </w:rPr>
+        <w:t>Sửa</w:t>
+      </w:r>
+      <w:r>
+        <w:t xml:space="preserve"> (</w:t>
+      </w:r>
+      <w:r>
+        <w:rPr>
           <w:rFonts w:ascii="Consolas" w:eastAsia="Consolas" w:hAnsi="Consolas" w:cs="Consolas"/>
           <w:color w:val="1D4ED8"/>
           <w:sz w:val="21"/>
           <w:szCs w:val="21"/>
         </w:rPr>
-        <w:t>ActionForm</w:t>
-      </w:r>
-      <w:r>
-        <w:t xml:space="preserve"> (</w:t>
+        <w:t>nguoi-dung/[id]</w:t>
+      </w:r>
+      <w:r>
+        <w:t xml:space="preserve">, action </w:t>
       </w:r>
       <w:r>
         <w:rPr>
@@ -8240,22 +8305,10 @@
           <w:sz w:val="21"/>
           <w:szCs w:val="21"/>
         </w:rPr>
-        <w:t>src/components/forms.tsx</w:t>
-      </w:r>
-      <w:r>
-        <w:t xml:space="preserve">): form gọi action qua </w:t>
-      </w:r>
-      <w:r>
-        <w:rPr>
-          <w:rFonts w:ascii="Consolas" w:eastAsia="Consolas" w:hAnsi="Consolas" w:cs="Consolas"/>
-          <w:color w:val="1D4ED8"/>
-          <w:sz w:val="21"/>
-          <w:szCs w:val="21"/>
-        </w:rPr>
-        <w:t>useActionState</w:t>
-      </w:r>
-      <w:r>
-        <w:t>, tự hiện hộp thông báo xanh/đỏ, tự xóa nội dung khi thành công.</w:t>
+        <w:t>updateUserInfo</w:t>
+      </w:r>
+      <w:r>
+        <w:t>): họ tên, email đăng nhập (kiểm tra trùng), vai trò, học hàm, điện thoại, chuyên môn. Không thể tự đổi vai trò của chính mình.</w:t>
       </w:r>
     </w:p>
     <w:p>
@@ -8269,16 +8322,55 @@
       </w:pPr>
       <w:r>
         <w:rPr>
+          <w:b/>
+          <w:bCs/>
+        </w:rPr>
+        <w:t>Xóa</w:t>
+      </w:r>
+      <w:r>
+        <w:t xml:space="preserve"> (</w:t>
+      </w:r>
+      <w:r>
+        <w:rPr>
           <w:rFonts w:ascii="Consolas" w:eastAsia="Consolas" w:hAnsi="Consolas" w:cs="Consolas"/>
           <w:color w:val="1D4ED8"/>
           <w:sz w:val="21"/>
           <w:szCs w:val="21"/>
         </w:rPr>
+        <w:t>deleteUser</w:t>
+      </w:r>
+      <w:r>
+        <w:t xml:space="preserve">): chỉ xóa được tài khoản </w:t>
+      </w:r>
+      <w:r>
+        <w:rPr>
+          <w:b/>
+          <w:bCs/>
+        </w:rPr>
+        <w:t>chưa phát sinh dữ liệu</w:t>
+      </w:r>
+      <w:r>
+        <w:t xml:space="preserve">. Nếu tài khoản đã có văn bản, minh chứng, lịch sử duyệt, công việc, lượt mượn, phân công… hệ thống liệt kê cụ thể và đề nghị dùng </w:t>
+      </w:r>
+      <w:r>
+        <w:rPr>
+          <w:b/>
+          <w:bCs/>
+        </w:rPr>
+        <w:t>Khóa</w:t>
+      </w:r>
+      <w:r>
+        <w:t xml:space="preserve"> để giữ nguyên lịch sử. Không thể tự xóa chính mình.</w:t>
+      </w:r>
+    </w:p>
+    <w:p>
+      <w:pPr>
+        <w:spacing w:after="120" w:line="300" w:lineRule="auto"/>
+        <w:jc w:val="both"/>
+      </w:pPr>
+      <w:r>
         <w:lastRenderedPageBreak/>
-        <w:t>SubmitButton</w:t>
-      </w:r>
-      <w:r>
-        <w:t>: hiện vòng quay "Đang xử lý…" và khóa nút khi đang gửi; hỗ trợ hỏi xác nhận (</w:t>
+        <w:t xml:space="preserve">Trước đây hệ thống có 2 vai trò Trưởng khoa (HEAD) và Trợ lý khoa (ASSISTANT); nay đã gộp thành Quản lý khoa. Hàm </w:t>
       </w:r>
       <w:r>
         <w:rPr>
@@ -8287,10 +8379,41 @@
           <w:sz w:val="21"/>
           <w:szCs w:val="21"/>
         </w:rPr>
-        <w:t>confirm</w:t>
-      </w:r>
-      <w:r>
-        <w:t>).</w:t>
+        <w:t>normalizeRole()</w:t>
+      </w:r>
+      <w:r>
+        <w:t xml:space="preserve"> tự quy đổi giá trị cũ còn sót trong CSDL, và script </w:t>
+      </w:r>
+      <w:r>
+        <w:rPr>
+          <w:rFonts w:ascii="Consolas" w:eastAsia="Consolas" w:hAnsi="Consolas" w:cs="Consolas"/>
+          <w:color w:val="1D4ED8"/>
+          <w:sz w:val="21"/>
+          <w:szCs w:val="21"/>
+        </w:rPr>
+        <w:t>scripts/migrate-data.ts</w:t>
+      </w:r>
+      <w:r>
+        <w:t xml:space="preserve"> chuyển hẳn dữ liệu.</w:t>
+      </w:r>
+    </w:p>
+    <w:p>
+      <w:pPr>
+        <w:pStyle w:val="Heading2"/>
+      </w:pPr>
+      <w:bookmarkStart w:id="9" w:name="_Toc244179379"/>
+      <w:r>
+        <w:t>2.4. Server Action, form và thông báo</w:t>
+      </w:r>
+      <w:bookmarkEnd w:id="9"/>
+    </w:p>
+    <w:p>
+      <w:pPr>
+        <w:spacing w:after="120" w:line="300" w:lineRule="auto"/>
+        <w:jc w:val="both"/>
+      </w:pPr>
+      <w:r>
+        <w:t>Mọi form ghi dữ liệu dùng chung một khuôn mẫu:</w:t>
       </w:r>
     </w:p>
     <w:p>
@@ -8309,6 +8432,132 @@
           <w:sz w:val="21"/>
           <w:szCs w:val="21"/>
         </w:rPr>
+        <w:t>src/lib/action-state.ts</w:t>
+      </w:r>
+      <w:r>
+        <w:t xml:space="preserve">: kiểu kết quả </w:t>
+      </w:r>
+      <w:r>
+        <w:rPr>
+          <w:rFonts w:ascii="Consolas" w:eastAsia="Consolas" w:hAnsi="Consolas" w:cs="Consolas"/>
+          <w:color w:val="1D4ED8"/>
+          <w:sz w:val="21"/>
+          <w:szCs w:val="21"/>
+        </w:rPr>
+        <w:t>{ ok, message }</w:t>
+      </w:r>
+      <w:r>
+        <w:t xml:space="preserve"> và hàm </w:t>
+      </w:r>
+      <w:r>
+        <w:rPr>
+          <w:rFonts w:ascii="Consolas" w:eastAsia="Consolas" w:hAnsi="Consolas" w:cs="Consolas"/>
+          <w:color w:val="1D4ED8"/>
+          <w:sz w:val="21"/>
+          <w:szCs w:val="21"/>
+        </w:rPr>
+        <w:t>attempt()</w:t>
+      </w:r>
+      <w:r>
+        <w:t xml:space="preserve"> – bọc action, bắt lỗi rồi trả thông báo tiếng Việt thay vì làm sập trang.</w:t>
+      </w:r>
+    </w:p>
+    <w:p>
+      <w:pPr>
+        <w:pStyle w:val="ListParagraph"/>
+        <w:numPr>
+          <w:ilvl w:val="0"/>
+          <w:numId w:val="3"/>
+        </w:numPr>
+        <w:spacing w:after="60" w:line="288" w:lineRule="auto"/>
+      </w:pPr>
+      <w:r>
+        <w:rPr>
+          <w:rFonts w:ascii="Consolas" w:eastAsia="Consolas" w:hAnsi="Consolas" w:cs="Consolas"/>
+          <w:color w:val="1D4ED8"/>
+          <w:sz w:val="21"/>
+          <w:szCs w:val="21"/>
+        </w:rPr>
+        <w:t>ActionForm</w:t>
+      </w:r>
+      <w:r>
+        <w:t xml:space="preserve"> (</w:t>
+      </w:r>
+      <w:r>
+        <w:rPr>
+          <w:rFonts w:ascii="Consolas" w:eastAsia="Consolas" w:hAnsi="Consolas" w:cs="Consolas"/>
+          <w:color w:val="1D4ED8"/>
+          <w:sz w:val="21"/>
+          <w:szCs w:val="21"/>
+        </w:rPr>
+        <w:t>src/components/forms.tsx</w:t>
+      </w:r>
+      <w:r>
+        <w:t xml:space="preserve">): form gọi action qua </w:t>
+      </w:r>
+      <w:r>
+        <w:rPr>
+          <w:rFonts w:ascii="Consolas" w:eastAsia="Consolas" w:hAnsi="Consolas" w:cs="Consolas"/>
+          <w:color w:val="1D4ED8"/>
+          <w:sz w:val="21"/>
+          <w:szCs w:val="21"/>
+        </w:rPr>
+        <w:t>useActionState</w:t>
+      </w:r>
+      <w:r>
+        <w:t>, tự hiện hộp thông báo xanh/đỏ, tự xóa nội dung khi thành công.</w:t>
+      </w:r>
+    </w:p>
+    <w:p>
+      <w:pPr>
+        <w:pStyle w:val="ListParagraph"/>
+        <w:numPr>
+          <w:ilvl w:val="0"/>
+          <w:numId w:val="3"/>
+        </w:numPr>
+        <w:spacing w:after="60" w:line="288" w:lineRule="auto"/>
+      </w:pPr>
+      <w:r>
+        <w:rPr>
+          <w:rFonts w:ascii="Consolas" w:eastAsia="Consolas" w:hAnsi="Consolas" w:cs="Consolas"/>
+          <w:color w:val="1D4ED8"/>
+          <w:sz w:val="21"/>
+          <w:szCs w:val="21"/>
+        </w:rPr>
+        <w:t>SubmitButton</w:t>
+      </w:r>
+      <w:r>
+        <w:t>: hiện vòng quay "Đang xử lý…" và khóa nút khi đang gửi; hỗ trợ hỏi xác nhận (</w:t>
+      </w:r>
+      <w:r>
+        <w:rPr>
+          <w:rFonts w:ascii="Consolas" w:eastAsia="Consolas" w:hAnsi="Consolas" w:cs="Consolas"/>
+          <w:color w:val="1D4ED8"/>
+          <w:sz w:val="21"/>
+          <w:szCs w:val="21"/>
+        </w:rPr>
+        <w:t>confirm</w:t>
+      </w:r>
+      <w:r>
+        <w:t>).</w:t>
+      </w:r>
+    </w:p>
+    <w:p>
+      <w:pPr>
+        <w:pStyle w:val="ListParagraph"/>
+        <w:numPr>
+          <w:ilvl w:val="0"/>
+          <w:numId w:val="3"/>
+        </w:numPr>
+        <w:spacing w:after="60" w:line="288" w:lineRule="auto"/>
+      </w:pPr>
+      <w:r>
+        <w:rPr>
+          <w:rFonts w:ascii="Consolas" w:eastAsia="Consolas" w:hAnsi="Consolas" w:cs="Consolas"/>
+          <w:color w:val="1D4ED8"/>
+          <w:sz w:val="21"/>
+          <w:szCs w:val="21"/>
+        </w:rPr>
         <w:t>DeleteButton</w:t>
       </w:r>
       <w:r>
@@ -8366,7 +8615,7 @@
       <w:pPr>
         <w:pStyle w:val="Heading2"/>
       </w:pPr>
-      <w:bookmarkStart w:id="10" w:name="_Toc244117614"/>
+      <w:bookmarkStart w:id="10" w:name="_Toc244179380"/>
       <w:r>
         <w:t>2.5. Tệp đính kèm</w:t>
       </w:r>
@@ -8449,7 +8698,7 @@
       <w:pPr>
         <w:pStyle w:val="Heading2"/>
       </w:pPr>
-      <w:bookmarkStart w:id="11" w:name="_Toc244117615"/>
+      <w:bookmarkStart w:id="11" w:name="_Toc244179381"/>
       <w:r>
         <w:t>2.6. Giao diện chung</w:t>
       </w:r>
@@ -8583,6 +8832,7 @@
           <w:sz w:val="21"/>
           <w:szCs w:val="21"/>
         </w:rPr>
+        <w:lastRenderedPageBreak/>
         <w:t>src/lib/constants.ts</w:t>
       </w:r>
       <w:r>
@@ -8594,7 +8844,7 @@
         <w:pStyle w:val="Heading1"/>
         <w:pageBreakBefore/>
       </w:pPr>
-      <w:bookmarkStart w:id="12" w:name="_Toc244117616"/>
+      <w:bookmarkStart w:id="12" w:name="_Toc244179382"/>
       <w:r>
         <w:lastRenderedPageBreak/>
         <w:t>3. Module 1 – Văn bản &amp; Thông báo</w:t>
@@ -9030,7 +9280,7 @@
       <w:pPr>
         <w:pStyle w:val="Heading2"/>
       </w:pPr>
-      <w:bookmarkStart w:id="13" w:name="_Toc244117617"/>
+      <w:bookmarkStart w:id="13" w:name="_Toc244179383"/>
       <w:r>
         <w:t>3.1. Cơ chế đọc và ký nhận</w:t>
       </w:r>
@@ -9157,11 +9407,32 @@
     </w:p>
     <w:p>
       <w:pPr>
-        <w:spacing w:after="120" w:line="300" w:lineRule="auto"/>
-        <w:jc w:val="both"/>
-      </w:pPr>
-      <w:r>
-        <w:t xml:space="preserve">Số văn bản chưa ký của mỗi người được đếm trong </w:t>
+        <w:pStyle w:val="Heading2"/>
+      </w:pPr>
+      <w:bookmarkStart w:id="14" w:name="_Toc244179384"/>
+      <w:r>
+        <w:t>3.2. Sửa, xóa văn bản và danh mục</w:t>
+      </w:r>
+      <w:bookmarkEnd w:id="14"/>
+    </w:p>
+    <w:p>
+      <w:pPr>
+        <w:pStyle w:val="ListParagraph"/>
+        <w:numPr>
+          <w:ilvl w:val="0"/>
+          <w:numId w:val="3"/>
+        </w:numPr>
+        <w:spacing w:after="60" w:line="288" w:lineRule="auto"/>
+      </w:pPr>
+      <w:r>
+        <w:rPr>
+          <w:b/>
+          <w:bCs/>
+        </w:rPr>
+        <w:t>Sửa văn bản</w:t>
+      </w:r>
+      <w:r>
+        <w:t xml:space="preserve"> (</w:t>
       </w:r>
       <w:r>
         <w:rPr>
@@ -9170,6 +9441,99 @@
           <w:sz w:val="21"/>
           <w:szCs w:val="21"/>
         </w:rPr>
+        <w:t>van-ban/[id]/sua</w:t>
+      </w:r>
+      <w:r>
+        <w:t xml:space="preserve">, action </w:t>
+      </w:r>
+      <w:r>
+        <w:rPr>
+          <w:rFonts w:ascii="Consolas" w:eastAsia="Consolas" w:hAnsi="Consolas" w:cs="Consolas"/>
+          <w:color w:val="1D4ED8"/>
+          <w:sz w:val="21"/>
+          <w:szCs w:val="21"/>
+        </w:rPr>
+        <w:t>updateDocument</w:t>
+      </w:r>
+      <w:r>
+        <w:t>): mọi thông tin, đổi yêu cầu ký nhận và hạn ký, thêm tệp mới, tích để gỡ tệp cũ (tệp bị xóa khỏi ổ đĩa).</w:t>
+      </w:r>
+    </w:p>
+    <w:p>
+      <w:pPr>
+        <w:pStyle w:val="ListParagraph"/>
+        <w:numPr>
+          <w:ilvl w:val="0"/>
+          <w:numId w:val="3"/>
+        </w:numPr>
+        <w:spacing w:after="60" w:line="288" w:lineRule="auto"/>
+      </w:pPr>
+      <w:r>
+        <w:rPr>
+          <w:b/>
+          <w:bCs/>
+        </w:rPr>
+        <w:t>Yêu cầu ký nhận lại</w:t>
+      </w:r>
+      <w:r>
+        <w:t>: khi văn bản đã có người ký, trang sửa hiện tùy chọn này. Tích vào thì toàn bộ chữ ký cũ bị hủy (trạng thái "đã đọc" được giữ) để mọi người ký lại bản mới.</w:t>
+      </w:r>
+    </w:p>
+    <w:p>
+      <w:pPr>
+        <w:pStyle w:val="ListParagraph"/>
+        <w:numPr>
+          <w:ilvl w:val="0"/>
+          <w:numId w:val="3"/>
+        </w:numPr>
+        <w:spacing w:after="60" w:line="288" w:lineRule="auto"/>
+      </w:pPr>
+      <w:r>
+        <w:rPr>
+          <w:b/>
+          <w:bCs/>
+        </w:rPr>
+        <w:t>Xóa văn bản</w:t>
+      </w:r>
+      <w:r>
+        <w:t>: ở trang chi tiết, trang sửa hoặc từng dòng danh sách; xóa kèm tệp đính kèm và dữ liệu đọc/ký.</w:t>
+      </w:r>
+    </w:p>
+    <w:p>
+      <w:pPr>
+        <w:pStyle w:val="ListParagraph"/>
+        <w:numPr>
+          <w:ilvl w:val="0"/>
+          <w:numId w:val="3"/>
+        </w:numPr>
+        <w:spacing w:after="60" w:line="288" w:lineRule="auto"/>
+      </w:pPr>
+      <w:r>
+        <w:rPr>
+          <w:b/>
+          <w:bCs/>
+        </w:rPr>
+        <w:t>Danh mục</w:t>
+      </w:r>
+      <w:r>
+        <w:t>: đổi tên, đổi màu nhãn; chỉ xóa được danh mục không còn văn bản.</w:t>
+      </w:r>
+    </w:p>
+    <w:p>
+      <w:pPr>
+        <w:spacing w:after="120" w:line="300" w:lineRule="auto"/>
+        <w:jc w:val="both"/>
+      </w:pPr>
+      <w:r>
+        <w:t xml:space="preserve">Số văn bản chưa ký của mỗi người được đếm trong </w:t>
+      </w:r>
+      <w:r>
+        <w:rPr>
+          <w:rFonts w:ascii="Consolas" w:eastAsia="Consolas" w:hAnsi="Consolas" w:cs="Consolas"/>
+          <w:color w:val="1D4ED8"/>
+          <w:sz w:val="21"/>
+          <w:szCs w:val="21"/>
+        </w:rPr>
         <w:t>layout.tsx</w:t>
       </w:r>
       <w:r>
@@ -9181,12 +9545,12 @@
         <w:pStyle w:val="Heading1"/>
         <w:pageBreakBefore/>
       </w:pPr>
-      <w:bookmarkStart w:id="14" w:name="_Toc244117618"/>
+      <w:bookmarkStart w:id="15" w:name="_Toc244179385"/>
       <w:r>
         <w:lastRenderedPageBreak/>
         <w:t>4. Module 2 – Trang thiết bị</w:t>
       </w:r>
-      <w:bookmarkEnd w:id="14"/>
+      <w:bookmarkEnd w:id="15"/>
     </w:p>
     <w:tbl>
       <w:tblPr>
@@ -9903,11 +10267,11 @@
       <w:pPr>
         <w:pStyle w:val="Heading2"/>
       </w:pPr>
-      <w:bookmarkStart w:id="15" w:name="_Toc244117619"/>
+      <w:bookmarkStart w:id="16" w:name="_Toc244179386"/>
       <w:r>
         <w:t>4.1. Thêm, sửa, xóa thiết bị</w:t>
       </w:r>
-      <w:bookmarkEnd w:id="15"/>
+      <w:bookmarkEnd w:id="16"/>
     </w:p>
     <w:p>
       <w:pPr>
@@ -10017,11 +10381,11 @@
       <w:pPr>
         <w:pStyle w:val="Heading2"/>
       </w:pPr>
-      <w:bookmarkStart w:id="16" w:name="_Toc244117620"/>
+      <w:bookmarkStart w:id="17" w:name="_Toc244179387"/>
       <w:r>
         <w:t>4.2. Mượn – trả</w:t>
       </w:r>
-      <w:bookmarkEnd w:id="16"/>
+      <w:bookmarkEnd w:id="17"/>
     </w:p>
     <w:p>
       <w:pPr>
@@ -10078,11 +10442,11 @@
       <w:pPr>
         <w:pStyle w:val="Heading2"/>
       </w:pPr>
-      <w:bookmarkStart w:id="17" w:name="_Toc244117621"/>
+      <w:bookmarkStart w:id="18" w:name="_Toc244179388"/>
       <w:r>
         <w:t>4.3. Mã QR và kiểm kê</w:t>
       </w:r>
-      <w:bookmarkEnd w:id="17"/>
+      <w:bookmarkEnd w:id="18"/>
     </w:p>
     <w:p>
       <w:pPr>
@@ -10175,12 +10539,12 @@
         <w:pStyle w:val="Heading1"/>
         <w:pageBreakBefore/>
       </w:pPr>
-      <w:bookmarkStart w:id="18" w:name="_Toc244117622"/>
+      <w:bookmarkStart w:id="19" w:name="_Toc244179389"/>
       <w:r>
         <w:lastRenderedPageBreak/>
         <w:t>5. Module 3 – Minh chứng Sở ban ngành</w:t>
       </w:r>
-      <w:bookmarkEnd w:id="18"/>
+      <w:bookmarkEnd w:id="19"/>
     </w:p>
     <w:tbl>
       <w:tblPr>
@@ -10817,11 +11181,11 @@
       <w:pPr>
         <w:pStyle w:val="Heading2"/>
       </w:pPr>
-      <w:bookmarkStart w:id="19" w:name="_Toc244117623"/>
+      <w:bookmarkStart w:id="20" w:name="_Toc244179390"/>
       <w:r>
         <w:t>5.1. Quy trình</w:t>
       </w:r>
-      <w:bookmarkEnd w:id="19"/>
+      <w:bookmarkEnd w:id="20"/>
     </w:p>
     <w:p>
       <w:pPr>
@@ -10931,11 +11295,11 @@
       <w:pPr>
         <w:pStyle w:val="Heading2"/>
       </w:pPr>
-      <w:bookmarkStart w:id="20" w:name="_Toc244117624"/>
+      <w:bookmarkStart w:id="21" w:name="_Toc244179391"/>
       <w:r>
         <w:t>5.2. Bảo đảm lịch sử duyệt không thể sửa</w:t>
       </w:r>
-      <w:bookmarkEnd w:id="20"/>
+      <w:bookmarkEnd w:id="21"/>
     </w:p>
     <w:p>
       <w:pPr>
@@ -11260,33 +11624,33 @@
     </w:p>
     <w:p>
       <w:pPr>
-        <w:spacing w:after="120" w:line="300" w:lineRule="auto"/>
-        <w:jc w:val="both"/>
-      </w:pPr>
+        <w:pStyle w:val="Heading2"/>
+      </w:pPr>
+      <w:bookmarkStart w:id="22" w:name="_Toc244179392"/>
       <w:r>
         <w:lastRenderedPageBreak/>
-        <w:t>Báo cáo xuất CSV có ký tự BOM UTF-8 để Excel hiển thị đúng tiếng Việt; mỗi dòng gồm tiêu chí, minh chứng, người nộp, trạng thái, toàn bộ lịch sử duyệt và đường dẫn tải tệp. Tiêu chí chưa có minh chứng vẫn được liệt kê để dễ rà soát.</w:t>
-      </w:r>
-    </w:p>
-    <w:p>
-      <w:pPr>
-        <w:pStyle w:val="Heading1"/>
-        <w:pageBreakBefore/>
-      </w:pPr>
-      <w:bookmarkStart w:id="21" w:name="_Toc244117625"/>
-      <w:r>
-        <w:lastRenderedPageBreak/>
-        <w:t>6. Module 4 – Thời khóa biểu thông minh</w:t>
-      </w:r>
-      <w:bookmarkEnd w:id="21"/>
-    </w:p>
-    <w:p>
-      <w:pPr>
-        <w:spacing w:after="120" w:line="300" w:lineRule="auto"/>
-        <w:jc w:val="both"/>
-      </w:pPr>
-      <w:r>
-        <w:t xml:space="preserve">Đây là module phức tạp nhất. Phần này giải thích dữ liệu đầu vào, thuật toán hai giai đoạn trong </w:t>
+        <w:t>5.3. Sửa, xóa đợt minh chứng</w:t>
+      </w:r>
+      <w:bookmarkEnd w:id="22"/>
+    </w:p>
+    <w:p>
+      <w:pPr>
+        <w:pStyle w:val="ListParagraph"/>
+        <w:numPr>
+          <w:ilvl w:val="0"/>
+          <w:numId w:val="3"/>
+        </w:numPr>
+        <w:spacing w:after="60" w:line="288" w:lineRule="auto"/>
+      </w:pPr>
+      <w:r>
+        <w:rPr>
+          <w:b/>
+          <w:bCs/>
+        </w:rPr>
+        <w:t>Sửa đợt</w:t>
+      </w:r>
+      <w:r>
+        <w:t xml:space="preserve"> (</w:t>
       </w:r>
       <w:r>
         <w:rPr>
@@ -11295,6 +11659,98 @@
           <w:sz w:val="21"/>
           <w:szCs w:val="21"/>
         </w:rPr>
+        <w:t>minh-chung/[id]/sua</w:t>
+      </w:r>
+      <w:r>
+        <w:t>): tên, cơ quan, ngày mở, hạn nộp, mô tả.</w:t>
+      </w:r>
+    </w:p>
+    <w:p>
+      <w:pPr>
+        <w:pStyle w:val="ListParagraph"/>
+        <w:numPr>
+          <w:ilvl w:val="0"/>
+          <w:numId w:val="3"/>
+        </w:numPr>
+        <w:spacing w:after="60" w:line="288" w:lineRule="auto"/>
+      </w:pPr>
+      <w:r>
+        <w:rPr>
+          <w:b/>
+          <w:bCs/>
+        </w:rPr>
+        <w:t>Tiêu chí</w:t>
+      </w:r>
+      <w:r>
+        <w:t xml:space="preserve">: sửa mã/tên, thêm tiêu chí mới (xếp cuối). Chỉ xóa được tiêu chí </w:t>
+      </w:r>
+      <w:r>
+        <w:rPr>
+          <w:b/>
+          <w:bCs/>
+        </w:rPr>
+        <w:t>chưa có minh chứng</w:t>
+      </w:r>
+      <w:r>
+        <w:t>; tiêu chí đã có minh chứng thì đổi tên thay vì xóa.</w:t>
+      </w:r>
+    </w:p>
+    <w:p>
+      <w:pPr>
+        <w:pStyle w:val="ListParagraph"/>
+        <w:numPr>
+          <w:ilvl w:val="0"/>
+          <w:numId w:val="3"/>
+        </w:numPr>
+        <w:spacing w:after="60" w:line="288" w:lineRule="auto"/>
+      </w:pPr>
+      <w:r>
+        <w:rPr>
+          <w:b/>
+          <w:bCs/>
+        </w:rPr>
+        <w:t>Xóa đợt</w:t>
+      </w:r>
+      <w:r>
+        <w:t>: hỏi xác nhận kèm số tiêu chí và minh chứng sẽ mất; xóa vĩnh viễn tiêu chí, minh chứng, lịch sử duyệt và tệp đính kèm trên ổ đĩa. Đây là thao tác chủ động của Quản lý khoa đối với cả đợt – trong một đợt còn tồn tại, lịch sử duyệt vẫn không thể sửa.</w:t>
+      </w:r>
+    </w:p>
+    <w:p>
+      <w:pPr>
+        <w:spacing w:after="120" w:line="300" w:lineRule="auto"/>
+        <w:jc w:val="both"/>
+      </w:pPr>
+      <w:r>
+        <w:t>Báo cáo xuất CSV có ký tự BOM UTF-8 để Excel hiển thị đúng tiếng Việt; mỗi dòng gồm tiêu chí, minh chứng, người nộp, trạng thái, toàn bộ lịch sử duyệt và đường dẫn tải tệp. Tiêu chí chưa có minh chứng vẫn được liệt kê để dễ rà soát.</w:t>
+      </w:r>
+    </w:p>
+    <w:p>
+      <w:pPr>
+        <w:pStyle w:val="Heading1"/>
+        <w:pageBreakBefore/>
+      </w:pPr>
+      <w:bookmarkStart w:id="23" w:name="_Toc244179393"/>
+      <w:r>
+        <w:lastRenderedPageBreak/>
+        <w:t>6. Module 4 – Thời khóa biểu thông minh</w:t>
+      </w:r>
+      <w:bookmarkEnd w:id="23"/>
+    </w:p>
+    <w:p>
+      <w:pPr>
+        <w:spacing w:after="120" w:line="300" w:lineRule="auto"/>
+        <w:jc w:val="both"/>
+      </w:pPr>
+      <w:r>
+        <w:t xml:space="preserve">Đây là module phức tạp nhất. Phần này giải thích dữ liệu đầu vào, thuật toán hai giai đoạn trong </w:t>
+      </w:r>
+      <w:r>
+        <w:rPr>
+          <w:rFonts w:ascii="Consolas" w:eastAsia="Consolas" w:hAnsi="Consolas" w:cs="Consolas"/>
+          <w:color w:val="1D4ED8"/>
+          <w:sz w:val="21"/>
+          <w:szCs w:val="21"/>
+        </w:rPr>
         <w:t>src/lib/scheduler.ts</w:t>
       </w:r>
       <w:r>
@@ -11305,11 +11761,11 @@
       <w:pPr>
         <w:pStyle w:val="Heading2"/>
       </w:pPr>
-      <w:bookmarkStart w:id="22" w:name="_Toc244117626"/>
+      <w:bookmarkStart w:id="24" w:name="_Toc244179394"/>
       <w:r>
         <w:t>6.1. Quy ước lịch học</w:t>
       </w:r>
-      <w:bookmarkEnd w:id="22"/>
+      <w:bookmarkEnd w:id="24"/>
     </w:p>
     <w:tbl>
       <w:tblPr>
@@ -11787,11 +12243,11 @@
       <w:pPr>
         <w:pStyle w:val="Heading2"/>
       </w:pPr>
-      <w:bookmarkStart w:id="23" w:name="_Toc244117627"/>
+      <w:bookmarkStart w:id="25" w:name="_Toc244179395"/>
       <w:r>
         <w:t>6.2. Dữ liệu đầu vào</w:t>
       </w:r>
-      <w:bookmarkEnd w:id="23"/>
+      <w:bookmarkEnd w:id="25"/>
     </w:p>
     <w:tbl>
       <w:tblPr>
@@ -12689,11 +13145,11 @@
       <w:pPr>
         <w:pStyle w:val="Heading2"/>
       </w:pPr>
-      <w:bookmarkStart w:id="24" w:name="_Toc244117628"/>
+      <w:bookmarkStart w:id="26" w:name="_Toc244179396"/>
       <w:r>
         <w:t>6.3. Giai đoạn 1 – Phân bổ giảng viên (allocateLecturers)</w:t>
       </w:r>
-      <w:bookmarkEnd w:id="24"/>
+      <w:bookmarkEnd w:id="26"/>
     </w:p>
     <w:p>
       <w:pPr>
@@ -13846,11 +14302,11 @@
       <w:pPr>
         <w:pStyle w:val="Heading2"/>
       </w:pPr>
-      <w:bookmarkStart w:id="25" w:name="_Toc244117629"/>
+      <w:bookmarkStart w:id="27" w:name="_Toc244179397"/>
       <w:r>
         <w:t>6.4. Giai đoạn 2 – Xếp lịch tuần (solveTimetable)</w:t>
       </w:r>
-      <w:bookmarkEnd w:id="25"/>
+      <w:bookmarkEnd w:id="27"/>
     </w:p>
     <w:p>
       <w:pPr>
@@ -14408,11 +14864,11 @@
       <w:pPr>
         <w:pStyle w:val="Heading2"/>
       </w:pPr>
-      <w:bookmarkStart w:id="26" w:name="_Toc244117630"/>
+      <w:bookmarkStart w:id="28" w:name="_Toc244179398"/>
       <w:r>
         <w:t>6.5. Lưu kết quả và các phiên bản</w:t>
       </w:r>
-      <w:bookmarkEnd w:id="26"/>
+      <w:bookmarkEnd w:id="28"/>
     </w:p>
     <w:p>
       <w:pPr>
@@ -14532,11 +14988,11 @@
       <w:pPr>
         <w:pStyle w:val="Heading2"/>
       </w:pPr>
-      <w:bookmarkStart w:id="27" w:name="_Toc244117631"/>
+      <w:bookmarkStart w:id="29" w:name="_Toc244179399"/>
       <w:r>
         <w:t>6.6. Chỉnh tay và phát hiện xung đột</w:t>
       </w:r>
-      <w:bookmarkEnd w:id="27"/>
+      <w:bookmarkEnd w:id="29"/>
     </w:p>
     <w:p>
       <w:pPr>
@@ -14657,11 +15113,11 @@
       <w:pPr>
         <w:pStyle w:val="Heading2"/>
       </w:pPr>
-      <w:bookmarkStart w:id="28" w:name="_Toc244117632"/>
+      <w:bookmarkStart w:id="30" w:name="_Toc244179400"/>
       <w:r>
         <w:t>6.7. Xóa dữ liệu nền an toàn</w:t>
       </w:r>
-      <w:bookmarkEnd w:id="28"/>
+      <w:bookmarkEnd w:id="30"/>
     </w:p>
     <w:p>
       <w:pPr>
@@ -14686,11 +15142,11 @@
       <w:pPr>
         <w:pStyle w:val="Heading2"/>
       </w:pPr>
-      <w:bookmarkStart w:id="29" w:name="_Toc244117633"/>
+      <w:bookmarkStart w:id="31" w:name="_Toc244179401"/>
       <w:r>
         <w:t>6.8. Kiểm thử thuật toán</w:t>
       </w:r>
-      <w:bookmarkEnd w:id="29"/>
+      <w:bookmarkEnd w:id="31"/>
     </w:p>
     <w:p>
       <w:pPr>
@@ -15238,22 +15694,22 @@
         <w:pStyle w:val="Heading1"/>
         <w:pageBreakBefore/>
       </w:pPr>
-      <w:bookmarkStart w:id="30" w:name="_Toc244117634"/>
+      <w:bookmarkStart w:id="32" w:name="_Toc244179402"/>
       <w:r>
         <w:lastRenderedPageBreak/>
         <w:t>7. Module 5 – Giao việc &amp; Hiệu suất</w:t>
       </w:r>
-      <w:bookmarkEnd w:id="30"/>
+      <w:bookmarkEnd w:id="32"/>
     </w:p>
     <w:p>
       <w:pPr>
         <w:pStyle w:val="Heading2"/>
       </w:pPr>
-      <w:bookmarkStart w:id="31" w:name="_Toc244117635"/>
+      <w:bookmarkStart w:id="33" w:name="_Toc244179403"/>
       <w:r>
         <w:t>7.1. Vòng đời công việc</w:t>
       </w:r>
-      <w:bookmarkEnd w:id="31"/>
+      <w:bookmarkEnd w:id="33"/>
     </w:p>
     <w:p>
       <w:pPr>
@@ -15363,11 +15819,11 @@
       <w:pPr>
         <w:pStyle w:val="Heading2"/>
       </w:pPr>
-      <w:bookmarkStart w:id="32" w:name="_Toc244117636"/>
+      <w:bookmarkStart w:id="34" w:name="_Toc244179404"/>
       <w:r>
         <w:t>7.2. Chấm điểm hiệu suất tự động (src/lib/performance.ts)</w:t>
       </w:r>
-      <w:bookmarkEnd w:id="32"/>
+      <w:bookmarkEnd w:id="34"/>
     </w:p>
     <w:tbl>
       <w:tblPr>
@@ -15815,11 +16271,11 @@
       <w:pPr>
         <w:pStyle w:val="Heading2"/>
       </w:pPr>
-      <w:bookmarkStart w:id="33" w:name="_Toc244117637"/>
+      <w:bookmarkStart w:id="35" w:name="_Toc244179405"/>
       <w:r>
         <w:t>7.3. Nhận xét bằng AI</w:t>
       </w:r>
-      <w:bookmarkEnd w:id="33"/>
+      <w:bookmarkEnd w:id="35"/>
     </w:p>
     <w:p>
       <w:pPr>
@@ -15869,22 +16325,22 @@
         <w:pStyle w:val="Heading1"/>
         <w:pageBreakBefore/>
       </w:pPr>
-      <w:bookmarkStart w:id="34" w:name="_Toc244117638"/>
+      <w:bookmarkStart w:id="36" w:name="_Toc244179406"/>
       <w:r>
         <w:lastRenderedPageBreak/>
         <w:t>8. Module 6 – Trợ lý AI &amp; Kho tri thức</w:t>
       </w:r>
-      <w:bookmarkEnd w:id="34"/>
+      <w:bookmarkEnd w:id="36"/>
     </w:p>
     <w:p>
       <w:pPr>
         <w:pStyle w:val="Heading2"/>
       </w:pPr>
-      <w:bookmarkStart w:id="35" w:name="_Toc244117639"/>
+      <w:bookmarkStart w:id="37" w:name="_Toc244179407"/>
       <w:r>
         <w:t>8.1. Kho tri thức</w:t>
       </w:r>
-      <w:bookmarkEnd w:id="35"/>
+      <w:bookmarkEnd w:id="37"/>
     </w:p>
     <w:p>
       <w:pPr>
@@ -15911,11 +16367,11 @@
       <w:pPr>
         <w:pStyle w:val="Heading2"/>
       </w:pPr>
-      <w:bookmarkStart w:id="36" w:name="_Toc244117640"/>
+      <w:bookmarkStart w:id="38" w:name="_Toc244179408"/>
       <w:r>
         <w:t>8.2. Tìm kiếm tài liệu (src/lib/kb-search.ts)</w:t>
       </w:r>
-      <w:bookmarkEnd w:id="36"/>
+      <w:bookmarkEnd w:id="38"/>
     </w:p>
     <w:p>
       <w:pPr>
@@ -15970,11 +16426,11 @@
       <w:pPr>
         <w:pStyle w:val="Heading2"/>
       </w:pPr>
-      <w:bookmarkStart w:id="37" w:name="_Toc244117641"/>
+      <w:bookmarkStart w:id="39" w:name="_Toc244179409"/>
       <w:r>
         <w:t>8.3. Chatbot (RAG – truy xuất rồi sinh câu trả lời)</w:t>
       </w:r>
-      <w:bookmarkEnd w:id="37"/>
+      <w:bookmarkEnd w:id="39"/>
     </w:p>
     <w:p>
       <w:pPr>
@@ -16119,11 +16575,11 @@
       <w:pPr>
         <w:pStyle w:val="Heading2"/>
       </w:pPr>
-      <w:bookmarkStart w:id="38" w:name="_Toc244117642"/>
+      <w:bookmarkStart w:id="40" w:name="_Toc244179410"/>
       <w:r>
         <w:t>8.4. Kết nối Claude (src/lib/ai.ts)</w:t>
       </w:r>
-      <w:bookmarkEnd w:id="38"/>
+      <w:bookmarkEnd w:id="40"/>
     </w:p>
     <w:p>
       <w:pPr>
@@ -16240,22 +16696,22 @@
         <w:pStyle w:val="Heading1"/>
         <w:pageBreakBefore/>
       </w:pPr>
-      <w:bookmarkStart w:id="39" w:name="_Toc244117643"/>
+      <w:bookmarkStart w:id="41" w:name="_Toc244179411"/>
       <w:r>
         <w:lastRenderedPageBreak/>
         <w:t>9. Bảng điều khiển, dữ liệu mẫu và công cụ</w:t>
       </w:r>
-      <w:bookmarkEnd w:id="39"/>
+      <w:bookmarkEnd w:id="41"/>
     </w:p>
     <w:p>
       <w:pPr>
         <w:pStyle w:val="Heading2"/>
       </w:pPr>
-      <w:bookmarkStart w:id="40" w:name="_Toc244117644"/>
+      <w:bookmarkStart w:id="42" w:name="_Toc244179412"/>
       <w:r>
         <w:t>9.1. Bảng điều khiển (src/app/(portal)/page.tsx)</w:t>
       </w:r>
-      <w:bookmarkEnd w:id="40"/>
+      <w:bookmarkEnd w:id="42"/>
     </w:p>
     <w:p>
       <w:pPr>
@@ -16270,11 +16726,11 @@
       <w:pPr>
         <w:pStyle w:val="Heading2"/>
       </w:pPr>
-      <w:bookmarkStart w:id="41" w:name="_Toc244117645"/>
+      <w:bookmarkStart w:id="43" w:name="_Toc244179413"/>
       <w:r>
         <w:t>9.2. Script và lệnh</w:t>
       </w:r>
-      <w:bookmarkEnd w:id="41"/>
+      <w:bookmarkEnd w:id="43"/>
     </w:p>
     <w:tbl>
       <w:tblPr>
@@ -16810,12 +17266,12 @@
         <w:pStyle w:val="Heading1"/>
         <w:pageBreakBefore/>
       </w:pPr>
-      <w:bookmarkStart w:id="42" w:name="_Toc244117646"/>
+      <w:bookmarkStart w:id="44" w:name="_Toc244179414"/>
       <w:r>
         <w:lastRenderedPageBreak/>
         <w:t>10. Triển khai lên Hostinger</w:t>
       </w:r>
-      <w:bookmarkEnd w:id="42"/>
+      <w:bookmarkEnd w:id="44"/>
     </w:p>
     <w:p>
       <w:pPr>
@@ -17553,22 +18009,22 @@
         <w:pStyle w:val="Heading1"/>
         <w:pageBreakBefore/>
       </w:pPr>
-      <w:bookmarkStart w:id="43" w:name="_Toc244117647"/>
+      <w:bookmarkStart w:id="45" w:name="_Toc244179415"/>
       <w:r>
         <w:lastRenderedPageBreak/>
         <w:t>11. Bảo mật và bảo trì</w:t>
       </w:r>
-      <w:bookmarkEnd w:id="43"/>
+      <w:bookmarkEnd w:id="45"/>
     </w:p>
     <w:p>
       <w:pPr>
         <w:pStyle w:val="Heading2"/>
       </w:pPr>
-      <w:bookmarkStart w:id="44" w:name="_Toc244117648"/>
+      <w:bookmarkStart w:id="46" w:name="_Toc244179416"/>
       <w:r>
         <w:t>11.1. Các biện pháp bảo mật</w:t>
       </w:r>
-      <w:bookmarkEnd w:id="44"/>
+      <w:bookmarkEnd w:id="46"/>
     </w:p>
     <w:p>
       <w:pPr>
@@ -17688,11 +18144,11 @@
       <w:pPr>
         <w:pStyle w:val="Heading2"/>
       </w:pPr>
-      <w:bookmarkStart w:id="45" w:name="_Toc244117649"/>
+      <w:bookmarkStart w:id="47" w:name="_Toc244179417"/>
       <w:r>
         <w:t>11.2. Thay đổi thường gặp</w:t>
       </w:r>
-      <w:bookmarkEnd w:id="45"/>
+      <w:bookmarkEnd w:id="47"/>
     </w:p>
     <w:tbl>
       <w:tblPr>
@@ -18483,11 +18939,11 @@
       <w:pPr>
         <w:pStyle w:val="Heading2"/>
       </w:pPr>
-      <w:bookmarkStart w:id="46" w:name="_Toc244117650"/>
+      <w:bookmarkStart w:id="48" w:name="_Toc244179418"/>
       <w:r>
         <w:t>11.3. Quy trình cập nhật</w:t>
       </w:r>
-      <w:bookmarkEnd w:id="46"/>
+      <w:bookmarkEnd w:id="48"/>
     </w:p>
     <w:p>
       <w:pPr>
@@ -18789,10 +19245,10 @@
 <file path=word/numbering.xml><?xml version="1.0" encoding="utf-8"?>
 <w:numbering xmlns:wpc="http://schemas.microsoft.com/office/word/2010/wordprocessingCanvas" xmlns:cx="http://schemas.microsoft.com/office/drawing/2014/chartex" xmlns:cx1="http://schemas.microsoft.com/office/drawing/2015/9/8/chartex" xmlns:cx2="http://schemas.microsoft.com/office/drawing/2015/10/21/chartex" xmlns:cx3="http://schemas.microsoft.com/office/drawing/2016/5/9/chartex" xmlns:cx4="http://schemas.microsoft.com/office/drawing/2016/5/10/chartex" xmlns:cx5="http://schemas.microsoft.com/office/drawing/2016/5/11/chartex" xmlns:cx6="http://schemas.microsoft.com/office/drawing/2016/5/12/chartex" xmlns:cx7="http://schemas.microsoft.com/office/drawing/2016/5/13/chartex" xmlns:cx8="http://schemas.microsoft.com/office/drawing/2016/5/14/chartex" xmlns:mc="http://schemas.openxmlformats.org/markup-compatibility/2006" xmlns:aink="http://schemas.microsoft.com/office/drawing/2016/ink" xmlns:am3d="http://schemas.microsoft.com/office/drawing/2017/model3d" xmlns:o="urn:schemas-microsoft-com:office:office" xmlns:oel="http://schemas.microsoft.com/office/2019/extlst" xmlns:r="http://schemas.openxmlformats.org/officeDocument/2006/relationships" xmlns:m="http://schemas.openxmlformats.org/officeDocument/2006/math" xmlns:v="urn:schemas-microsoft-com:vml" xmlns:wp14="http://schemas.microsoft.com/office/word/2010/wordprocessingDrawing" xmlns:wp="http://schemas.openxmlformats.org/drawingml/2006/wordprocessingDrawing" xmlns:w10="urn:schemas-microsoft-com:office:word" xmlns:w="http://schemas.openxmlformats.org/wordprocessingml/2006/main" xmlns:w14="http://schemas.microsoft.com/office/word/2010/wordml" xmlns:w15="http://schemas.microsoft.com/office/word/2012/wordml" xmlns:w16cex="http://schemas.microsoft.com/office/word/2018/wordml/cex" xmlns:w16cid="http://schemas.microsoft.com/office/word/2016/wordml/cid" xmlns:w16="http://schemas.microsoft.com/office/word/2018/wordml" xmlns:w16du="http://schemas.microsoft.com/office/word/2023/wordml/word16du" xmlns:w16sdtdh="http://schemas.microsoft.com/office/word/2020/wordml/sdtdatahash" xmlns:w16sdtfl="http://schemas.microsoft.com/office/word/2024/wordml/sdtformatlock" xmlns:w16se="http://schemas.microsoft.com/office/word/2015/wordml/symex" xmlns:wpg="http://schemas.microsoft.com/office/word/2010/wordprocessingGroup" xmlns:wpi="http://schemas.microsoft.com/office/word/2010/wordprocessingInk" xmlns:wne="http://schemas.microsoft.com/office/word/2006/wordml" xmlns:wps="http://schemas.microsoft.com/office/word/2010/wordprocessingShape" mc:Ignorable="w14 w15 w16se w16cid w16 w16cex w16sdtdh w16sdtfl w16du wp14">
   <w:abstractNum w:abstractNumId="0" w15:restartNumberingAfterBreak="0">
-    <w:nsid w:val="08A3792E"/>
+    <w:nsid w:val="1BE71294"/>
     <w:multiLevelType w:val="hybridMultilevel"/>
-    <w:tmpl w:val="52AC287C"/>
-    <w:lvl w:ilvl="0" w:tplc="824C021E">
+    <w:tmpl w:val="C458163E"/>
+    <w:lvl w:ilvl="0" w:tplc="CFB4B486">
       <w:start w:val="1"/>
       <w:numFmt w:val="decimal"/>
       <w:lvlText w:val="%1."/>
@@ -18801,52 +19257,52 @@
         <w:ind w:left="640" w:hanging="360"/>
       </w:pPr>
     </w:lvl>
-    <w:lvl w:ilvl="1" w:tplc="86F26DFA">
+    <w:lvl w:ilvl="1" w:tplc="0FAEE14E">
       <w:numFmt w:val="decimal"/>
       <w:lvlText w:val=""/>
       <w:lvlJc w:val="left"/>
     </w:lvl>
-    <w:lvl w:ilvl="2" w:tplc="7E90E470">
+    <w:lvl w:ilvl="2" w:tplc="E7623054">
       <w:numFmt w:val="decimal"/>
       <w:lvlText w:val=""/>
       <w:lvlJc w:val="left"/>
     </w:lvl>
-    <w:lvl w:ilvl="3" w:tplc="598CB60A">
+    <w:lvl w:ilvl="3" w:tplc="7E3C6978">
       <w:numFmt w:val="decimal"/>
       <w:lvlText w:val=""/>
       <w:lvlJc w:val="left"/>
     </w:lvl>
-    <w:lvl w:ilvl="4" w:tplc="273A4898">
+    <w:lvl w:ilvl="4" w:tplc="7AA0A7DA">
       <w:numFmt w:val="decimal"/>
       <w:lvlText w:val=""/>
       <w:lvlJc w:val="left"/>
     </w:lvl>
-    <w:lvl w:ilvl="5" w:tplc="75FE1538">
+    <w:lvl w:ilvl="5" w:tplc="BF3AB94E">
       <w:numFmt w:val="decimal"/>
       <w:lvlText w:val=""/>
       <w:lvlJc w:val="left"/>
     </w:lvl>
-    <w:lvl w:ilvl="6" w:tplc="56FEA50A">
+    <w:lvl w:ilvl="6" w:tplc="5C98B52A">
       <w:numFmt w:val="decimal"/>
       <w:lvlText w:val=""/>
       <w:lvlJc w:val="left"/>
     </w:lvl>
-    <w:lvl w:ilvl="7" w:tplc="EB4693C2">
+    <w:lvl w:ilvl="7" w:tplc="AA5C1C7E">
       <w:numFmt w:val="decimal"/>
       <w:lvlText w:val=""/>
       <w:lvlJc w:val="left"/>
     </w:lvl>
-    <w:lvl w:ilvl="8" w:tplc="09A2F3B8">
+    <w:lvl w:ilvl="8" w:tplc="4CD60DCA">
       <w:numFmt w:val="decimal"/>
       <w:lvlText w:val=""/>
       <w:lvlJc w:val="left"/>
     </w:lvl>
   </w:abstractNum>
   <w:abstractNum w:abstractNumId="1" w15:restartNumberingAfterBreak="0">
-    <w:nsid w:val="14B048A8"/>
+    <w:nsid w:val="28F905CA"/>
     <w:multiLevelType w:val="hybridMultilevel"/>
-    <w:tmpl w:val="0DAC025A"/>
-    <w:lvl w:ilvl="0" w:tplc="AD181DB0">
+    <w:tmpl w:val="671AEED4"/>
+    <w:lvl w:ilvl="0" w:tplc="0310FF2E">
       <w:start w:val="1"/>
       <w:numFmt w:val="decimal"/>
       <w:lvlText w:val="%1."/>
@@ -18855,106 +19311,110 @@
         <w:ind w:left="640" w:hanging="360"/>
       </w:pPr>
     </w:lvl>
-    <w:lvl w:ilvl="1" w:tplc="50821DA6">
+    <w:lvl w:ilvl="1" w:tplc="2D546D92">
       <w:numFmt w:val="decimal"/>
       <w:lvlText w:val=""/>
       <w:lvlJc w:val="left"/>
     </w:lvl>
-    <w:lvl w:ilvl="2" w:tplc="DB862A3E">
+    <w:lvl w:ilvl="2" w:tplc="EE0E2928">
       <w:numFmt w:val="decimal"/>
       <w:lvlText w:val=""/>
       <w:lvlJc w:val="left"/>
     </w:lvl>
-    <w:lvl w:ilvl="3" w:tplc="D73E21CA">
+    <w:lvl w:ilvl="3" w:tplc="64826C54">
       <w:numFmt w:val="decimal"/>
       <w:lvlText w:val=""/>
       <w:lvlJc w:val="left"/>
     </w:lvl>
-    <w:lvl w:ilvl="4" w:tplc="874CE8CC">
+    <w:lvl w:ilvl="4" w:tplc="5D84F1AE">
       <w:numFmt w:val="decimal"/>
       <w:lvlText w:val=""/>
       <w:lvlJc w:val="left"/>
     </w:lvl>
-    <w:lvl w:ilvl="5" w:tplc="8A7EA82C">
+    <w:lvl w:ilvl="5" w:tplc="5D8C2CFE">
       <w:numFmt w:val="decimal"/>
       <w:lvlText w:val=""/>
       <w:lvlJc w:val="left"/>
     </w:lvl>
-    <w:lvl w:ilvl="6" w:tplc="5114C846">
+    <w:lvl w:ilvl="6" w:tplc="7ADA77A4">
       <w:numFmt w:val="decimal"/>
       <w:lvlText w:val=""/>
       <w:lvlJc w:val="left"/>
     </w:lvl>
-    <w:lvl w:ilvl="7" w:tplc="BE8EC558">
+    <w:lvl w:ilvl="7" w:tplc="630E9194">
       <w:numFmt w:val="decimal"/>
       <w:lvlText w:val=""/>
       <w:lvlJc w:val="left"/>
     </w:lvl>
-    <w:lvl w:ilvl="8" w:tplc="7EDE90CA">
+    <w:lvl w:ilvl="8" w:tplc="5EFECC4E">
       <w:numFmt w:val="decimal"/>
       <w:lvlText w:val=""/>
       <w:lvlJc w:val="left"/>
     </w:lvl>
   </w:abstractNum>
   <w:abstractNum w:abstractNumId="2" w15:restartNumberingAfterBreak="0">
-    <w:nsid w:val="20C9089C"/>
+    <w:nsid w:val="2D821474"/>
     <w:multiLevelType w:val="hybridMultilevel"/>
-    <w:tmpl w:val="DF6CCD3A"/>
-    <w:lvl w:ilvl="0" w:tplc="DDDE4C74">
+    <w:tmpl w:val="A22E2C70"/>
+    <w:lvl w:ilvl="0" w:tplc="38F80518">
       <w:start w:val="1"/>
-      <w:numFmt w:val="decimal"/>
-      <w:lvlText w:val="%1."/>
+      <w:numFmt w:val="bullet"/>
+      <w:lvlText w:val="•"/>
       <w:lvlJc w:val="left"/>
       <w:pPr>
-        <w:ind w:left="640" w:hanging="360"/>
+        <w:ind w:left="640" w:hanging="320"/>
       </w:pPr>
     </w:lvl>
-    <w:lvl w:ilvl="1" w:tplc="80E097E8">
+    <w:lvl w:ilvl="1" w:tplc="D4763BF4">
+      <w:start w:val="1"/>
+      <w:numFmt w:val="bullet"/>
+      <w:lvlText w:val="–"/>
+      <w:lvlJc w:val="left"/>
+      <w:pPr>
+        <w:ind w:left="1100" w:hanging="320"/>
+      </w:pPr>
+    </w:lvl>
+    <w:lvl w:ilvl="2" w:tplc="6E7AD68C">
       <w:numFmt w:val="decimal"/>
       <w:lvlText w:val=""/>
       <w:lvlJc w:val="left"/>
     </w:lvl>
-    <w:lvl w:ilvl="2" w:tplc="2348F982">
+    <w:lvl w:ilvl="3" w:tplc="56B60910">
       <w:numFmt w:val="decimal"/>
       <w:lvlText w:val=""/>
       <w:lvlJc w:val="left"/>
     </w:lvl>
-    <w:lvl w:ilvl="3" w:tplc="975667D4">
+    <w:lvl w:ilvl="4" w:tplc="06FEC1F8">
       <w:numFmt w:val="decimal"/>
       <w:lvlText w:val=""/>
       <w:lvlJc w:val="left"/>
     </w:lvl>
-    <w:lvl w:ilvl="4" w:tplc="8BF0DA42">
+    <w:lvl w:ilvl="5" w:tplc="C93A3E06">
       <w:numFmt w:val="decimal"/>
       <w:lvlText w:val=""/>
       <w:lvlJc w:val="left"/>
     </w:lvl>
-    <w:lvl w:ilvl="5" w:tplc="A5181482">
+    <w:lvl w:ilvl="6" w:tplc="DC96135E">
       <w:numFmt w:val="decimal"/>
       <w:lvlText w:val=""/>
       <w:lvlJc w:val="left"/>
     </w:lvl>
-    <w:lvl w:ilvl="6" w:tplc="22C0935C">
+    <w:lvl w:ilvl="7" w:tplc="7D1E62A2">
       <w:numFmt w:val="decimal"/>
       <w:lvlText w:val=""/>
       <w:lvlJc w:val="left"/>
     </w:lvl>
-    <w:lvl w:ilvl="7" w:tplc="ACE677CA">
-      <w:numFmt w:val="decimal"/>
-      <w:lvlText w:val=""/>
-      <w:lvlJc w:val="left"/>
-    </w:lvl>
-    <w:lvl w:ilvl="8" w:tplc="26D2C1F0">
+    <w:lvl w:ilvl="8" w:tplc="3FDA2046">
       <w:numFmt w:val="decimal"/>
       <w:lvlText w:val=""/>
       <w:lvlJc w:val="left"/>
     </w:lvl>
   </w:abstractNum>
   <w:abstractNum w:abstractNumId="3" w15:restartNumberingAfterBreak="0">
-    <w:nsid w:val="45737CD5"/>
+    <w:nsid w:val="2EFE6F7D"/>
     <w:multiLevelType w:val="hybridMultilevel"/>
-    <w:tmpl w:val="93D869FC"/>
-    <w:lvl w:ilvl="0" w:tplc="7FB27412">
+    <w:tmpl w:val="9A924F7E"/>
+    <w:lvl w:ilvl="0" w:tplc="EBAA719E">
       <w:start w:val="1"/>
       <w:numFmt w:val="decimal"/>
       <w:lvlText w:val="%1."/>
@@ -18963,52 +19423,52 @@
         <w:ind w:left="640" w:hanging="360"/>
       </w:pPr>
     </w:lvl>
-    <w:lvl w:ilvl="1" w:tplc="54F4906A">
+    <w:lvl w:ilvl="1" w:tplc="3E489DC6">
       <w:numFmt w:val="decimal"/>
       <w:lvlText w:val=""/>
       <w:lvlJc w:val="left"/>
     </w:lvl>
-    <w:lvl w:ilvl="2" w:tplc="BD98081E">
+    <w:lvl w:ilvl="2" w:tplc="50A2D650">
       <w:numFmt w:val="decimal"/>
       <w:lvlText w:val=""/>
       <w:lvlJc w:val="left"/>
     </w:lvl>
-    <w:lvl w:ilvl="3" w:tplc="CFB0261C">
+    <w:lvl w:ilvl="3" w:tplc="5C104076">
       <w:numFmt w:val="decimal"/>
       <w:lvlText w:val=""/>
       <w:lvlJc w:val="left"/>
     </w:lvl>
-    <w:lvl w:ilvl="4" w:tplc="671AE512">
+    <w:lvl w:ilvl="4" w:tplc="3BC43204">
       <w:numFmt w:val="decimal"/>
       <w:lvlText w:val=""/>
       <w:lvlJc w:val="left"/>
     </w:lvl>
-    <w:lvl w:ilvl="5" w:tplc="71264786">
+    <w:lvl w:ilvl="5" w:tplc="46AA70AE">
       <w:numFmt w:val="decimal"/>
       <w:lvlText w:val=""/>
       <w:lvlJc w:val="left"/>
     </w:lvl>
-    <w:lvl w:ilvl="6" w:tplc="4FC2413E">
+    <w:lvl w:ilvl="6" w:tplc="36C21C9A">
       <w:numFmt w:val="decimal"/>
       <w:lvlText w:val=""/>
       <w:lvlJc w:val="left"/>
     </w:lvl>
-    <w:lvl w:ilvl="7" w:tplc="6EE6E3A8">
+    <w:lvl w:ilvl="7" w:tplc="B4E6803A">
       <w:numFmt w:val="decimal"/>
       <w:lvlText w:val=""/>
       <w:lvlJc w:val="left"/>
     </w:lvl>
-    <w:lvl w:ilvl="8" w:tplc="284A21C8">
+    <w:lvl w:ilvl="8" w:tplc="9698B77C">
       <w:numFmt w:val="decimal"/>
       <w:lvlText w:val=""/>
       <w:lvlJc w:val="left"/>
     </w:lvl>
   </w:abstractNum>
   <w:abstractNum w:abstractNumId="4" w15:restartNumberingAfterBreak="0">
-    <w:nsid w:val="4E2523AF"/>
+    <w:nsid w:val="445E122D"/>
     <w:multiLevelType w:val="hybridMultilevel"/>
-    <w:tmpl w:val="47446B16"/>
-    <w:lvl w:ilvl="0" w:tplc="8FA8C4CE">
+    <w:tmpl w:val="F03A72E6"/>
+    <w:lvl w:ilvl="0" w:tplc="7EEEE060">
       <w:start w:val="1"/>
       <w:numFmt w:val="decimal"/>
       <w:lvlText w:val="%1."/>
@@ -19017,52 +19477,52 @@
         <w:ind w:left="640" w:hanging="360"/>
       </w:pPr>
     </w:lvl>
-    <w:lvl w:ilvl="1" w:tplc="A450FF5C">
+    <w:lvl w:ilvl="1" w:tplc="3C807214">
       <w:numFmt w:val="decimal"/>
       <w:lvlText w:val=""/>
       <w:lvlJc w:val="left"/>
     </w:lvl>
-    <w:lvl w:ilvl="2" w:tplc="3104D21A">
+    <w:lvl w:ilvl="2" w:tplc="CE5C5AEC">
       <w:numFmt w:val="decimal"/>
       <w:lvlText w:val=""/>
       <w:lvlJc w:val="left"/>
     </w:lvl>
-    <w:lvl w:ilvl="3" w:tplc="D714A3C0">
+    <w:lvl w:ilvl="3" w:tplc="9C26D15C">
       <w:numFmt w:val="decimal"/>
       <w:lvlText w:val=""/>
       <w:lvlJc w:val="left"/>
     </w:lvl>
-    <w:lvl w:ilvl="4" w:tplc="8EC464A4">
+    <w:lvl w:ilvl="4" w:tplc="6422C844">
       <w:numFmt w:val="decimal"/>
       <w:lvlText w:val=""/>
       <w:lvlJc w:val="left"/>
     </w:lvl>
-    <w:lvl w:ilvl="5" w:tplc="7CA8D0AE">
+    <w:lvl w:ilvl="5" w:tplc="8D4C1B96">
       <w:numFmt w:val="decimal"/>
       <w:lvlText w:val=""/>
       <w:lvlJc w:val="left"/>
     </w:lvl>
-    <w:lvl w:ilvl="6" w:tplc="4BE04A3A">
+    <w:lvl w:ilvl="6" w:tplc="CCF0BF52">
       <w:numFmt w:val="decimal"/>
       <w:lvlText w:val=""/>
       <w:lvlJc w:val="left"/>
     </w:lvl>
-    <w:lvl w:ilvl="7" w:tplc="09E0423E">
+    <w:lvl w:ilvl="7" w:tplc="2DFEF2B0">
       <w:numFmt w:val="decimal"/>
       <w:lvlText w:val=""/>
       <w:lvlJc w:val="left"/>
     </w:lvl>
-    <w:lvl w:ilvl="8" w:tplc="D7741ACC">
+    <w:lvl w:ilvl="8" w:tplc="0F8CD38E">
       <w:numFmt w:val="decimal"/>
       <w:lvlText w:val=""/>
       <w:lvlJc w:val="left"/>
     </w:lvl>
   </w:abstractNum>
   <w:abstractNum w:abstractNumId="5" w15:restartNumberingAfterBreak="0">
-    <w:nsid w:val="510033D4"/>
+    <w:nsid w:val="4736220E"/>
     <w:multiLevelType w:val="hybridMultilevel"/>
-    <w:tmpl w:val="03D45166"/>
-    <w:lvl w:ilvl="0" w:tplc="4FF84764">
+    <w:tmpl w:val="1D1C2E2C"/>
+    <w:lvl w:ilvl="0" w:tplc="C7385FBC">
       <w:start w:val="1"/>
       <w:numFmt w:val="bullet"/>
       <w:lvlText w:val="●"/>
@@ -19071,7 +19531,7 @@
         <w:ind w:left="720" w:hanging="360"/>
       </w:pPr>
     </w:lvl>
-    <w:lvl w:ilvl="1" w:tplc="5A70CF28">
+    <w:lvl w:ilvl="1" w:tplc="3C6699DE">
       <w:start w:val="1"/>
       <w:numFmt w:val="bullet"/>
       <w:lvlText w:val="○"/>
@@ -19080,7 +19540,7 @@
         <w:ind w:left="1440" w:hanging="360"/>
       </w:pPr>
     </w:lvl>
-    <w:lvl w:ilvl="2" w:tplc="A756232A">
+    <w:lvl w:ilvl="2" w:tplc="42402354">
       <w:start w:val="1"/>
       <w:numFmt w:val="bullet"/>
       <w:lvlText w:val="■"/>
@@ -19089,7 +19549,7 @@
         <w:ind w:left="2160" w:hanging="360"/>
       </w:pPr>
     </w:lvl>
-    <w:lvl w:ilvl="3" w:tplc="525E32D6">
+    <w:lvl w:ilvl="3" w:tplc="CD42149A">
       <w:start w:val="1"/>
       <w:numFmt w:val="bullet"/>
       <w:lvlText w:val="●"/>
@@ -19098,7 +19558,7 @@
         <w:ind w:left="2880" w:hanging="360"/>
       </w:pPr>
     </w:lvl>
-    <w:lvl w:ilvl="4" w:tplc="98B00D1C">
+    <w:lvl w:ilvl="4" w:tplc="B1E4068C">
       <w:start w:val="1"/>
       <w:numFmt w:val="bullet"/>
       <w:lvlText w:val="○"/>
@@ -19107,7 +19567,7 @@
         <w:ind w:left="3600" w:hanging="360"/>
       </w:pPr>
     </w:lvl>
-    <w:lvl w:ilvl="5" w:tplc="54B29FFC">
+    <w:lvl w:ilvl="5" w:tplc="85884122">
       <w:start w:val="1"/>
       <w:numFmt w:val="bullet"/>
       <w:lvlText w:val="■"/>
@@ -19116,7 +19576,7 @@
         <w:ind w:left="4320" w:hanging="360"/>
       </w:pPr>
     </w:lvl>
-    <w:lvl w:ilvl="6" w:tplc="F24E2DBA">
+    <w:lvl w:ilvl="6" w:tplc="2EFCDF08">
       <w:start w:val="1"/>
       <w:numFmt w:val="bullet"/>
       <w:lvlText w:val="●"/>
@@ -19125,7 +19585,7 @@
         <w:ind w:left="5040" w:hanging="360"/>
       </w:pPr>
     </w:lvl>
-    <w:lvl w:ilvl="7" w:tplc="BBA42D68">
+    <w:lvl w:ilvl="7" w:tplc="B276D16C">
       <w:start w:val="1"/>
       <w:numFmt w:val="bullet"/>
       <w:lvlText w:val="●"/>
@@ -19134,7 +19594,7 @@
         <w:ind w:left="5760" w:hanging="360"/>
       </w:pPr>
     </w:lvl>
-    <w:lvl w:ilvl="8" w:tplc="5CF822E4">
+    <w:lvl w:ilvl="8" w:tplc="D61A6620">
       <w:start w:val="1"/>
       <w:numFmt w:val="bullet"/>
       <w:lvlText w:val="●"/>
@@ -19145,10 +19605,10 @@
     </w:lvl>
   </w:abstractNum>
   <w:abstractNum w:abstractNumId="6" w15:restartNumberingAfterBreak="0">
-    <w:nsid w:val="5B8840DC"/>
+    <w:nsid w:val="64C53556"/>
     <w:multiLevelType w:val="hybridMultilevel"/>
-    <w:tmpl w:val="18D0624C"/>
-    <w:lvl w:ilvl="0" w:tplc="9708BAEC">
+    <w:tmpl w:val="B7BC235A"/>
+    <w:lvl w:ilvl="0" w:tplc="8736A682">
       <w:start w:val="1"/>
       <w:numFmt w:val="decimal"/>
       <w:lvlText w:val="%1."/>
@@ -19157,149 +19617,145 @@
         <w:ind w:left="640" w:hanging="360"/>
       </w:pPr>
     </w:lvl>
-    <w:lvl w:ilvl="1" w:tplc="5E2C1834">
+    <w:lvl w:ilvl="1" w:tplc="5E7E9328">
       <w:numFmt w:val="decimal"/>
       <w:lvlText w:val=""/>
       <w:lvlJc w:val="left"/>
     </w:lvl>
-    <w:lvl w:ilvl="2" w:tplc="F44C9DC8">
+    <w:lvl w:ilvl="2" w:tplc="DC7C1BF4">
       <w:numFmt w:val="decimal"/>
       <w:lvlText w:val=""/>
       <w:lvlJc w:val="left"/>
     </w:lvl>
-    <w:lvl w:ilvl="3" w:tplc="9B32418A">
+    <w:lvl w:ilvl="3" w:tplc="EABE024C">
       <w:numFmt w:val="decimal"/>
       <w:lvlText w:val=""/>
       <w:lvlJc w:val="left"/>
     </w:lvl>
-    <w:lvl w:ilvl="4" w:tplc="E0A0115C">
+    <w:lvl w:ilvl="4" w:tplc="9D2E9672">
       <w:numFmt w:val="decimal"/>
       <w:lvlText w:val=""/>
       <w:lvlJc w:val="left"/>
     </w:lvl>
-    <w:lvl w:ilvl="5" w:tplc="571C2DB8">
+    <w:lvl w:ilvl="5" w:tplc="2B4209FA">
       <w:numFmt w:val="decimal"/>
       <w:lvlText w:val=""/>
       <w:lvlJc w:val="left"/>
     </w:lvl>
-    <w:lvl w:ilvl="6" w:tplc="35B493D6">
+    <w:lvl w:ilvl="6" w:tplc="3DEA944E">
       <w:numFmt w:val="decimal"/>
       <w:lvlText w:val=""/>
       <w:lvlJc w:val="left"/>
     </w:lvl>
-    <w:lvl w:ilvl="7" w:tplc="23E0C788">
+    <w:lvl w:ilvl="7" w:tplc="F0CA1E16">
       <w:numFmt w:val="decimal"/>
       <w:lvlText w:val=""/>
       <w:lvlJc w:val="left"/>
     </w:lvl>
-    <w:lvl w:ilvl="8" w:tplc="33CA58F4">
+    <w:lvl w:ilvl="8" w:tplc="BA54A2BA">
       <w:numFmt w:val="decimal"/>
       <w:lvlText w:val=""/>
       <w:lvlJc w:val="left"/>
     </w:lvl>
   </w:abstractNum>
   <w:abstractNum w:abstractNumId="7" w15:restartNumberingAfterBreak="0">
-    <w:nsid w:val="5DBB0A35"/>
+    <w:nsid w:val="68583A13"/>
     <w:multiLevelType w:val="hybridMultilevel"/>
-    <w:tmpl w:val="A342B3E6"/>
-    <w:lvl w:ilvl="0" w:tplc="F506A75E">
+    <w:tmpl w:val="7882A2FA"/>
+    <w:lvl w:ilvl="0" w:tplc="B9929344">
       <w:start w:val="1"/>
-      <w:numFmt w:val="bullet"/>
-      <w:lvlText w:val="•"/>
+      <w:numFmt w:val="decimal"/>
+      <w:lvlText w:val="%1."/>
       <w:lvlJc w:val="left"/>
       <w:pPr>
-        <w:ind w:left="640" w:hanging="320"/>
+        <w:ind w:left="640" w:hanging="360"/>
       </w:pPr>
     </w:lvl>
-    <w:lvl w:ilvl="1" w:tplc="631EE32E">
-      <w:start w:val="1"/>
-      <w:numFmt w:val="bullet"/>
-      <w:lvlText w:val="–"/>
-      <w:lvlJc w:val="left"/>
-      <w:pPr>
-        <w:ind w:left="1100" w:hanging="320"/>
-      </w:pPr>
-    </w:lvl>
-    <w:lvl w:ilvl="2" w:tplc="090A3C02">
+    <w:lvl w:ilvl="1" w:tplc="2E7A7F5A">
       <w:numFmt w:val="decimal"/>
       <w:lvlText w:val=""/>
       <w:lvlJc w:val="left"/>
     </w:lvl>
-    <w:lvl w:ilvl="3" w:tplc="73AADDE8">
+    <w:lvl w:ilvl="2" w:tplc="29200A92">
       <w:numFmt w:val="decimal"/>
       <w:lvlText w:val=""/>
       <w:lvlJc w:val="left"/>
     </w:lvl>
-    <w:lvl w:ilvl="4" w:tplc="97E8154E">
+    <w:lvl w:ilvl="3" w:tplc="F00699E4">
       <w:numFmt w:val="decimal"/>
       <w:lvlText w:val=""/>
       <w:lvlJc w:val="left"/>
     </w:lvl>
-    <w:lvl w:ilvl="5" w:tplc="9B28FC7E">
+    <w:lvl w:ilvl="4" w:tplc="390CCFAE">
       <w:numFmt w:val="decimal"/>
       <w:lvlText w:val=""/>
       <w:lvlJc w:val="left"/>
     </w:lvl>
-    <w:lvl w:ilvl="6" w:tplc="1F242678">
+    <w:lvl w:ilvl="5" w:tplc="05CEFDAA">
       <w:numFmt w:val="decimal"/>
       <w:lvlText w:val=""/>
       <w:lvlJc w:val="left"/>
     </w:lvl>
-    <w:lvl w:ilvl="7" w:tplc="54A838FA">
+    <w:lvl w:ilvl="6" w:tplc="21FC346E">
       <w:numFmt w:val="decimal"/>
       <w:lvlText w:val=""/>
       <w:lvlJc w:val="left"/>
     </w:lvl>
-    <w:lvl w:ilvl="8" w:tplc="60CCE336">
+    <w:lvl w:ilvl="7" w:tplc="DA92B498">
+      <w:numFmt w:val="decimal"/>
+      <w:lvlText w:val=""/>
+      <w:lvlJc w:val="left"/>
+    </w:lvl>
+    <w:lvl w:ilvl="8" w:tplc="B338226A">
       <w:numFmt w:val="decimal"/>
       <w:lvlText w:val=""/>
       <w:lvlJc w:val="left"/>
     </w:lvl>
   </w:abstractNum>
-  <w:num w:numId="1" w16cid:durableId="1067266168">
+  <w:num w:numId="1" w16cid:durableId="1335377671">
     <w:abstractNumId w:val="5"/>
     <w:lvlOverride w:ilvl="0">
       <w:startOverride w:val="1"/>
     </w:lvlOverride>
   </w:num>
-  <w:num w:numId="2" w16cid:durableId="1909539340">
+  <w:num w:numId="2" w16cid:durableId="1940260328">
+    <w:abstractNumId w:val="4"/>
+    <w:lvlOverride w:ilvl="0">
+      <w:startOverride w:val="1"/>
+    </w:lvlOverride>
+  </w:num>
+  <w:num w:numId="3" w16cid:durableId="1418211166">
     <w:abstractNumId w:val="2"/>
     <w:lvlOverride w:ilvl="0">
       <w:startOverride w:val="1"/>
     </w:lvlOverride>
   </w:num>
-  <w:num w:numId="3" w16cid:durableId="1685013217">
+  <w:num w:numId="4" w16cid:durableId="1739204733">
     <w:abstractNumId w:val="7"/>
     <w:lvlOverride w:ilvl="0">
       <w:startOverride w:val="1"/>
     </w:lvlOverride>
   </w:num>
-  <w:num w:numId="4" w16cid:durableId="555313320">
-    <w:abstractNumId w:val="0"/>
-    <w:lvlOverride w:ilvl="0">
-      <w:startOverride w:val="1"/>
-    </w:lvlOverride>
-  </w:num>
-  <w:num w:numId="5" w16cid:durableId="2089303902">
+  <w:num w:numId="5" w16cid:durableId="1213228716">
     <w:abstractNumId w:val="6"/>
     <w:lvlOverride w:ilvl="0">
       <w:startOverride w:val="1"/>
     </w:lvlOverride>
   </w:num>
-  <w:num w:numId="6" w16cid:durableId="1926063766">
-    <w:abstractNumId w:val="4"/>
+  <w:num w:numId="6" w16cid:durableId="1318339751">
+    <w:abstractNumId w:val="3"/>
     <w:lvlOverride w:ilvl="0">
       <w:startOverride w:val="1"/>
     </w:lvlOverride>
   </w:num>
-  <w:num w:numId="7" w16cid:durableId="1136026852">
+  <w:num w:numId="7" w16cid:durableId="592781443">
     <w:abstractNumId w:val="1"/>
     <w:lvlOverride w:ilvl="0">
       <w:startOverride w:val="1"/>
     </w:lvlOverride>
   </w:num>
-  <w:num w:numId="8" w16cid:durableId="810949136">
-    <w:abstractNumId w:val="3"/>
+  <w:num w:numId="8" w16cid:durableId="1127743970">
+    <w:abstractNumId w:val="0"/>
     <w:lvlOverride w:ilvl="0">
       <w:startOverride w:val="1"/>
     </w:lvlOverride>
@@ -19888,7 +20344,7 @@
     <w:autoRedefine/>
     <w:uiPriority w:val="39"/>
     <w:unhideWhenUsed/>
-    <w:rsid w:val="00964171"/>
+    <w:rsid w:val="009C528E"/>
     <w:pPr>
       <w:spacing w:after="100"/>
     </w:pPr>
@@ -19900,7 +20356,7 @@
     <w:autoRedefine/>
     <w:uiPriority w:val="39"/>
     <w:unhideWhenUsed/>
-    <w:rsid w:val="00964171"/>
+    <w:rsid w:val="009C528E"/>
     <w:pPr>
       <w:spacing w:after="100"/>
       <w:ind w:left="260"/>

</xml_diff>

<commit_message>
Sửa/xóa công việc; phân quyền lại: chỉ Quản trị viên được sửa và xóa
- Công việc: trang sửa (tên, mô tả, tiêu chí, người thực hiện, hạn, ưu tiên,
  khối lượng, gỡ/thêm tệp) và xóa kèm trao đổi, tệp.
- Toàn hệ thống: mọi thao tác sửa/xóa chuyển sang requireRole("ADMIN") phía máy
  chủ; nút Sửa/Xóa chỉ hiện với Admin (isAdmin); trang sửa chặn người khác.
- Form lưu theo mã (phòng, lớp, học phần, kế hoạch lớp, bài viết): Quản lý khoa
  chỉ tạo mới, mã đã có thì báo chỉ Quản trị viên được sửa.
- Quản lý khoa giữ quyền tạo mới, duyệt, nghiệm thu, xếp/công bố TKB.
- Cập nhật tài liệu Giai-thich-ma-nguon.docx.

Co-Authored-By: Claude Opus 5.5 <noreply@anthropic.com>
</commit_message>
<xml_diff>
--- a/docs/Giai-thich-ma-nguon.docx
+++ b/docs/Giai-thich-ma-nguon.docx
@@ -126,7 +126,7 @@
     <w:sdt>
       <w:sdtPr>
         <w:alias w:val="Mục lục"/>
-        <w:id w:val="-1994322326"/>
+        <w:id w:val="-148981671"/>
       </w:sdtPr>
       <w:sdtEndPr/>
       <w:sdtContent>
@@ -154,7 +154,7 @@
           <w:r>
             <w:fldChar w:fldCharType="separate"/>
           </w:r>
-          <w:hyperlink w:anchor="_Toc244179370" w:history="1">
+          <w:hyperlink w:anchor="_Toc244180355" w:history="1">
             <w:r>
               <w:rPr>
                 <w:rStyle w:val="Hyperlink"/>
@@ -178,7 +178,7 @@
               <w:rPr>
                 <w:noProof/>
               </w:rPr>
-              <w:instrText xml:space="preserve"> PAGEREF _Toc244179370 \h </w:instrText>
+              <w:instrText xml:space="preserve"> PAGEREF _Toc244180355 \h </w:instrText>
             </w:r>
             <w:r>
               <w:rPr>
@@ -220,7 +220,7 @@
               <w14:ligatures w14:val="standardContextual"/>
             </w:rPr>
           </w:pPr>
-          <w:hyperlink w:anchor="_Toc244179371" w:history="1">
+          <w:hyperlink w:anchor="_Toc244180356" w:history="1">
             <w:r>
               <w:rPr>
                 <w:rStyle w:val="Hyperlink"/>
@@ -244,7 +244,7 @@
               <w:rPr>
                 <w:noProof/>
               </w:rPr>
-              <w:instrText xml:space="preserve"> PAGEREF _Toc244179371 \h </w:instrText>
+              <w:instrText xml:space="preserve"> PAGEREF _Toc244180356 \h </w:instrText>
             </w:r>
             <w:r>
               <w:rPr>
@@ -286,7 +286,7 @@
               <w14:ligatures w14:val="standardContextual"/>
             </w:rPr>
           </w:pPr>
-          <w:hyperlink w:anchor="_Toc244179372" w:history="1">
+          <w:hyperlink w:anchor="_Toc244180357" w:history="1">
             <w:r>
               <w:rPr>
                 <w:rStyle w:val="Hyperlink"/>
@@ -310,7 +310,7 @@
               <w:rPr>
                 <w:noProof/>
               </w:rPr>
-              <w:instrText xml:space="preserve"> PAGEREF _Toc244179372 \h </w:instrText>
+              <w:instrText xml:space="preserve"> PAGEREF _Toc244180357 \h </w:instrText>
             </w:r>
             <w:r>
               <w:rPr>
@@ -352,7 +352,7 @@
               <w14:ligatures w14:val="standardContextual"/>
             </w:rPr>
           </w:pPr>
-          <w:hyperlink w:anchor="_Toc244179373" w:history="1">
+          <w:hyperlink w:anchor="_Toc244180358" w:history="1">
             <w:r>
               <w:rPr>
                 <w:rStyle w:val="Hyperlink"/>
@@ -376,7 +376,7 @@
               <w:rPr>
                 <w:noProof/>
               </w:rPr>
-              <w:instrText xml:space="preserve"> PAGEREF _Toc244179373 \h </w:instrText>
+              <w:instrText xml:space="preserve"> PAGEREF _Toc244180358 \h </w:instrText>
             </w:r>
             <w:r>
               <w:rPr>
@@ -418,7 +418,7 @@
               <w14:ligatures w14:val="standardContextual"/>
             </w:rPr>
           </w:pPr>
-          <w:hyperlink w:anchor="_Toc244179374" w:history="1">
+          <w:hyperlink w:anchor="_Toc244180359" w:history="1">
             <w:r>
               <w:rPr>
                 <w:rStyle w:val="Hyperlink"/>
@@ -442,7 +442,7 @@
               <w:rPr>
                 <w:noProof/>
               </w:rPr>
-              <w:instrText xml:space="preserve"> PAGEREF _Toc244179374 \h </w:instrText>
+              <w:instrText xml:space="preserve"> PAGEREF _Toc244180359 \h </w:instrText>
             </w:r>
             <w:r>
               <w:rPr>
@@ -484,7 +484,7 @@
               <w14:ligatures w14:val="standardContextual"/>
             </w:rPr>
           </w:pPr>
-          <w:hyperlink w:anchor="_Toc244179375" w:history="1">
+          <w:hyperlink w:anchor="_Toc244180360" w:history="1">
             <w:r>
               <w:rPr>
                 <w:rStyle w:val="Hyperlink"/>
@@ -508,7 +508,7 @@
               <w:rPr>
                 <w:noProof/>
               </w:rPr>
-              <w:instrText xml:space="preserve"> PAGEREF _Toc244179375 \h </w:instrText>
+              <w:instrText xml:space="preserve"> PAGEREF _Toc244180360 \h </w:instrText>
             </w:r>
             <w:r>
               <w:rPr>
@@ -550,7 +550,7 @@
               <w14:ligatures w14:val="standardContextual"/>
             </w:rPr>
           </w:pPr>
-          <w:hyperlink w:anchor="_Toc244179376" w:history="1">
+          <w:hyperlink w:anchor="_Toc244180361" w:history="1">
             <w:r>
               <w:rPr>
                 <w:rStyle w:val="Hyperlink"/>
@@ -574,7 +574,7 @@
               <w:rPr>
                 <w:noProof/>
               </w:rPr>
-              <w:instrText xml:space="preserve"> PAGEREF _Toc244179376 \h </w:instrText>
+              <w:instrText xml:space="preserve"> PAGEREF _Toc244180361 \h </w:instrText>
             </w:r>
             <w:r>
               <w:rPr>
@@ -616,7 +616,7 @@
               <w14:ligatures w14:val="standardContextual"/>
             </w:rPr>
           </w:pPr>
-          <w:hyperlink w:anchor="_Toc244179377" w:history="1">
+          <w:hyperlink w:anchor="_Toc244180362" w:history="1">
             <w:r>
               <w:rPr>
                 <w:rStyle w:val="Hyperlink"/>
@@ -640,7 +640,7 @@
               <w:rPr>
                 <w:noProof/>
               </w:rPr>
-              <w:instrText xml:space="preserve"> PAGEREF _Toc244179377 \h </w:instrText>
+              <w:instrText xml:space="preserve"> PAGEREF _Toc244180362 \h </w:instrText>
             </w:r>
             <w:r>
               <w:rPr>
@@ -682,7 +682,7 @@
               <w14:ligatures w14:val="standardContextual"/>
             </w:rPr>
           </w:pPr>
-          <w:hyperlink w:anchor="_Toc244179378" w:history="1">
+          <w:hyperlink w:anchor="_Toc244180363" w:history="1">
             <w:r>
               <w:rPr>
                 <w:rStyle w:val="Hyperlink"/>
@@ -706,7 +706,7 @@
               <w:rPr>
                 <w:noProof/>
               </w:rPr>
-              <w:instrText xml:space="preserve"> PAGEREF _Toc244179378 \h </w:instrText>
+              <w:instrText xml:space="preserve"> PAGEREF _Toc244180363 \h </w:instrText>
             </w:r>
             <w:r>
               <w:rPr>
@@ -748,7 +748,7 @@
               <w14:ligatures w14:val="standardContextual"/>
             </w:rPr>
           </w:pPr>
-          <w:hyperlink w:anchor="_Toc244179379" w:history="1">
+          <w:hyperlink w:anchor="_Toc244180364" w:history="1">
             <w:r>
               <w:rPr>
                 <w:rStyle w:val="Hyperlink"/>
@@ -772,7 +772,7 @@
               <w:rPr>
                 <w:noProof/>
               </w:rPr>
-              <w:instrText xml:space="preserve"> PAGEREF _Toc244179379 \h </w:instrText>
+              <w:instrText xml:space="preserve"> PAGEREF _Toc244180364 \h </w:instrText>
             </w:r>
             <w:r>
               <w:rPr>
@@ -814,7 +814,7 @@
               <w14:ligatures w14:val="standardContextual"/>
             </w:rPr>
           </w:pPr>
-          <w:hyperlink w:anchor="_Toc244179380" w:history="1">
+          <w:hyperlink w:anchor="_Toc244180365" w:history="1">
             <w:r>
               <w:rPr>
                 <w:rStyle w:val="Hyperlink"/>
@@ -838,7 +838,7 @@
               <w:rPr>
                 <w:noProof/>
               </w:rPr>
-              <w:instrText xml:space="preserve"> PAGEREF _Toc244179380 \h </w:instrText>
+              <w:instrText xml:space="preserve"> PAGEREF _Toc244180365 \h </w:instrText>
             </w:r>
             <w:r>
               <w:rPr>
@@ -880,7 +880,7 @@
               <w14:ligatures w14:val="standardContextual"/>
             </w:rPr>
           </w:pPr>
-          <w:hyperlink w:anchor="_Toc244179381" w:history="1">
+          <w:hyperlink w:anchor="_Toc244180366" w:history="1">
             <w:r>
               <w:rPr>
                 <w:rStyle w:val="Hyperlink"/>
@@ -904,7 +904,7 @@
               <w:rPr>
                 <w:noProof/>
               </w:rPr>
-              <w:instrText xml:space="preserve"> PAGEREF _Toc244179381 \h </w:instrText>
+              <w:instrText xml:space="preserve"> PAGEREF _Toc244180366 \h </w:instrText>
             </w:r>
             <w:r>
               <w:rPr>
@@ -921,7 +921,7 @@
               <w:rPr>
                 <w:noProof/>
               </w:rPr>
-              <w:t>8</w:t>
+              <w:t>9</w:t>
             </w:r>
             <w:r>
               <w:rPr>
@@ -946,7 +946,7 @@
               <w14:ligatures w14:val="standardContextual"/>
             </w:rPr>
           </w:pPr>
-          <w:hyperlink w:anchor="_Toc244179382" w:history="1">
+          <w:hyperlink w:anchor="_Toc244180367" w:history="1">
             <w:r>
               <w:rPr>
                 <w:rStyle w:val="Hyperlink"/>
@@ -970,7 +970,7 @@
               <w:rPr>
                 <w:noProof/>
               </w:rPr>
-              <w:instrText xml:space="preserve"> PAGEREF _Toc244179382 \h </w:instrText>
+              <w:instrText xml:space="preserve"> PAGEREF _Toc244180367 \h </w:instrText>
             </w:r>
             <w:r>
               <w:rPr>
@@ -1012,7 +1012,7 @@
               <w14:ligatures w14:val="standardContextual"/>
             </w:rPr>
           </w:pPr>
-          <w:hyperlink w:anchor="_Toc244179383" w:history="1">
+          <w:hyperlink w:anchor="_Toc244180368" w:history="1">
             <w:r>
               <w:rPr>
                 <w:rStyle w:val="Hyperlink"/>
@@ -1036,7 +1036,7 @@
               <w:rPr>
                 <w:noProof/>
               </w:rPr>
-              <w:instrText xml:space="preserve"> PAGEREF _Toc244179383 \h </w:instrText>
+              <w:instrText xml:space="preserve"> PAGEREF _Toc244180368 \h </w:instrText>
             </w:r>
             <w:r>
               <w:rPr>
@@ -1078,7 +1078,7 @@
               <w14:ligatures w14:val="standardContextual"/>
             </w:rPr>
           </w:pPr>
-          <w:hyperlink w:anchor="_Toc244179384" w:history="1">
+          <w:hyperlink w:anchor="_Toc244180369" w:history="1">
             <w:r>
               <w:rPr>
                 <w:rStyle w:val="Hyperlink"/>
@@ -1102,7 +1102,7 @@
               <w:rPr>
                 <w:noProof/>
               </w:rPr>
-              <w:instrText xml:space="preserve"> PAGEREF _Toc244179384 \h </w:instrText>
+              <w:instrText xml:space="preserve"> PAGEREF _Toc244180369 \h </w:instrText>
             </w:r>
             <w:r>
               <w:rPr>
@@ -1144,7 +1144,7 @@
               <w14:ligatures w14:val="standardContextual"/>
             </w:rPr>
           </w:pPr>
-          <w:hyperlink w:anchor="_Toc244179385" w:history="1">
+          <w:hyperlink w:anchor="_Toc244180370" w:history="1">
             <w:r>
               <w:rPr>
                 <w:rStyle w:val="Hyperlink"/>
@@ -1168,7 +1168,7 @@
               <w:rPr>
                 <w:noProof/>
               </w:rPr>
-              <w:instrText xml:space="preserve"> PAGEREF _Toc244179385 \h </w:instrText>
+              <w:instrText xml:space="preserve"> PAGEREF _Toc244180370 \h </w:instrText>
             </w:r>
             <w:r>
               <w:rPr>
@@ -1210,7 +1210,7 @@
               <w14:ligatures w14:val="standardContextual"/>
             </w:rPr>
           </w:pPr>
-          <w:hyperlink w:anchor="_Toc244179386" w:history="1">
+          <w:hyperlink w:anchor="_Toc244180371" w:history="1">
             <w:r>
               <w:rPr>
                 <w:rStyle w:val="Hyperlink"/>
@@ -1234,7 +1234,7 @@
               <w:rPr>
                 <w:noProof/>
               </w:rPr>
-              <w:instrText xml:space="preserve"> PAGEREF _Toc244179386 \h </w:instrText>
+              <w:instrText xml:space="preserve"> PAGEREF _Toc244180371 \h </w:instrText>
             </w:r>
             <w:r>
               <w:rPr>
@@ -1276,7 +1276,7 @@
               <w14:ligatures w14:val="standardContextual"/>
             </w:rPr>
           </w:pPr>
-          <w:hyperlink w:anchor="_Toc244179387" w:history="1">
+          <w:hyperlink w:anchor="_Toc244180372" w:history="1">
             <w:r>
               <w:rPr>
                 <w:rStyle w:val="Hyperlink"/>
@@ -1300,7 +1300,7 @@
               <w:rPr>
                 <w:noProof/>
               </w:rPr>
-              <w:instrText xml:space="preserve"> PAGEREF _Toc244179387 \h </w:instrText>
+              <w:instrText xml:space="preserve"> PAGEREF _Toc244180372 \h </w:instrText>
             </w:r>
             <w:r>
               <w:rPr>
@@ -1342,7 +1342,7 @@
               <w14:ligatures w14:val="standardContextual"/>
             </w:rPr>
           </w:pPr>
-          <w:hyperlink w:anchor="_Toc244179388" w:history="1">
+          <w:hyperlink w:anchor="_Toc244180373" w:history="1">
             <w:r>
               <w:rPr>
                 <w:rStyle w:val="Hyperlink"/>
@@ -1366,7 +1366,7 @@
               <w:rPr>
                 <w:noProof/>
               </w:rPr>
-              <w:instrText xml:space="preserve"> PAGEREF _Toc244179388 \h </w:instrText>
+              <w:instrText xml:space="preserve"> PAGEREF _Toc244180373 \h </w:instrText>
             </w:r>
             <w:r>
               <w:rPr>
@@ -1408,7 +1408,7 @@
               <w14:ligatures w14:val="standardContextual"/>
             </w:rPr>
           </w:pPr>
-          <w:hyperlink w:anchor="_Toc244179389" w:history="1">
+          <w:hyperlink w:anchor="_Toc244180374" w:history="1">
             <w:r>
               <w:rPr>
                 <w:rStyle w:val="Hyperlink"/>
@@ -1432,7 +1432,7 @@
               <w:rPr>
                 <w:noProof/>
               </w:rPr>
-              <w:instrText xml:space="preserve"> PAGEREF _Toc244179389 \h </w:instrText>
+              <w:instrText xml:space="preserve"> PAGEREF _Toc244180374 \h </w:instrText>
             </w:r>
             <w:r>
               <w:rPr>
@@ -1474,7 +1474,7 @@
               <w14:ligatures w14:val="standardContextual"/>
             </w:rPr>
           </w:pPr>
-          <w:hyperlink w:anchor="_Toc244179390" w:history="1">
+          <w:hyperlink w:anchor="_Toc244180375" w:history="1">
             <w:r>
               <w:rPr>
                 <w:rStyle w:val="Hyperlink"/>
@@ -1498,7 +1498,7 @@
               <w:rPr>
                 <w:noProof/>
               </w:rPr>
-              <w:instrText xml:space="preserve"> PAGEREF _Toc244179390 \h </w:instrText>
+              <w:instrText xml:space="preserve"> PAGEREF _Toc244180375 \h </w:instrText>
             </w:r>
             <w:r>
               <w:rPr>
@@ -1540,7 +1540,7 @@
               <w14:ligatures w14:val="standardContextual"/>
             </w:rPr>
           </w:pPr>
-          <w:hyperlink w:anchor="_Toc244179391" w:history="1">
+          <w:hyperlink w:anchor="_Toc244180376" w:history="1">
             <w:r>
               <w:rPr>
                 <w:rStyle w:val="Hyperlink"/>
@@ -1564,7 +1564,7 @@
               <w:rPr>
                 <w:noProof/>
               </w:rPr>
-              <w:instrText xml:space="preserve"> PAGEREF _Toc244179391 \h </w:instrText>
+              <w:instrText xml:space="preserve"> PAGEREF _Toc244180376 \h </w:instrText>
             </w:r>
             <w:r>
               <w:rPr>
@@ -1606,7 +1606,7 @@
               <w14:ligatures w14:val="standardContextual"/>
             </w:rPr>
           </w:pPr>
-          <w:hyperlink w:anchor="_Toc244179392" w:history="1">
+          <w:hyperlink w:anchor="_Toc244180377" w:history="1">
             <w:r>
               <w:rPr>
                 <w:rStyle w:val="Hyperlink"/>
@@ -1630,7 +1630,7 @@
               <w:rPr>
                 <w:noProof/>
               </w:rPr>
-              <w:instrText xml:space="preserve"> PAGEREF _Toc244179392 \h </w:instrText>
+              <w:instrText xml:space="preserve"> PAGEREF _Toc244180377 \h </w:instrText>
             </w:r>
             <w:r>
               <w:rPr>
@@ -1672,7 +1672,7 @@
               <w14:ligatures w14:val="standardContextual"/>
             </w:rPr>
           </w:pPr>
-          <w:hyperlink w:anchor="_Toc244179393" w:history="1">
+          <w:hyperlink w:anchor="_Toc244180378" w:history="1">
             <w:r>
               <w:rPr>
                 <w:rStyle w:val="Hyperlink"/>
@@ -1696,7 +1696,7 @@
               <w:rPr>
                 <w:noProof/>
               </w:rPr>
-              <w:instrText xml:space="preserve"> PAGEREF _Toc244179393 \h </w:instrText>
+              <w:instrText xml:space="preserve"> PAGEREF _Toc244180378 \h </w:instrText>
             </w:r>
             <w:r>
               <w:rPr>
@@ -1738,7 +1738,7 @@
               <w14:ligatures w14:val="standardContextual"/>
             </w:rPr>
           </w:pPr>
-          <w:hyperlink w:anchor="_Toc244179394" w:history="1">
+          <w:hyperlink w:anchor="_Toc244180379" w:history="1">
             <w:r>
               <w:rPr>
                 <w:rStyle w:val="Hyperlink"/>
@@ -1762,7 +1762,7 @@
               <w:rPr>
                 <w:noProof/>
               </w:rPr>
-              <w:instrText xml:space="preserve"> PAGEREF _Toc244179394 \h </w:instrText>
+              <w:instrText xml:space="preserve"> PAGEREF _Toc244180379 \h </w:instrText>
             </w:r>
             <w:r>
               <w:rPr>
@@ -1804,7 +1804,7 @@
               <w14:ligatures w14:val="standardContextual"/>
             </w:rPr>
           </w:pPr>
-          <w:hyperlink w:anchor="_Toc244179395" w:history="1">
+          <w:hyperlink w:anchor="_Toc244180380" w:history="1">
             <w:r>
               <w:rPr>
                 <w:rStyle w:val="Hyperlink"/>
@@ -1828,7 +1828,7 @@
               <w:rPr>
                 <w:noProof/>
               </w:rPr>
-              <w:instrText xml:space="preserve"> PAGEREF _Toc244179395 \h </w:instrText>
+              <w:instrText xml:space="preserve"> PAGEREF _Toc244180380 \h </w:instrText>
             </w:r>
             <w:r>
               <w:rPr>
@@ -1870,7 +1870,7 @@
               <w14:ligatures w14:val="standardContextual"/>
             </w:rPr>
           </w:pPr>
-          <w:hyperlink w:anchor="_Toc244179396" w:history="1">
+          <w:hyperlink w:anchor="_Toc244180381" w:history="1">
             <w:r>
               <w:rPr>
                 <w:rStyle w:val="Hyperlink"/>
@@ -1894,7 +1894,7 @@
               <w:rPr>
                 <w:noProof/>
               </w:rPr>
-              <w:instrText xml:space="preserve"> PAGEREF _Toc244179396 \h </w:instrText>
+              <w:instrText xml:space="preserve"> PAGEREF _Toc244180381 \h </w:instrText>
             </w:r>
             <w:r>
               <w:rPr>
@@ -1936,7 +1936,7 @@
               <w14:ligatures w14:val="standardContextual"/>
             </w:rPr>
           </w:pPr>
-          <w:hyperlink w:anchor="_Toc244179397" w:history="1">
+          <w:hyperlink w:anchor="_Toc244180382" w:history="1">
             <w:r>
               <w:rPr>
                 <w:rStyle w:val="Hyperlink"/>
@@ -1960,7 +1960,7 @@
               <w:rPr>
                 <w:noProof/>
               </w:rPr>
-              <w:instrText xml:space="preserve"> PAGEREF _Toc244179397 \h </w:instrText>
+              <w:instrText xml:space="preserve"> PAGEREF _Toc244180382 \h </w:instrText>
             </w:r>
             <w:r>
               <w:rPr>
@@ -2002,7 +2002,7 @@
               <w14:ligatures w14:val="standardContextual"/>
             </w:rPr>
           </w:pPr>
-          <w:hyperlink w:anchor="_Toc244179398" w:history="1">
+          <w:hyperlink w:anchor="_Toc244180383" w:history="1">
             <w:r>
               <w:rPr>
                 <w:rStyle w:val="Hyperlink"/>
@@ -2026,7 +2026,7 @@
               <w:rPr>
                 <w:noProof/>
               </w:rPr>
-              <w:instrText xml:space="preserve"> PAGEREF _Toc244179398 \h </w:instrText>
+              <w:instrText xml:space="preserve"> PAGEREF _Toc244180383 \h </w:instrText>
             </w:r>
             <w:r>
               <w:rPr>
@@ -2068,7 +2068,7 @@
               <w14:ligatures w14:val="standardContextual"/>
             </w:rPr>
           </w:pPr>
-          <w:hyperlink w:anchor="_Toc244179399" w:history="1">
+          <w:hyperlink w:anchor="_Toc244180384" w:history="1">
             <w:r>
               <w:rPr>
                 <w:rStyle w:val="Hyperlink"/>
@@ -2092,7 +2092,7 @@
               <w:rPr>
                 <w:noProof/>
               </w:rPr>
-              <w:instrText xml:space="preserve"> PAGEREF _Toc244179399 \h </w:instrText>
+              <w:instrText xml:space="preserve"> PAGEREF _Toc244180384 \h </w:instrText>
             </w:r>
             <w:r>
               <w:rPr>
@@ -2134,7 +2134,7 @@
               <w14:ligatures w14:val="standardContextual"/>
             </w:rPr>
           </w:pPr>
-          <w:hyperlink w:anchor="_Toc244179400" w:history="1">
+          <w:hyperlink w:anchor="_Toc244180385" w:history="1">
             <w:r>
               <w:rPr>
                 <w:rStyle w:val="Hyperlink"/>
@@ -2158,7 +2158,7 @@
               <w:rPr>
                 <w:noProof/>
               </w:rPr>
-              <w:instrText xml:space="preserve"> PAGEREF _Toc244179400 \h </w:instrText>
+              <w:instrText xml:space="preserve"> PAGEREF _Toc244180385 \h </w:instrText>
             </w:r>
             <w:r>
               <w:rPr>
@@ -2200,7 +2200,7 @@
               <w14:ligatures w14:val="standardContextual"/>
             </w:rPr>
           </w:pPr>
-          <w:hyperlink w:anchor="_Toc244179401" w:history="1">
+          <w:hyperlink w:anchor="_Toc244180386" w:history="1">
             <w:r>
               <w:rPr>
                 <w:rStyle w:val="Hyperlink"/>
@@ -2224,7 +2224,7 @@
               <w:rPr>
                 <w:noProof/>
               </w:rPr>
-              <w:instrText xml:space="preserve"> PAGEREF _Toc244179401 \h </w:instrText>
+              <w:instrText xml:space="preserve"> PAGEREF _Toc244180386 \h </w:instrText>
             </w:r>
             <w:r>
               <w:rPr>
@@ -2266,7 +2266,7 @@
               <w14:ligatures w14:val="standardContextual"/>
             </w:rPr>
           </w:pPr>
-          <w:hyperlink w:anchor="_Toc244179402" w:history="1">
+          <w:hyperlink w:anchor="_Toc244180387" w:history="1">
             <w:r>
               <w:rPr>
                 <w:rStyle w:val="Hyperlink"/>
@@ -2290,7 +2290,7 @@
               <w:rPr>
                 <w:noProof/>
               </w:rPr>
-              <w:instrText xml:space="preserve"> PAGEREF _Toc244179402 \h </w:instrText>
+              <w:instrText xml:space="preserve"> PAGEREF _Toc244180387 \h </w:instrText>
             </w:r>
             <w:r>
               <w:rPr>
@@ -2332,7 +2332,7 @@
               <w14:ligatures w14:val="standardContextual"/>
             </w:rPr>
           </w:pPr>
-          <w:hyperlink w:anchor="_Toc244179403" w:history="1">
+          <w:hyperlink w:anchor="_Toc244180388" w:history="1">
             <w:r>
               <w:rPr>
                 <w:rStyle w:val="Hyperlink"/>
@@ -2356,7 +2356,7 @@
               <w:rPr>
                 <w:noProof/>
               </w:rPr>
-              <w:instrText xml:space="preserve"> PAGEREF _Toc244179403 \h </w:instrText>
+              <w:instrText xml:space="preserve"> PAGEREF _Toc244180388 \h </w:instrText>
             </w:r>
             <w:r>
               <w:rPr>
@@ -2398,7 +2398,7 @@
               <w14:ligatures w14:val="standardContextual"/>
             </w:rPr>
           </w:pPr>
-          <w:hyperlink w:anchor="_Toc244179404" w:history="1">
+          <w:hyperlink w:anchor="_Toc244180389" w:history="1">
             <w:r>
               <w:rPr>
                 <w:rStyle w:val="Hyperlink"/>
@@ -2422,7 +2422,7 @@
               <w:rPr>
                 <w:noProof/>
               </w:rPr>
-              <w:instrText xml:space="preserve"> PAGEREF _Toc244179404 \h </w:instrText>
+              <w:instrText xml:space="preserve"> PAGEREF _Toc244180389 \h </w:instrText>
             </w:r>
             <w:r>
               <w:rPr>
@@ -2464,7 +2464,7 @@
               <w14:ligatures w14:val="standardContextual"/>
             </w:rPr>
           </w:pPr>
-          <w:hyperlink w:anchor="_Toc244179405" w:history="1">
+          <w:hyperlink w:anchor="_Toc244180390" w:history="1">
             <w:r>
               <w:rPr>
                 <w:rStyle w:val="Hyperlink"/>
@@ -2488,7 +2488,7 @@
               <w:rPr>
                 <w:noProof/>
               </w:rPr>
-              <w:instrText xml:space="preserve"> PAGEREF _Toc244179405 \h </w:instrText>
+              <w:instrText xml:space="preserve"> PAGEREF _Toc244180390 \h </w:instrText>
             </w:r>
             <w:r>
               <w:rPr>
@@ -2530,7 +2530,7 @@
               <w14:ligatures w14:val="standardContextual"/>
             </w:rPr>
           </w:pPr>
-          <w:hyperlink w:anchor="_Toc244179406" w:history="1">
+          <w:hyperlink w:anchor="_Toc244180391" w:history="1">
             <w:r>
               <w:rPr>
                 <w:rStyle w:val="Hyperlink"/>
@@ -2554,7 +2554,7 @@
               <w:rPr>
                 <w:noProof/>
               </w:rPr>
-              <w:instrText xml:space="preserve"> PAGEREF _Toc244179406 \h </w:instrText>
+              <w:instrText xml:space="preserve"> PAGEREF _Toc244180391 \h </w:instrText>
             </w:r>
             <w:r>
               <w:rPr>
@@ -2596,7 +2596,7 @@
               <w14:ligatures w14:val="standardContextual"/>
             </w:rPr>
           </w:pPr>
-          <w:hyperlink w:anchor="_Toc244179407" w:history="1">
+          <w:hyperlink w:anchor="_Toc244180392" w:history="1">
             <w:r>
               <w:rPr>
                 <w:rStyle w:val="Hyperlink"/>
@@ -2620,7 +2620,7 @@
               <w:rPr>
                 <w:noProof/>
               </w:rPr>
-              <w:instrText xml:space="preserve"> PAGEREF _Toc244179407 \h </w:instrText>
+              <w:instrText xml:space="preserve"> PAGEREF _Toc244180392 \h </w:instrText>
             </w:r>
             <w:r>
               <w:rPr>
@@ -2662,7 +2662,7 @@
               <w14:ligatures w14:val="standardContextual"/>
             </w:rPr>
           </w:pPr>
-          <w:hyperlink w:anchor="_Toc244179408" w:history="1">
+          <w:hyperlink w:anchor="_Toc244180393" w:history="1">
             <w:r>
               <w:rPr>
                 <w:rStyle w:val="Hyperlink"/>
@@ -2686,7 +2686,7 @@
               <w:rPr>
                 <w:noProof/>
               </w:rPr>
-              <w:instrText xml:space="preserve"> PAGEREF _Toc244179408 \h </w:instrText>
+              <w:instrText xml:space="preserve"> PAGEREF _Toc244180393 \h </w:instrText>
             </w:r>
             <w:r>
               <w:rPr>
@@ -2728,7 +2728,7 @@
               <w14:ligatures w14:val="standardContextual"/>
             </w:rPr>
           </w:pPr>
-          <w:hyperlink w:anchor="_Toc244179409" w:history="1">
+          <w:hyperlink w:anchor="_Toc244180394" w:history="1">
             <w:r>
               <w:rPr>
                 <w:rStyle w:val="Hyperlink"/>
@@ -2752,7 +2752,7 @@
               <w:rPr>
                 <w:noProof/>
               </w:rPr>
-              <w:instrText xml:space="preserve"> PAGEREF _Toc244179409 \h </w:instrText>
+              <w:instrText xml:space="preserve"> PAGEREF _Toc244180394 \h </w:instrText>
             </w:r>
             <w:r>
               <w:rPr>
@@ -2794,7 +2794,7 @@
               <w14:ligatures w14:val="standardContextual"/>
             </w:rPr>
           </w:pPr>
-          <w:hyperlink w:anchor="_Toc244179410" w:history="1">
+          <w:hyperlink w:anchor="_Toc244180395" w:history="1">
             <w:r>
               <w:rPr>
                 <w:rStyle w:val="Hyperlink"/>
@@ -2818,7 +2818,7 @@
               <w:rPr>
                 <w:noProof/>
               </w:rPr>
-              <w:instrText xml:space="preserve"> PAGEREF _Toc244179410 \h </w:instrText>
+              <w:instrText xml:space="preserve"> PAGEREF _Toc244180395 \h </w:instrText>
             </w:r>
             <w:r>
               <w:rPr>
@@ -2860,7 +2860,7 @@
               <w14:ligatures w14:val="standardContextual"/>
             </w:rPr>
           </w:pPr>
-          <w:hyperlink w:anchor="_Toc244179411" w:history="1">
+          <w:hyperlink w:anchor="_Toc244180396" w:history="1">
             <w:r>
               <w:rPr>
                 <w:rStyle w:val="Hyperlink"/>
@@ -2884,7 +2884,7 @@
               <w:rPr>
                 <w:noProof/>
               </w:rPr>
-              <w:instrText xml:space="preserve"> PAGEREF _Toc244179411 \h </w:instrText>
+              <w:instrText xml:space="preserve"> PAGEREF _Toc244180396 \h </w:instrText>
             </w:r>
             <w:r>
               <w:rPr>
@@ -2926,7 +2926,7 @@
               <w14:ligatures w14:val="standardContextual"/>
             </w:rPr>
           </w:pPr>
-          <w:hyperlink w:anchor="_Toc244179412" w:history="1">
+          <w:hyperlink w:anchor="_Toc244180397" w:history="1">
             <w:r>
               <w:rPr>
                 <w:rStyle w:val="Hyperlink"/>
@@ -2950,7 +2950,7 @@
               <w:rPr>
                 <w:noProof/>
               </w:rPr>
-              <w:instrText xml:space="preserve"> PAGEREF _Toc244179412 \h </w:instrText>
+              <w:instrText xml:space="preserve"> PAGEREF _Toc244180397 \h </w:instrText>
             </w:r>
             <w:r>
               <w:rPr>
@@ -2992,7 +2992,7 @@
               <w14:ligatures w14:val="standardContextual"/>
             </w:rPr>
           </w:pPr>
-          <w:hyperlink w:anchor="_Toc244179413" w:history="1">
+          <w:hyperlink w:anchor="_Toc244180398" w:history="1">
             <w:r>
               <w:rPr>
                 <w:rStyle w:val="Hyperlink"/>
@@ -3016,7 +3016,7 @@
               <w:rPr>
                 <w:noProof/>
               </w:rPr>
-              <w:instrText xml:space="preserve"> PAGEREF _Toc244179413 \h </w:instrText>
+              <w:instrText xml:space="preserve"> PAGEREF _Toc244180398 \h </w:instrText>
             </w:r>
             <w:r>
               <w:rPr>
@@ -3058,7 +3058,7 @@
               <w14:ligatures w14:val="standardContextual"/>
             </w:rPr>
           </w:pPr>
-          <w:hyperlink w:anchor="_Toc244179414" w:history="1">
+          <w:hyperlink w:anchor="_Toc244180399" w:history="1">
             <w:r>
               <w:rPr>
                 <w:rStyle w:val="Hyperlink"/>
@@ -3082,7 +3082,7 @@
               <w:rPr>
                 <w:noProof/>
               </w:rPr>
-              <w:instrText xml:space="preserve"> PAGEREF _Toc244179414 \h </w:instrText>
+              <w:instrText xml:space="preserve"> PAGEREF _Toc244180399 \h </w:instrText>
             </w:r>
             <w:r>
               <w:rPr>
@@ -3124,7 +3124,7 @@
               <w14:ligatures w14:val="standardContextual"/>
             </w:rPr>
           </w:pPr>
-          <w:hyperlink w:anchor="_Toc244179415" w:history="1">
+          <w:hyperlink w:anchor="_Toc244180400" w:history="1">
             <w:r>
               <w:rPr>
                 <w:rStyle w:val="Hyperlink"/>
@@ -3148,7 +3148,7 @@
               <w:rPr>
                 <w:noProof/>
               </w:rPr>
-              <w:instrText xml:space="preserve"> PAGEREF _Toc244179415 \h </w:instrText>
+              <w:instrText xml:space="preserve"> PAGEREF _Toc244180400 \h </w:instrText>
             </w:r>
             <w:r>
               <w:rPr>
@@ -3190,7 +3190,7 @@
               <w14:ligatures w14:val="standardContextual"/>
             </w:rPr>
           </w:pPr>
-          <w:hyperlink w:anchor="_Toc244179416" w:history="1">
+          <w:hyperlink w:anchor="_Toc244180401" w:history="1">
             <w:r>
               <w:rPr>
                 <w:rStyle w:val="Hyperlink"/>
@@ -3214,7 +3214,7 @@
               <w:rPr>
                 <w:noProof/>
               </w:rPr>
-              <w:instrText xml:space="preserve"> PAGEREF _Toc244179416 \h </w:instrText>
+              <w:instrText xml:space="preserve"> PAGEREF _Toc244180401 \h </w:instrText>
             </w:r>
             <w:r>
               <w:rPr>
@@ -3256,7 +3256,7 @@
               <w14:ligatures w14:val="standardContextual"/>
             </w:rPr>
           </w:pPr>
-          <w:hyperlink w:anchor="_Toc244179417" w:history="1">
+          <w:hyperlink w:anchor="_Toc244180402" w:history="1">
             <w:r>
               <w:rPr>
                 <w:rStyle w:val="Hyperlink"/>
@@ -3280,7 +3280,7 @@
               <w:rPr>
                 <w:noProof/>
               </w:rPr>
-              <w:instrText xml:space="preserve"> PAGEREF _Toc244179417 \h </w:instrText>
+              <w:instrText xml:space="preserve"> PAGEREF _Toc244180402 \h </w:instrText>
             </w:r>
             <w:r>
               <w:rPr>
@@ -3322,7 +3322,7 @@
               <w14:ligatures w14:val="standardContextual"/>
             </w:rPr>
           </w:pPr>
-          <w:hyperlink w:anchor="_Toc244179418" w:history="1">
+          <w:hyperlink w:anchor="_Toc244180403" w:history="1">
             <w:r>
               <w:rPr>
                 <w:rStyle w:val="Hyperlink"/>
@@ -3346,7 +3346,7 @@
               <w:rPr>
                 <w:noProof/>
               </w:rPr>
-              <w:instrText xml:space="preserve"> PAGEREF _Toc244179418 \h </w:instrText>
+              <w:instrText xml:space="preserve"> PAGEREF _Toc244180403 \h </w:instrText>
             </w:r>
             <w:r>
               <w:rPr>
@@ -3418,7 +3418,7 @@
         <w:pStyle w:val="Heading1"/>
         <w:pageBreakBefore/>
       </w:pPr>
-      <w:bookmarkStart w:id="0" w:name="_Toc244179370"/>
+      <w:bookmarkStart w:id="0" w:name="_Toc244180355"/>
       <w:r>
         <w:lastRenderedPageBreak/>
         <w:t>1. Tổng quan hệ thống</w:t>
@@ -3429,7 +3429,7 @@
       <w:pPr>
         <w:pStyle w:val="Heading2"/>
       </w:pPr>
-      <w:bookmarkStart w:id="1" w:name="_Toc244179371"/>
+      <w:bookmarkStart w:id="1" w:name="_Toc244180356"/>
       <w:r>
         <w:t>1.1. Mục đích</w:t>
       </w:r>
@@ -4236,7 +4236,7 @@
       <w:pPr>
         <w:pStyle w:val="Heading2"/>
       </w:pPr>
-      <w:bookmarkStart w:id="2" w:name="_Toc244179372"/>
+      <w:bookmarkStart w:id="2" w:name="_Toc244180357"/>
       <w:r>
         <w:t>1.2. Công nghệ sử dụng</w:t>
       </w:r>
@@ -4958,7 +4958,7 @@
       <w:pPr>
         <w:pStyle w:val="Heading2"/>
       </w:pPr>
-      <w:bookmarkStart w:id="3" w:name="_Toc244179373"/>
+      <w:bookmarkStart w:id="3" w:name="_Toc244180358"/>
       <w:r>
         <w:t>1.3. Kiến trúc và luồng xử lý một yêu cầu</w:t>
       </w:r>
@@ -5211,7 +5211,7 @@
       <w:pPr>
         <w:pStyle w:val="Heading2"/>
       </w:pPr>
-      <w:bookmarkStart w:id="4" w:name="_Toc244179374"/>
+      <w:bookmarkStart w:id="4" w:name="_Toc244180359"/>
       <w:r>
         <w:t>1.4. Cấu trúc thư mục</w:t>
       </w:r>
@@ -6037,7 +6037,7 @@
         <w:pStyle w:val="Heading1"/>
         <w:pageBreakBefore/>
       </w:pPr>
-      <w:bookmarkStart w:id="5" w:name="_Toc244179375"/>
+      <w:bookmarkStart w:id="5" w:name="_Toc244180360"/>
       <w:r>
         <w:lastRenderedPageBreak/>
         <w:t>2. Nền tảng dùng chung</w:t>
@@ -6048,7 +6048,7 @@
       <w:pPr>
         <w:pStyle w:val="Heading2"/>
       </w:pPr>
-      <w:bookmarkStart w:id="6" w:name="_Toc244179376"/>
+      <w:bookmarkStart w:id="6" w:name="_Toc244180361"/>
       <w:r>
         <w:t>2.1. Cơ sở dữ liệu (Prisma)</w:t>
       </w:r>
@@ -6979,7 +6979,7 @@
       <w:pPr>
         <w:pStyle w:val="Heading2"/>
       </w:pPr>
-      <w:bookmarkStart w:id="7" w:name="_Toc244179377"/>
+      <w:bookmarkStart w:id="7" w:name="_Toc244180362"/>
       <w:r>
         <w:t>2.2. Đăng nhập và phiên làm việc</w:t>
       </w:r>
@@ -7901,7 +7901,7 @@
       <w:pPr>
         <w:pStyle w:val="Heading2"/>
       </w:pPr>
-      <w:bookmarkStart w:id="8" w:name="_Toc244179378"/>
+      <w:bookmarkStart w:id="8" w:name="_Toc244180363"/>
       <w:r>
         <w:t>2.3. Phân quyền</w:t>
       </w:r>
@@ -8066,7 +8066,23 @@
                 <w:sz w:val="22"/>
                 <w:szCs w:val="22"/>
               </w:rPr>
-              <w:t>Toàn quyền, thêm mã quyền quản lý người dùng (tạo, khóa, đổi vai trò, đặt lại mật khẩu)</w:t>
+              <w:t xml:space="preserve">Toàn quyền; là vai trò DUY NHẤT được </w:t>
+            </w:r>
+            <w:r>
+              <w:rPr>
+                <w:b/>
+                <w:bCs/>
+                <w:sz w:val="22"/>
+                <w:szCs w:val="22"/>
+              </w:rPr>
+              <w:t>sửa và xóa</w:t>
+            </w:r>
+            <w:r>
+              <w:rPr>
+                <w:sz w:val="22"/>
+                <w:szCs w:val="22"/>
+              </w:rPr>
+              <w:t xml:space="preserve"> dữ liệu trên toàn hệ thống; quản lý người dùng (tạo, sửa, khóa, xóa, đặt lại mật khẩu)</w:t>
             </w:r>
           </w:p>
         </w:tc>
@@ -8134,7 +8150,23 @@
                 <w:sz w:val="22"/>
                 <w:szCs w:val="22"/>
               </w:rPr>
-              <w:t>Đăng văn bản; quản lý thiết bị, duyệt mượn, kiểm kê; tạo đợt và duyệt minh chứng; quản lý TKB; giao việc, nghiệm thu, xem hiệu suất toàn Khoa; quản lý kho tri thức</w:t>
+              <w:t xml:space="preserve">Tạo mới: đăng văn bản, thêm thiết bị, tạo đợt minh chứng, giao việc, thêm bài viết, nhập dữ liệu nền TKB. Nghiệp vụ: duyệt mượn, kiểm kê, duyệt minh chứng, nghiệm thu, xếp/chỉnh tay/công bố TKB, xem hiệu suất toàn Khoa. </w:t>
+            </w:r>
+            <w:r>
+              <w:rPr>
+                <w:b/>
+                <w:bCs/>
+                <w:sz w:val="22"/>
+                <w:szCs w:val="22"/>
+              </w:rPr>
+              <w:t>Không</w:t>
+            </w:r>
+            <w:r>
+              <w:rPr>
+                <w:sz w:val="22"/>
+                <w:szCs w:val="22"/>
+              </w:rPr>
+              <w:t xml:space="preserve"> được sửa hay xóa</w:t>
             </w:r>
           </w:p>
         </w:tc>
@@ -8208,50 +8240,29 @@
     </w:tbl>
     <w:p>
       <w:pPr>
+        <w:pStyle w:val="Heading3"/>
+      </w:pPr>
+      <w:r>
+        <w:t>Quy tắc: chỉ Quản trị viên được sửa và xóa</w:t>
+      </w:r>
+    </w:p>
+    <w:p>
+      <w:pPr>
         <w:spacing w:after="120" w:line="300" w:lineRule="auto"/>
         <w:jc w:val="both"/>
       </w:pPr>
       <w:r>
-        <w:rPr>
-          <w:rFonts w:ascii="Consolas" w:eastAsia="Consolas" w:hAnsi="Consolas" w:cs="Consolas"/>
-          <w:color w:val="1D4ED8"/>
-          <w:sz w:val="21"/>
-          <w:szCs w:val="21"/>
-        </w:rPr>
-        <w:t>requireRole("MANAGER")</w:t>
-      </w:r>
-      <w:r>
-        <w:t xml:space="preserve"> cho phép Quản lý khoa </w:t>
+        <w:t xml:space="preserve">Mọi thao tác sửa/xóa (văn bản, danh mục, đợt và tiêu chí minh chứng, thiết bị kể cả trạng thái, bài viết kho tri thức, phòng/lớp/học phần/kế hoạch/phân công, phiên bản TKB, công việc, người dùng) được bảo vệ ở </w:t>
       </w:r>
       <w:r>
         <w:rPr>
           <w:b/>
           <w:bCs/>
         </w:rPr>
-        <w:t>và</w:t>
-      </w:r>
-      <w:r>
-        <w:t xml:space="preserve"> Quản trị viên (Admin luôn được phép). Các quy tắc chi tiết như "ai được duyệt minh chứng ở trạng thái nào" tập trung ở </w:t>
-      </w:r>
-      <w:r>
-        <w:rPr>
-          <w:rFonts w:ascii="Consolas" w:eastAsia="Consolas" w:hAnsi="Consolas" w:cs="Consolas"/>
-          <w:color w:val="1D4ED8"/>
-          <w:sz w:val="21"/>
-          <w:szCs w:val="21"/>
-        </w:rPr>
-        <w:t>src/lib/permissions.ts</w:t>
-      </w:r>
-      <w:r>
-        <w:t>.</w:t>
-      </w:r>
-    </w:p>
-    <w:p>
-      <w:pPr>
-        <w:pStyle w:val="Heading3"/>
-      </w:pPr>
-      <w:r>
-        <w:t>Quản lý người dùng (src/app/(portal)/nguoi-dung)</w:t>
+        <w:t>hai lớp</w:t>
+      </w:r>
+      <w:r>
+        <w:t>:</w:t>
       </w:r>
     </w:p>
     <w:p>
@@ -8264,7 +8275,26 @@
         <w:spacing w:after="60" w:line="288" w:lineRule="auto"/>
       </w:pPr>
       <w:r>
-        <w:t>Quản trị viên tạo tài khoản, đổi vai trò, khóa/mở khóa, đặt lại mật khẩu về mặc định.</w:t>
+        <w:rPr>
+          <w:b/>
+          <w:bCs/>
+        </w:rPr>
+        <w:t>Máy chủ</w:t>
+      </w:r>
+      <w:r>
+        <w:t xml:space="preserve">: các server action sửa/xóa gọi </w:t>
+      </w:r>
+      <w:r>
+        <w:rPr>
+          <w:rFonts w:ascii="Consolas" w:eastAsia="Consolas" w:hAnsi="Consolas" w:cs="Consolas"/>
+          <w:color w:val="1D4ED8"/>
+          <w:sz w:val="21"/>
+          <w:szCs w:val="21"/>
+        </w:rPr>
+        <w:t>requireRole("ADMIN")</w:t>
+      </w:r>
+      <w:r>
+        <w:t>; các form "lưu" dạng tạo-hoặc-cập-nhật theo mã (phòng, lớp, học phần, kế hoạch lớp, bài viết) chỉ cho Quản lý khoa TẠO mới – nếu mã đã tồn tại thì báo "chỉ Quản trị viên được sửa".</w:t>
       </w:r>
     </w:p>
     <w:p>
@@ -8281,10 +8311,10 @@
           <w:b/>
           <w:bCs/>
         </w:rPr>
-        <w:t>Sửa</w:t>
-      </w:r>
-      <w:r>
-        <w:t xml:space="preserve"> (</w:t>
+        <w:t>Giao diện</w:t>
+      </w:r>
+      <w:r>
+        <w:t xml:space="preserve">: hàm </w:t>
       </w:r>
       <w:r>
         <w:rPr>
@@ -8293,10 +8323,10 @@
           <w:sz w:val="21"/>
           <w:szCs w:val="21"/>
         </w:rPr>
-        <w:t>nguoi-dung/[id]</w:t>
-      </w:r>
-      <w:r>
-        <w:t xml:space="preserve">, action </w:t>
+        <w:t>isAdmin(user)</w:t>
+      </w:r>
+      <w:r>
+        <w:t xml:space="preserve"> (trong </w:t>
       </w:r>
       <w:r>
         <w:rPr>
@@ -8305,10 +8335,80 @@
           <w:sz w:val="21"/>
           <w:szCs w:val="21"/>
         </w:rPr>
-        <w:t>updateUserInfo</w:t>
-      </w:r>
-      <w:r>
-        <w:t>): họ tên, email đăng nhập (kiểm tra trùng), vai trò, học hàm, điện thoại, chuyên môn. Không thể tự đổi vai trò của chính mình.</w:t>
+        <w:t>src/lib/auth.ts</w:t>
+      </w:r>
+      <w:r>
+        <w:t>) quyết định có hiện nút Sửa/Xóa; trang sửa (</w:t>
+      </w:r>
+      <w:r>
+        <w:rPr>
+          <w:rFonts w:ascii="Consolas" w:eastAsia="Consolas" w:hAnsi="Consolas" w:cs="Consolas"/>
+          <w:color w:val="1D4ED8"/>
+          <w:sz w:val="21"/>
+          <w:szCs w:val="21"/>
+        </w:rPr>
+        <w:t>…/sua</w:t>
+      </w:r>
+      <w:r>
+        <w:t>) chuyển người không phải Admin sang trang "Không có quyền truy cập".</w:t>
+      </w:r>
+    </w:p>
+    <w:p>
+      <w:pPr>
+        <w:spacing w:after="120" w:line="300" w:lineRule="auto"/>
+        <w:jc w:val="both"/>
+      </w:pPr>
+      <w:r>
+        <w:lastRenderedPageBreak/>
+        <w:t>Các thao tác nghiệp vụ không phải sửa/xóa bản ghi vẫn giữ nguyên quyền: Quản lý khoa duyệt, nghiệm thu, công bố/hủy công bố và chỉnh tay buổi học khi xếp lịch; giảng viên ký nhận, nộp/nộp lại minh chứng, cập nhật hồ sơ cá nhân của mình.</w:t>
+      </w:r>
+    </w:p>
+    <w:p>
+      <w:pPr>
+        <w:spacing w:after="120" w:line="300" w:lineRule="auto"/>
+        <w:jc w:val="both"/>
+      </w:pPr>
+      <w:r>
+        <w:rPr>
+          <w:rFonts w:ascii="Consolas" w:eastAsia="Consolas" w:hAnsi="Consolas" w:cs="Consolas"/>
+          <w:color w:val="1D4ED8"/>
+          <w:sz w:val="21"/>
+          <w:szCs w:val="21"/>
+        </w:rPr>
+        <w:t>requireRole("MANAGER")</w:t>
+      </w:r>
+      <w:r>
+        <w:t xml:space="preserve"> cho phép Quản lý khoa </w:t>
+      </w:r>
+      <w:r>
+        <w:rPr>
+          <w:b/>
+          <w:bCs/>
+        </w:rPr>
+        <w:t>và</w:t>
+      </w:r>
+      <w:r>
+        <w:t xml:space="preserve"> Quản trị viên (Admin luôn được phép). Các quy tắc chi tiết như "ai được duyệt minh chứng ở trạng thái nào" tập trung ở </w:t>
+      </w:r>
+      <w:r>
+        <w:rPr>
+          <w:rFonts w:ascii="Consolas" w:eastAsia="Consolas" w:hAnsi="Consolas" w:cs="Consolas"/>
+          <w:color w:val="1D4ED8"/>
+          <w:sz w:val="21"/>
+          <w:szCs w:val="21"/>
+        </w:rPr>
+        <w:t>src/lib/permissions.ts</w:t>
+      </w:r>
+      <w:r>
+        <w:t>.</w:t>
+      </w:r>
+    </w:p>
+    <w:p>
+      <w:pPr>
+        <w:pStyle w:val="Heading3"/>
+      </w:pPr>
+      <w:r>
+        <w:t>Quản lý người dùng (src/app/(portal)/nguoi-dung)</w:t>
       </w:r>
     </w:p>
     <w:p>
@@ -8321,99 +8421,7 @@
         <w:spacing w:after="60" w:line="288" w:lineRule="auto"/>
       </w:pPr>
       <w:r>
-        <w:rPr>
-          <w:b/>
-          <w:bCs/>
-        </w:rPr>
-        <w:t>Xóa</w:t>
-      </w:r>
-      <w:r>
-        <w:t xml:space="preserve"> (</w:t>
-      </w:r>
-      <w:r>
-        <w:rPr>
-          <w:rFonts w:ascii="Consolas" w:eastAsia="Consolas" w:hAnsi="Consolas" w:cs="Consolas"/>
-          <w:color w:val="1D4ED8"/>
-          <w:sz w:val="21"/>
-          <w:szCs w:val="21"/>
-        </w:rPr>
-        <w:t>deleteUser</w:t>
-      </w:r>
-      <w:r>
-        <w:t xml:space="preserve">): chỉ xóa được tài khoản </w:t>
-      </w:r>
-      <w:r>
-        <w:rPr>
-          <w:b/>
-          <w:bCs/>
-        </w:rPr>
-        <w:t>chưa phát sinh dữ liệu</w:t>
-      </w:r>
-      <w:r>
-        <w:t xml:space="preserve">. Nếu tài khoản đã có văn bản, minh chứng, lịch sử duyệt, công việc, lượt mượn, phân công… hệ thống liệt kê cụ thể và đề nghị dùng </w:t>
-      </w:r>
-      <w:r>
-        <w:rPr>
-          <w:b/>
-          <w:bCs/>
-        </w:rPr>
-        <w:t>Khóa</w:t>
-      </w:r>
-      <w:r>
-        <w:t xml:space="preserve"> để giữ nguyên lịch sử. Không thể tự xóa chính mình.</w:t>
-      </w:r>
-    </w:p>
-    <w:p>
-      <w:pPr>
-        <w:spacing w:after="120" w:line="300" w:lineRule="auto"/>
-        <w:jc w:val="both"/>
-      </w:pPr>
-      <w:r>
-        <w:lastRenderedPageBreak/>
-        <w:t xml:space="preserve">Trước đây hệ thống có 2 vai trò Trưởng khoa (HEAD) và Trợ lý khoa (ASSISTANT); nay đã gộp thành Quản lý khoa. Hàm </w:t>
-      </w:r>
-      <w:r>
-        <w:rPr>
-          <w:rFonts w:ascii="Consolas" w:eastAsia="Consolas" w:hAnsi="Consolas" w:cs="Consolas"/>
-          <w:color w:val="1D4ED8"/>
-          <w:sz w:val="21"/>
-          <w:szCs w:val="21"/>
-        </w:rPr>
-        <w:t>normalizeRole()</w:t>
-      </w:r>
-      <w:r>
-        <w:t xml:space="preserve"> tự quy đổi giá trị cũ còn sót trong CSDL, và script </w:t>
-      </w:r>
-      <w:r>
-        <w:rPr>
-          <w:rFonts w:ascii="Consolas" w:eastAsia="Consolas" w:hAnsi="Consolas" w:cs="Consolas"/>
-          <w:color w:val="1D4ED8"/>
-          <w:sz w:val="21"/>
-          <w:szCs w:val="21"/>
-        </w:rPr>
-        <w:t>scripts/migrate-data.ts</w:t>
-      </w:r>
-      <w:r>
-        <w:t xml:space="preserve"> chuyển hẳn dữ liệu.</w:t>
-      </w:r>
-    </w:p>
-    <w:p>
-      <w:pPr>
-        <w:pStyle w:val="Heading2"/>
-      </w:pPr>
-      <w:bookmarkStart w:id="9" w:name="_Toc244179379"/>
-      <w:r>
-        <w:t>2.4. Server Action, form và thông báo</w:t>
-      </w:r>
-      <w:bookmarkEnd w:id="9"/>
-    </w:p>
-    <w:p>
-      <w:pPr>
-        <w:spacing w:after="120" w:line="300" w:lineRule="auto"/>
-        <w:jc w:val="both"/>
-      </w:pPr>
-      <w:r>
-        <w:t>Mọi form ghi dữ liệu dùng chung một khuôn mẫu:</w:t>
+        <w:t>Quản trị viên tạo tài khoản, đổi vai trò, khóa/mở khóa, đặt lại mật khẩu về mặc định.</w:t>
       </w:r>
     </w:p>
     <w:p>
@@ -8427,15 +8435,25 @@
       </w:pPr>
       <w:r>
         <w:rPr>
+          <w:b/>
+          <w:bCs/>
+        </w:rPr>
+        <w:t>Sửa</w:t>
+      </w:r>
+      <w:r>
+        <w:t xml:space="preserve"> (</w:t>
+      </w:r>
+      <w:r>
+        <w:rPr>
           <w:rFonts w:ascii="Consolas" w:eastAsia="Consolas" w:hAnsi="Consolas" w:cs="Consolas"/>
           <w:color w:val="1D4ED8"/>
           <w:sz w:val="21"/>
           <w:szCs w:val="21"/>
         </w:rPr>
-        <w:t>src/lib/action-state.ts</w:t>
-      </w:r>
-      <w:r>
-        <w:t xml:space="preserve">: kiểu kết quả </w:t>
+        <w:t>nguoi-dung/[id]</w:t>
+      </w:r>
+      <w:r>
+        <w:t xml:space="preserve">, action </w:t>
       </w:r>
       <w:r>
         <w:rPr>
@@ -8444,22 +8462,10 @@
           <w:sz w:val="21"/>
           <w:szCs w:val="21"/>
         </w:rPr>
-        <w:t>{ ok, message }</w:t>
-      </w:r>
-      <w:r>
-        <w:t xml:space="preserve"> và hàm </w:t>
-      </w:r>
-      <w:r>
-        <w:rPr>
-          <w:rFonts w:ascii="Consolas" w:eastAsia="Consolas" w:hAnsi="Consolas" w:cs="Consolas"/>
-          <w:color w:val="1D4ED8"/>
-          <w:sz w:val="21"/>
-          <w:szCs w:val="21"/>
-        </w:rPr>
-        <w:t>attempt()</w:t>
-      </w:r>
-      <w:r>
-        <w:t xml:space="preserve"> – bọc action, bắt lỗi rồi trả thông báo tiếng Việt thay vì làm sập trang.</w:t>
+        <w:t>updateUserInfo</w:t>
+      </w:r>
+      <w:r>
+        <w:t>): họ tên, email đăng nhập (kiểm tra trùng), vai trò, học hàm, điện thoại, chuyên môn. Không thể tự đổi vai trò của chính mình.</w:t>
       </w:r>
     </w:p>
     <w:p>
@@ -8473,15 +8479,54 @@
       </w:pPr>
       <w:r>
         <w:rPr>
+          <w:b/>
+          <w:bCs/>
+        </w:rPr>
+        <w:t>Xóa</w:t>
+      </w:r>
+      <w:r>
+        <w:t xml:space="preserve"> (</w:t>
+      </w:r>
+      <w:r>
+        <w:rPr>
           <w:rFonts w:ascii="Consolas" w:eastAsia="Consolas" w:hAnsi="Consolas" w:cs="Consolas"/>
           <w:color w:val="1D4ED8"/>
           <w:sz w:val="21"/>
           <w:szCs w:val="21"/>
         </w:rPr>
-        <w:t>ActionForm</w:t>
-      </w:r>
-      <w:r>
-        <w:t xml:space="preserve"> (</w:t>
+        <w:t>deleteUser</w:t>
+      </w:r>
+      <w:r>
+        <w:t xml:space="preserve">): chỉ xóa được tài khoản </w:t>
+      </w:r>
+      <w:r>
+        <w:rPr>
+          <w:b/>
+          <w:bCs/>
+        </w:rPr>
+        <w:t>chưa phát sinh dữ liệu</w:t>
+      </w:r>
+      <w:r>
+        <w:t xml:space="preserve">. Nếu tài khoản đã có văn bản, minh chứng, lịch sử duyệt, công việc, lượt mượn, phân công… hệ thống liệt kê cụ thể và đề nghị dùng </w:t>
+      </w:r>
+      <w:r>
+        <w:rPr>
+          <w:b/>
+          <w:bCs/>
+        </w:rPr>
+        <w:t>Khóa</w:t>
+      </w:r>
+      <w:r>
+        <w:t xml:space="preserve"> để giữ nguyên lịch sử. Không thể tự xóa chính mình.</w:t>
+      </w:r>
+    </w:p>
+    <w:p>
+      <w:pPr>
+        <w:spacing w:after="120" w:line="300" w:lineRule="auto"/>
+        <w:jc w:val="both"/>
+      </w:pPr>
+      <w:r>
+        <w:t xml:space="preserve">Trước đây hệ thống có 2 vai trò Trưởng khoa (HEAD) và Trợ lý khoa (ASSISTANT); nay đã gộp thành Quản lý khoa. Hàm </w:t>
       </w:r>
       <w:r>
         <w:rPr>
@@ -8490,10 +8535,10 @@
           <w:sz w:val="21"/>
           <w:szCs w:val="21"/>
         </w:rPr>
-        <w:t>src/components/forms.tsx</w:t>
-      </w:r>
-      <w:r>
-        <w:t xml:space="preserve">): form gọi action qua </w:t>
+        <w:t>normalizeRole()</w:t>
+      </w:r>
+      <w:r>
+        <w:t xml:space="preserve"> tự quy đổi giá trị cũ còn sót trong CSDL, và script </w:t>
       </w:r>
       <w:r>
         <w:rPr>
@@ -8502,10 +8547,29 @@
           <w:sz w:val="21"/>
           <w:szCs w:val="21"/>
         </w:rPr>
-        <w:t>useActionState</w:t>
-      </w:r>
-      <w:r>
-        <w:t>, tự hiện hộp thông báo xanh/đỏ, tự xóa nội dung khi thành công.</w:t>
+        <w:t>scripts/migrate-data.ts</w:t>
+      </w:r>
+      <w:r>
+        <w:t xml:space="preserve"> chuyển hẳn dữ liệu.</w:t>
+      </w:r>
+    </w:p>
+    <w:p>
+      <w:pPr>
+        <w:pStyle w:val="Heading2"/>
+      </w:pPr>
+      <w:bookmarkStart w:id="9" w:name="_Toc244180364"/>
+      <w:r>
+        <w:t>2.4. Server Action, form và thông báo</w:t>
+      </w:r>
+      <w:bookmarkEnd w:id="9"/>
+    </w:p>
+    <w:p>
+      <w:pPr>
+        <w:spacing w:after="120" w:line="300" w:lineRule="auto"/>
+        <w:jc w:val="both"/>
+      </w:pPr>
+      <w:r>
+        <w:t>Mọi form ghi dữ liệu dùng chung một khuôn mẫu:</w:t>
       </w:r>
     </w:p>
     <w:p>
@@ -8524,10 +8588,10 @@
           <w:sz w:val="21"/>
           <w:szCs w:val="21"/>
         </w:rPr>
-        <w:t>SubmitButton</w:t>
-      </w:r>
-      <w:r>
-        <w:t>: hiện vòng quay "Đang xử lý…" và khóa nút khi đang gửi; hỗ trợ hỏi xác nhận (</w:t>
+        <w:t>src/lib/action-state.ts</w:t>
+      </w:r>
+      <w:r>
+        <w:t xml:space="preserve">: kiểu kết quả </w:t>
       </w:r>
       <w:r>
         <w:rPr>
@@ -8536,10 +8600,22 @@
           <w:sz w:val="21"/>
           <w:szCs w:val="21"/>
         </w:rPr>
-        <w:t>confirm</w:t>
-      </w:r>
-      <w:r>
-        <w:t>).</w:t>
+        <w:t>{ ok, message }</w:t>
+      </w:r>
+      <w:r>
+        <w:t xml:space="preserve"> và hàm </w:t>
+      </w:r>
+      <w:r>
+        <w:rPr>
+          <w:rFonts w:ascii="Consolas" w:eastAsia="Consolas" w:hAnsi="Consolas" w:cs="Consolas"/>
+          <w:color w:val="1D4ED8"/>
+          <w:sz w:val="21"/>
+          <w:szCs w:val="21"/>
+        </w:rPr>
+        <w:t>attempt()</w:t>
+      </w:r>
+      <w:r>
+        <w:t xml:space="preserve"> – bọc action, bắt lỗi rồi trả thông báo tiếng Việt thay vì làm sập trang.</w:t>
       </w:r>
     </w:p>
     <w:p>
@@ -8558,6 +8634,86 @@
           <w:sz w:val="21"/>
           <w:szCs w:val="21"/>
         </w:rPr>
+        <w:t>ActionForm</w:t>
+      </w:r>
+      <w:r>
+        <w:t xml:space="preserve"> (</w:t>
+      </w:r>
+      <w:r>
+        <w:rPr>
+          <w:rFonts w:ascii="Consolas" w:eastAsia="Consolas" w:hAnsi="Consolas" w:cs="Consolas"/>
+          <w:color w:val="1D4ED8"/>
+          <w:sz w:val="21"/>
+          <w:szCs w:val="21"/>
+        </w:rPr>
+        <w:t>src/components/forms.tsx</w:t>
+      </w:r>
+      <w:r>
+        <w:t xml:space="preserve">): form gọi action qua </w:t>
+      </w:r>
+      <w:r>
+        <w:rPr>
+          <w:rFonts w:ascii="Consolas" w:eastAsia="Consolas" w:hAnsi="Consolas" w:cs="Consolas"/>
+          <w:color w:val="1D4ED8"/>
+          <w:sz w:val="21"/>
+          <w:szCs w:val="21"/>
+        </w:rPr>
+        <w:t>useActionState</w:t>
+      </w:r>
+      <w:r>
+        <w:t>, tự hiện hộp thông báo xanh/đỏ, tự xóa nội dung khi thành công.</w:t>
+      </w:r>
+    </w:p>
+    <w:p>
+      <w:pPr>
+        <w:pStyle w:val="ListParagraph"/>
+        <w:numPr>
+          <w:ilvl w:val="0"/>
+          <w:numId w:val="3"/>
+        </w:numPr>
+        <w:spacing w:after="60" w:line="288" w:lineRule="auto"/>
+      </w:pPr>
+      <w:r>
+        <w:rPr>
+          <w:rFonts w:ascii="Consolas" w:eastAsia="Consolas" w:hAnsi="Consolas" w:cs="Consolas"/>
+          <w:color w:val="1D4ED8"/>
+          <w:sz w:val="21"/>
+          <w:szCs w:val="21"/>
+        </w:rPr>
+        <w:t>SubmitButton</w:t>
+      </w:r>
+      <w:r>
+        <w:t>: hiện vòng quay "Đang xử lý…" và khóa nút khi đang gửi; hỗ trợ hỏi xác nhận (</w:t>
+      </w:r>
+      <w:r>
+        <w:rPr>
+          <w:rFonts w:ascii="Consolas" w:eastAsia="Consolas" w:hAnsi="Consolas" w:cs="Consolas"/>
+          <w:color w:val="1D4ED8"/>
+          <w:sz w:val="21"/>
+          <w:szCs w:val="21"/>
+        </w:rPr>
+        <w:t>confirm</w:t>
+      </w:r>
+      <w:r>
+        <w:t>).</w:t>
+      </w:r>
+    </w:p>
+    <w:p>
+      <w:pPr>
+        <w:pStyle w:val="ListParagraph"/>
+        <w:numPr>
+          <w:ilvl w:val="0"/>
+          <w:numId w:val="3"/>
+        </w:numPr>
+        <w:spacing w:after="60" w:line="288" w:lineRule="auto"/>
+      </w:pPr>
+      <w:r>
+        <w:rPr>
+          <w:rFonts w:ascii="Consolas" w:eastAsia="Consolas" w:hAnsi="Consolas" w:cs="Consolas"/>
+          <w:color w:val="1D4ED8"/>
+          <w:sz w:val="21"/>
+          <w:szCs w:val="21"/>
+        </w:rPr>
         <w:t>DeleteButton</w:t>
       </w:r>
       <w:r>
@@ -8615,7 +8771,7 @@
       <w:pPr>
         <w:pStyle w:val="Heading2"/>
       </w:pPr>
-      <w:bookmarkStart w:id="10" w:name="_Toc244179380"/>
+      <w:bookmarkStart w:id="10" w:name="_Toc244180365"/>
       <w:r>
         <w:t>2.5. Tệp đính kèm</w:t>
       </w:r>
@@ -8633,6 +8789,7 @@
           <w:sz w:val="21"/>
           <w:szCs w:val="21"/>
         </w:rPr>
+        <w:lastRenderedPageBreak/>
         <w:t>src/lib/uploads.ts</w:t>
       </w:r>
       <w:r>
@@ -8698,7 +8855,7 @@
       <w:pPr>
         <w:pStyle w:val="Heading2"/>
       </w:pPr>
-      <w:bookmarkStart w:id="11" w:name="_Toc244179381"/>
+      <w:bookmarkStart w:id="11" w:name="_Toc244180366"/>
       <w:r>
         <w:t>2.6. Giao diện chung</w:t>
       </w:r>
@@ -8832,7 +8989,6 @@
           <w:sz w:val="21"/>
           <w:szCs w:val="21"/>
         </w:rPr>
-        <w:lastRenderedPageBreak/>
         <w:t>src/lib/constants.ts</w:t>
       </w:r>
       <w:r>
@@ -8844,7 +9000,7 @@
         <w:pStyle w:val="Heading1"/>
         <w:pageBreakBefore/>
       </w:pPr>
-      <w:bookmarkStart w:id="12" w:name="_Toc244179382"/>
+      <w:bookmarkStart w:id="12" w:name="_Toc244180367"/>
       <w:r>
         <w:lastRenderedPageBreak/>
         <w:t>3. Module 1 – Văn bản &amp; Thông báo</w:t>
@@ -9280,7 +9436,7 @@
       <w:pPr>
         <w:pStyle w:val="Heading2"/>
       </w:pPr>
-      <w:bookmarkStart w:id="13" w:name="_Toc244179383"/>
+      <w:bookmarkStart w:id="13" w:name="_Toc244180368"/>
       <w:r>
         <w:t>3.1. Cơ chế đọc và ký nhận</w:t>
       </w:r>
@@ -9409,7 +9565,7 @@
       <w:pPr>
         <w:pStyle w:val="Heading2"/>
       </w:pPr>
-      <w:bookmarkStart w:id="14" w:name="_Toc244179384"/>
+      <w:bookmarkStart w:id="14" w:name="_Toc244180369"/>
       <w:r>
         <w:t>3.2. Sửa, xóa văn bản và danh mục</w:t>
       </w:r>
@@ -9545,7 +9701,7 @@
         <w:pStyle w:val="Heading1"/>
         <w:pageBreakBefore/>
       </w:pPr>
-      <w:bookmarkStart w:id="15" w:name="_Toc244179385"/>
+      <w:bookmarkStart w:id="15" w:name="_Toc244180370"/>
       <w:r>
         <w:lastRenderedPageBreak/>
         <w:t>4. Module 2 – Trang thiết bị</w:t>
@@ -10267,7 +10423,7 @@
       <w:pPr>
         <w:pStyle w:val="Heading2"/>
       </w:pPr>
-      <w:bookmarkStart w:id="16" w:name="_Toc244179386"/>
+      <w:bookmarkStart w:id="16" w:name="_Toc244180371"/>
       <w:r>
         <w:t>4.1. Thêm, sửa, xóa thiết bị</w:t>
       </w:r>
@@ -10381,7 +10537,7 @@
       <w:pPr>
         <w:pStyle w:val="Heading2"/>
       </w:pPr>
-      <w:bookmarkStart w:id="17" w:name="_Toc244179387"/>
+      <w:bookmarkStart w:id="17" w:name="_Toc244180372"/>
       <w:r>
         <w:t>4.2. Mượn – trả</w:t>
       </w:r>
@@ -10442,7 +10598,7 @@
       <w:pPr>
         <w:pStyle w:val="Heading2"/>
       </w:pPr>
-      <w:bookmarkStart w:id="18" w:name="_Toc244179388"/>
+      <w:bookmarkStart w:id="18" w:name="_Toc244180373"/>
       <w:r>
         <w:t>4.3. Mã QR và kiểm kê</w:t>
       </w:r>
@@ -10539,7 +10695,7 @@
         <w:pStyle w:val="Heading1"/>
         <w:pageBreakBefore/>
       </w:pPr>
-      <w:bookmarkStart w:id="19" w:name="_Toc244179389"/>
+      <w:bookmarkStart w:id="19" w:name="_Toc244180374"/>
       <w:r>
         <w:lastRenderedPageBreak/>
         <w:t>5. Module 3 – Minh chứng Sở ban ngành</w:t>
@@ -11181,7 +11337,7 @@
       <w:pPr>
         <w:pStyle w:val="Heading2"/>
       </w:pPr>
-      <w:bookmarkStart w:id="20" w:name="_Toc244179390"/>
+      <w:bookmarkStart w:id="20" w:name="_Toc244180375"/>
       <w:r>
         <w:t>5.1. Quy trình</w:t>
       </w:r>
@@ -11295,7 +11451,7 @@
       <w:pPr>
         <w:pStyle w:val="Heading2"/>
       </w:pPr>
-      <w:bookmarkStart w:id="21" w:name="_Toc244179391"/>
+      <w:bookmarkStart w:id="21" w:name="_Toc244180376"/>
       <w:r>
         <w:t>5.2. Bảo đảm lịch sử duyệt không thể sửa</w:t>
       </w:r>
@@ -11626,7 +11782,7 @@
       <w:pPr>
         <w:pStyle w:val="Heading2"/>
       </w:pPr>
-      <w:bookmarkStart w:id="22" w:name="_Toc244179392"/>
+      <w:bookmarkStart w:id="22" w:name="_Toc244180377"/>
       <w:r>
         <w:lastRenderedPageBreak/>
         <w:t>5.3. Sửa, xóa đợt minh chứng</w:t>
@@ -11729,7 +11885,7 @@
         <w:pStyle w:val="Heading1"/>
         <w:pageBreakBefore/>
       </w:pPr>
-      <w:bookmarkStart w:id="23" w:name="_Toc244179393"/>
+      <w:bookmarkStart w:id="23" w:name="_Toc244180378"/>
       <w:r>
         <w:lastRenderedPageBreak/>
         <w:t>6. Module 4 – Thời khóa biểu thông minh</w:t>
@@ -11761,7 +11917,7 @@
       <w:pPr>
         <w:pStyle w:val="Heading2"/>
       </w:pPr>
-      <w:bookmarkStart w:id="24" w:name="_Toc244179394"/>
+      <w:bookmarkStart w:id="24" w:name="_Toc244180379"/>
       <w:r>
         <w:t>6.1. Quy ước lịch học</w:t>
       </w:r>
@@ -12243,7 +12399,7 @@
       <w:pPr>
         <w:pStyle w:val="Heading2"/>
       </w:pPr>
-      <w:bookmarkStart w:id="25" w:name="_Toc244179395"/>
+      <w:bookmarkStart w:id="25" w:name="_Toc244180380"/>
       <w:r>
         <w:t>6.2. Dữ liệu đầu vào</w:t>
       </w:r>
@@ -13145,7 +13301,7 @@
       <w:pPr>
         <w:pStyle w:val="Heading2"/>
       </w:pPr>
-      <w:bookmarkStart w:id="26" w:name="_Toc244179396"/>
+      <w:bookmarkStart w:id="26" w:name="_Toc244180381"/>
       <w:r>
         <w:t>6.3. Giai đoạn 1 – Phân bổ giảng viên (allocateLecturers)</w:t>
       </w:r>
@@ -14302,7 +14458,7 @@
       <w:pPr>
         <w:pStyle w:val="Heading2"/>
       </w:pPr>
-      <w:bookmarkStart w:id="27" w:name="_Toc244179397"/>
+      <w:bookmarkStart w:id="27" w:name="_Toc244180382"/>
       <w:r>
         <w:t>6.4. Giai đoạn 2 – Xếp lịch tuần (solveTimetable)</w:t>
       </w:r>
@@ -14864,7 +15020,7 @@
       <w:pPr>
         <w:pStyle w:val="Heading2"/>
       </w:pPr>
-      <w:bookmarkStart w:id="28" w:name="_Toc244179398"/>
+      <w:bookmarkStart w:id="28" w:name="_Toc244180383"/>
       <w:r>
         <w:t>6.5. Lưu kết quả và các phiên bản</w:t>
       </w:r>
@@ -14988,7 +15144,7 @@
       <w:pPr>
         <w:pStyle w:val="Heading2"/>
       </w:pPr>
-      <w:bookmarkStart w:id="29" w:name="_Toc244179399"/>
+      <w:bookmarkStart w:id="29" w:name="_Toc244180384"/>
       <w:r>
         <w:t>6.6. Chỉnh tay và phát hiện xung đột</w:t>
       </w:r>
@@ -15113,7 +15269,7 @@
       <w:pPr>
         <w:pStyle w:val="Heading2"/>
       </w:pPr>
-      <w:bookmarkStart w:id="30" w:name="_Toc244179400"/>
+      <w:bookmarkStart w:id="30" w:name="_Toc244180385"/>
       <w:r>
         <w:t>6.7. Xóa dữ liệu nền an toàn</w:t>
       </w:r>
@@ -15142,7 +15298,7 @@
       <w:pPr>
         <w:pStyle w:val="Heading2"/>
       </w:pPr>
-      <w:bookmarkStart w:id="31" w:name="_Toc244179401"/>
+      <w:bookmarkStart w:id="31" w:name="_Toc244180386"/>
       <w:r>
         <w:t>6.8. Kiểm thử thuật toán</w:t>
       </w:r>
@@ -15694,7 +15850,7 @@
         <w:pStyle w:val="Heading1"/>
         <w:pageBreakBefore/>
       </w:pPr>
-      <w:bookmarkStart w:id="32" w:name="_Toc244179402"/>
+      <w:bookmarkStart w:id="32" w:name="_Toc244180387"/>
       <w:r>
         <w:lastRenderedPageBreak/>
         <w:t>7. Module 5 – Giao việc &amp; Hiệu suất</w:t>
@@ -15705,7 +15861,7 @@
       <w:pPr>
         <w:pStyle w:val="Heading2"/>
       </w:pPr>
-      <w:bookmarkStart w:id="33" w:name="_Toc244179403"/>
+      <w:bookmarkStart w:id="33" w:name="_Toc244180388"/>
       <w:r>
         <w:t>7.1. Vòng đời công việc</w:t>
       </w:r>
@@ -15817,9 +15973,62 @@
     </w:p>
     <w:p>
       <w:pPr>
+        <w:pStyle w:val="Heading3"/>
+      </w:pPr>
+      <w:r>
+        <w:t>Sửa, xóa công việc (chỉ Quản trị viên)</w:t>
+      </w:r>
+    </w:p>
+    <w:p>
+      <w:pPr>
+        <w:spacing w:after="120" w:line="300" w:lineRule="auto"/>
+        <w:jc w:val="both"/>
+      </w:pPr>
+      <w:r>
+        <w:t xml:space="preserve">Trang </w:t>
+      </w:r>
+      <w:r>
+        <w:rPr>
+          <w:rFonts w:ascii="Consolas" w:eastAsia="Consolas" w:hAnsi="Consolas" w:cs="Consolas"/>
+          <w:color w:val="1D4ED8"/>
+          <w:sz w:val="21"/>
+          <w:szCs w:val="21"/>
+        </w:rPr>
+        <w:t>cong-viec/[id]/sua</w:t>
+      </w:r>
+      <w:r>
+        <w:t xml:space="preserve"> (action </w:t>
+      </w:r>
+      <w:r>
+        <w:rPr>
+          <w:rFonts w:ascii="Consolas" w:eastAsia="Consolas" w:hAnsi="Consolas" w:cs="Consolas"/>
+          <w:color w:val="1D4ED8"/>
+          <w:sz w:val="21"/>
+          <w:szCs w:val="21"/>
+        </w:rPr>
+        <w:t>updateTask</w:t>
+      </w:r>
+      <w:r>
+        <w:t xml:space="preserve">) sửa tên, mô tả, tiêu chí nghiệm thu, người thực hiện, hạn chót, ưu tiên, khối lượng, gỡ/thêm tệp. </w:t>
+      </w:r>
+      <w:r>
+        <w:rPr>
+          <w:rFonts w:ascii="Consolas" w:eastAsia="Consolas" w:hAnsi="Consolas" w:cs="Consolas"/>
+          <w:color w:val="1D4ED8"/>
+          <w:sz w:val="21"/>
+          <w:szCs w:val="21"/>
+        </w:rPr>
+        <w:t>deleteTask</w:t>
+      </w:r>
+      <w:r>
+        <w:t xml:space="preserve"> xóa công việc kèm trao đổi và tệp; việc đã xóa không còn được tính vào điểm hiệu suất.</w:t>
+      </w:r>
+    </w:p>
+    <w:p>
+      <w:pPr>
         <w:pStyle w:val="Heading2"/>
       </w:pPr>
-      <w:bookmarkStart w:id="34" w:name="_Toc244179404"/>
+      <w:bookmarkStart w:id="34" w:name="_Toc244180389"/>
       <w:r>
         <w:t>7.2. Chấm điểm hiệu suất tự động (src/lib/performance.ts)</w:t>
       </w:r>
@@ -16271,7 +16480,7 @@
       <w:pPr>
         <w:pStyle w:val="Heading2"/>
       </w:pPr>
-      <w:bookmarkStart w:id="35" w:name="_Toc244179405"/>
+      <w:bookmarkStart w:id="35" w:name="_Toc244180390"/>
       <w:r>
         <w:t>7.3. Nhận xét bằng AI</w:t>
       </w:r>
@@ -16325,7 +16534,7 @@
         <w:pStyle w:val="Heading1"/>
         <w:pageBreakBefore/>
       </w:pPr>
-      <w:bookmarkStart w:id="36" w:name="_Toc244179406"/>
+      <w:bookmarkStart w:id="36" w:name="_Toc244180391"/>
       <w:r>
         <w:lastRenderedPageBreak/>
         <w:t>8. Module 6 – Trợ lý AI &amp; Kho tri thức</w:t>
@@ -16336,7 +16545,7 @@
       <w:pPr>
         <w:pStyle w:val="Heading2"/>
       </w:pPr>
-      <w:bookmarkStart w:id="37" w:name="_Toc244179407"/>
+      <w:bookmarkStart w:id="37" w:name="_Toc244180392"/>
       <w:r>
         <w:t>8.1. Kho tri thức</w:t>
       </w:r>
@@ -16367,7 +16576,7 @@
       <w:pPr>
         <w:pStyle w:val="Heading2"/>
       </w:pPr>
-      <w:bookmarkStart w:id="38" w:name="_Toc244179408"/>
+      <w:bookmarkStart w:id="38" w:name="_Toc244180393"/>
       <w:r>
         <w:t>8.2. Tìm kiếm tài liệu (src/lib/kb-search.ts)</w:t>
       </w:r>
@@ -16426,7 +16635,7 @@
       <w:pPr>
         <w:pStyle w:val="Heading2"/>
       </w:pPr>
-      <w:bookmarkStart w:id="39" w:name="_Toc244179409"/>
+      <w:bookmarkStart w:id="39" w:name="_Toc244180394"/>
       <w:r>
         <w:t>8.3. Chatbot (RAG – truy xuất rồi sinh câu trả lời)</w:t>
       </w:r>
@@ -16575,7 +16784,7 @@
       <w:pPr>
         <w:pStyle w:val="Heading2"/>
       </w:pPr>
-      <w:bookmarkStart w:id="40" w:name="_Toc244179410"/>
+      <w:bookmarkStart w:id="40" w:name="_Toc244180395"/>
       <w:r>
         <w:t>8.4. Kết nối Claude (src/lib/ai.ts)</w:t>
       </w:r>
@@ -16696,7 +16905,7 @@
         <w:pStyle w:val="Heading1"/>
         <w:pageBreakBefore/>
       </w:pPr>
-      <w:bookmarkStart w:id="41" w:name="_Toc244179411"/>
+      <w:bookmarkStart w:id="41" w:name="_Toc244180396"/>
       <w:r>
         <w:lastRenderedPageBreak/>
         <w:t>9. Bảng điều khiển, dữ liệu mẫu và công cụ</w:t>
@@ -16707,7 +16916,7 @@
       <w:pPr>
         <w:pStyle w:val="Heading2"/>
       </w:pPr>
-      <w:bookmarkStart w:id="42" w:name="_Toc244179412"/>
+      <w:bookmarkStart w:id="42" w:name="_Toc244180397"/>
       <w:r>
         <w:t>9.1. Bảng điều khiển (src/app/(portal)/page.tsx)</w:t>
       </w:r>
@@ -16726,7 +16935,7 @@
       <w:pPr>
         <w:pStyle w:val="Heading2"/>
       </w:pPr>
-      <w:bookmarkStart w:id="43" w:name="_Toc244179413"/>
+      <w:bookmarkStart w:id="43" w:name="_Toc244180398"/>
       <w:r>
         <w:t>9.2. Script và lệnh</w:t>
       </w:r>
@@ -17266,7 +17475,7 @@
         <w:pStyle w:val="Heading1"/>
         <w:pageBreakBefore/>
       </w:pPr>
-      <w:bookmarkStart w:id="44" w:name="_Toc244179414"/>
+      <w:bookmarkStart w:id="44" w:name="_Toc244180399"/>
       <w:r>
         <w:lastRenderedPageBreak/>
         <w:t>10. Triển khai lên Hostinger</w:t>
@@ -18009,7 +18218,7 @@
         <w:pStyle w:val="Heading1"/>
         <w:pageBreakBefore/>
       </w:pPr>
-      <w:bookmarkStart w:id="45" w:name="_Toc244179415"/>
+      <w:bookmarkStart w:id="45" w:name="_Toc244180400"/>
       <w:r>
         <w:lastRenderedPageBreak/>
         <w:t>11. Bảo mật và bảo trì</w:t>
@@ -18020,7 +18229,7 @@
       <w:pPr>
         <w:pStyle w:val="Heading2"/>
       </w:pPr>
-      <w:bookmarkStart w:id="46" w:name="_Toc244179416"/>
+      <w:bookmarkStart w:id="46" w:name="_Toc244180401"/>
       <w:r>
         <w:t>11.1. Các biện pháp bảo mật</w:t>
       </w:r>
@@ -18144,7 +18353,7 @@
       <w:pPr>
         <w:pStyle w:val="Heading2"/>
       </w:pPr>
-      <w:bookmarkStart w:id="47" w:name="_Toc244179417"/>
+      <w:bookmarkStart w:id="47" w:name="_Toc244180402"/>
       <w:r>
         <w:t>11.2. Thay đổi thường gặp</w:t>
       </w:r>
@@ -18939,7 +19148,7 @@
       <w:pPr>
         <w:pStyle w:val="Heading2"/>
       </w:pPr>
-      <w:bookmarkStart w:id="48" w:name="_Toc244179418"/>
+      <w:bookmarkStart w:id="48" w:name="_Toc244180403"/>
       <w:r>
         <w:t>11.3. Quy trình cập nhật</w:t>
       </w:r>
@@ -19245,10 +19454,10 @@
 <file path=word/numbering.xml><?xml version="1.0" encoding="utf-8"?>
 <w:numbering xmlns:wpc="http://schemas.microsoft.com/office/word/2010/wordprocessingCanvas" xmlns:cx="http://schemas.microsoft.com/office/drawing/2014/chartex" xmlns:cx1="http://schemas.microsoft.com/office/drawing/2015/9/8/chartex" xmlns:cx2="http://schemas.microsoft.com/office/drawing/2015/10/21/chartex" xmlns:cx3="http://schemas.microsoft.com/office/drawing/2016/5/9/chartex" xmlns:cx4="http://schemas.microsoft.com/office/drawing/2016/5/10/chartex" xmlns:cx5="http://schemas.microsoft.com/office/drawing/2016/5/11/chartex" xmlns:cx6="http://schemas.microsoft.com/office/drawing/2016/5/12/chartex" xmlns:cx7="http://schemas.microsoft.com/office/drawing/2016/5/13/chartex" xmlns:cx8="http://schemas.microsoft.com/office/drawing/2016/5/14/chartex" xmlns:mc="http://schemas.openxmlformats.org/markup-compatibility/2006" xmlns:aink="http://schemas.microsoft.com/office/drawing/2016/ink" xmlns:am3d="http://schemas.microsoft.com/office/drawing/2017/model3d" xmlns:o="urn:schemas-microsoft-com:office:office" xmlns:oel="http://schemas.microsoft.com/office/2019/extlst" xmlns:r="http://schemas.openxmlformats.org/officeDocument/2006/relationships" xmlns:m="http://schemas.openxmlformats.org/officeDocument/2006/math" xmlns:v="urn:schemas-microsoft-com:vml" xmlns:wp14="http://schemas.microsoft.com/office/word/2010/wordprocessingDrawing" xmlns:wp="http://schemas.openxmlformats.org/drawingml/2006/wordprocessingDrawing" xmlns:w10="urn:schemas-microsoft-com:office:word" xmlns:w="http://schemas.openxmlformats.org/wordprocessingml/2006/main" xmlns:w14="http://schemas.microsoft.com/office/word/2010/wordml" xmlns:w15="http://schemas.microsoft.com/office/word/2012/wordml" xmlns:w16cex="http://schemas.microsoft.com/office/word/2018/wordml/cex" xmlns:w16cid="http://schemas.microsoft.com/office/word/2016/wordml/cid" xmlns:w16="http://schemas.microsoft.com/office/word/2018/wordml" xmlns:w16du="http://schemas.microsoft.com/office/word/2023/wordml/word16du" xmlns:w16sdtdh="http://schemas.microsoft.com/office/word/2020/wordml/sdtdatahash" xmlns:w16sdtfl="http://schemas.microsoft.com/office/word/2024/wordml/sdtformatlock" xmlns:w16se="http://schemas.microsoft.com/office/word/2015/wordml/symex" xmlns:wpg="http://schemas.microsoft.com/office/word/2010/wordprocessingGroup" xmlns:wpi="http://schemas.microsoft.com/office/word/2010/wordprocessingInk" xmlns:wne="http://schemas.microsoft.com/office/word/2006/wordml" xmlns:wps="http://schemas.microsoft.com/office/word/2010/wordprocessingShape" mc:Ignorable="w14 w15 w16se w16cid w16 w16cex w16sdtdh w16sdtfl w16du wp14">
   <w:abstractNum w:abstractNumId="0" w15:restartNumberingAfterBreak="0">
-    <w:nsid w:val="1BE71294"/>
+    <w:nsid w:val="03311A23"/>
     <w:multiLevelType w:val="hybridMultilevel"/>
-    <w:tmpl w:val="C458163E"/>
-    <w:lvl w:ilvl="0" w:tplc="CFB4B486">
+    <w:tmpl w:val="A80C5C4C"/>
+    <w:lvl w:ilvl="0" w:tplc="64463278">
       <w:start w:val="1"/>
       <w:numFmt w:val="decimal"/>
       <w:lvlText w:val="%1."/>
@@ -19257,52 +19466,52 @@
         <w:ind w:left="640" w:hanging="360"/>
       </w:pPr>
     </w:lvl>
-    <w:lvl w:ilvl="1" w:tplc="0FAEE14E">
+    <w:lvl w:ilvl="1" w:tplc="6B02A0F8">
       <w:numFmt w:val="decimal"/>
       <w:lvlText w:val=""/>
       <w:lvlJc w:val="left"/>
     </w:lvl>
-    <w:lvl w:ilvl="2" w:tplc="E7623054">
+    <w:lvl w:ilvl="2" w:tplc="CC42BED4">
       <w:numFmt w:val="decimal"/>
       <w:lvlText w:val=""/>
       <w:lvlJc w:val="left"/>
     </w:lvl>
-    <w:lvl w:ilvl="3" w:tplc="7E3C6978">
+    <w:lvl w:ilvl="3" w:tplc="3A5C41B6">
       <w:numFmt w:val="decimal"/>
       <w:lvlText w:val=""/>
       <w:lvlJc w:val="left"/>
     </w:lvl>
-    <w:lvl w:ilvl="4" w:tplc="7AA0A7DA">
+    <w:lvl w:ilvl="4" w:tplc="38C2E0F4">
       <w:numFmt w:val="decimal"/>
       <w:lvlText w:val=""/>
       <w:lvlJc w:val="left"/>
     </w:lvl>
-    <w:lvl w:ilvl="5" w:tplc="BF3AB94E">
+    <w:lvl w:ilvl="5" w:tplc="8C2017B4">
       <w:numFmt w:val="decimal"/>
       <w:lvlText w:val=""/>
       <w:lvlJc w:val="left"/>
     </w:lvl>
-    <w:lvl w:ilvl="6" w:tplc="5C98B52A">
+    <w:lvl w:ilvl="6" w:tplc="C938DFEC">
       <w:numFmt w:val="decimal"/>
       <w:lvlText w:val=""/>
       <w:lvlJc w:val="left"/>
     </w:lvl>
-    <w:lvl w:ilvl="7" w:tplc="AA5C1C7E">
+    <w:lvl w:ilvl="7" w:tplc="E528C294">
       <w:numFmt w:val="decimal"/>
       <w:lvlText w:val=""/>
       <w:lvlJc w:val="left"/>
     </w:lvl>
-    <w:lvl w:ilvl="8" w:tplc="4CD60DCA">
+    <w:lvl w:ilvl="8" w:tplc="2DFEF728">
       <w:numFmt w:val="decimal"/>
       <w:lvlText w:val=""/>
       <w:lvlJc w:val="left"/>
     </w:lvl>
   </w:abstractNum>
   <w:abstractNum w:abstractNumId="1" w15:restartNumberingAfterBreak="0">
-    <w:nsid w:val="28F905CA"/>
+    <w:nsid w:val="0BD358D9"/>
     <w:multiLevelType w:val="hybridMultilevel"/>
-    <w:tmpl w:val="671AEED4"/>
-    <w:lvl w:ilvl="0" w:tplc="0310FF2E">
+    <w:tmpl w:val="94E47174"/>
+    <w:lvl w:ilvl="0" w:tplc="D3E20CDE">
       <w:start w:val="1"/>
       <w:numFmt w:val="decimal"/>
       <w:lvlText w:val="%1."/>
@@ -19311,110 +19520,106 @@
         <w:ind w:left="640" w:hanging="360"/>
       </w:pPr>
     </w:lvl>
-    <w:lvl w:ilvl="1" w:tplc="2D546D92">
+    <w:lvl w:ilvl="1" w:tplc="F0580F82">
       <w:numFmt w:val="decimal"/>
       <w:lvlText w:val=""/>
       <w:lvlJc w:val="left"/>
     </w:lvl>
-    <w:lvl w:ilvl="2" w:tplc="EE0E2928">
+    <w:lvl w:ilvl="2" w:tplc="729A08EC">
       <w:numFmt w:val="decimal"/>
       <w:lvlText w:val=""/>
       <w:lvlJc w:val="left"/>
     </w:lvl>
-    <w:lvl w:ilvl="3" w:tplc="64826C54">
+    <w:lvl w:ilvl="3" w:tplc="C534FB6A">
       <w:numFmt w:val="decimal"/>
       <w:lvlText w:val=""/>
       <w:lvlJc w:val="left"/>
     </w:lvl>
-    <w:lvl w:ilvl="4" w:tplc="5D84F1AE">
+    <w:lvl w:ilvl="4" w:tplc="A14ECE02">
       <w:numFmt w:val="decimal"/>
       <w:lvlText w:val=""/>
       <w:lvlJc w:val="left"/>
     </w:lvl>
-    <w:lvl w:ilvl="5" w:tplc="5D8C2CFE">
+    <w:lvl w:ilvl="5" w:tplc="D0C4A104">
       <w:numFmt w:val="decimal"/>
       <w:lvlText w:val=""/>
       <w:lvlJc w:val="left"/>
     </w:lvl>
-    <w:lvl w:ilvl="6" w:tplc="7ADA77A4">
+    <w:lvl w:ilvl="6" w:tplc="97541E22">
       <w:numFmt w:val="decimal"/>
       <w:lvlText w:val=""/>
       <w:lvlJc w:val="left"/>
     </w:lvl>
-    <w:lvl w:ilvl="7" w:tplc="630E9194">
+    <w:lvl w:ilvl="7" w:tplc="7366AD8E">
       <w:numFmt w:val="decimal"/>
       <w:lvlText w:val=""/>
       <w:lvlJc w:val="left"/>
     </w:lvl>
-    <w:lvl w:ilvl="8" w:tplc="5EFECC4E">
+    <w:lvl w:ilvl="8" w:tplc="A894DCD6">
       <w:numFmt w:val="decimal"/>
       <w:lvlText w:val=""/>
       <w:lvlJc w:val="left"/>
     </w:lvl>
   </w:abstractNum>
   <w:abstractNum w:abstractNumId="2" w15:restartNumberingAfterBreak="0">
-    <w:nsid w:val="2D821474"/>
+    <w:nsid w:val="0D854C3F"/>
     <w:multiLevelType w:val="hybridMultilevel"/>
-    <w:tmpl w:val="A22E2C70"/>
-    <w:lvl w:ilvl="0" w:tplc="38F80518">
+    <w:tmpl w:val="A83808BC"/>
+    <w:lvl w:ilvl="0" w:tplc="54825638">
       <w:start w:val="1"/>
-      <w:numFmt w:val="bullet"/>
-      <w:lvlText w:val="•"/>
+      <w:numFmt w:val="decimal"/>
+      <w:lvlText w:val="%1."/>
       <w:lvlJc w:val="left"/>
       <w:pPr>
-        <w:ind w:left="640" w:hanging="320"/>
+        <w:ind w:left="640" w:hanging="360"/>
       </w:pPr>
     </w:lvl>
-    <w:lvl w:ilvl="1" w:tplc="D4763BF4">
-      <w:start w:val="1"/>
-      <w:numFmt w:val="bullet"/>
-      <w:lvlText w:val="–"/>
-      <w:lvlJc w:val="left"/>
-      <w:pPr>
-        <w:ind w:left="1100" w:hanging="320"/>
-      </w:pPr>
-    </w:lvl>
-    <w:lvl w:ilvl="2" w:tplc="6E7AD68C">
+    <w:lvl w:ilvl="1" w:tplc="036805E0">
       <w:numFmt w:val="decimal"/>
       <w:lvlText w:val=""/>
       <w:lvlJc w:val="left"/>
     </w:lvl>
-    <w:lvl w:ilvl="3" w:tplc="56B60910">
+    <w:lvl w:ilvl="2" w:tplc="BB2E5E22">
       <w:numFmt w:val="decimal"/>
       <w:lvlText w:val=""/>
       <w:lvlJc w:val="left"/>
     </w:lvl>
-    <w:lvl w:ilvl="4" w:tplc="06FEC1F8">
+    <w:lvl w:ilvl="3" w:tplc="9F6202D6">
       <w:numFmt w:val="decimal"/>
       <w:lvlText w:val=""/>
       <w:lvlJc w:val="left"/>
     </w:lvl>
-    <w:lvl w:ilvl="5" w:tplc="C93A3E06">
+    <w:lvl w:ilvl="4" w:tplc="27821C34">
       <w:numFmt w:val="decimal"/>
       <w:lvlText w:val=""/>
       <w:lvlJc w:val="left"/>
     </w:lvl>
-    <w:lvl w:ilvl="6" w:tplc="DC96135E">
+    <w:lvl w:ilvl="5" w:tplc="38B25062">
       <w:numFmt w:val="decimal"/>
       <w:lvlText w:val=""/>
       <w:lvlJc w:val="left"/>
     </w:lvl>
-    <w:lvl w:ilvl="7" w:tplc="7D1E62A2">
+    <w:lvl w:ilvl="6" w:tplc="276A9838">
       <w:numFmt w:val="decimal"/>
       <w:lvlText w:val=""/>
       <w:lvlJc w:val="left"/>
     </w:lvl>
-    <w:lvl w:ilvl="8" w:tplc="3FDA2046">
+    <w:lvl w:ilvl="7" w:tplc="4692DE08">
+      <w:numFmt w:val="decimal"/>
+      <w:lvlText w:val=""/>
+      <w:lvlJc w:val="left"/>
+    </w:lvl>
+    <w:lvl w:ilvl="8" w:tplc="5A4C923E">
       <w:numFmt w:val="decimal"/>
       <w:lvlText w:val=""/>
       <w:lvlJc w:val="left"/>
     </w:lvl>
   </w:abstractNum>
   <w:abstractNum w:abstractNumId="3" w15:restartNumberingAfterBreak="0">
-    <w:nsid w:val="2EFE6F7D"/>
+    <w:nsid w:val="0E797088"/>
     <w:multiLevelType w:val="hybridMultilevel"/>
-    <w:tmpl w:val="9A924F7E"/>
-    <w:lvl w:ilvl="0" w:tplc="EBAA719E">
+    <w:tmpl w:val="C7BC10EA"/>
+    <w:lvl w:ilvl="0" w:tplc="64407982">
       <w:start w:val="1"/>
       <w:numFmt w:val="decimal"/>
       <w:lvlText w:val="%1."/>
@@ -19423,52 +19628,52 @@
         <w:ind w:left="640" w:hanging="360"/>
       </w:pPr>
     </w:lvl>
-    <w:lvl w:ilvl="1" w:tplc="3E489DC6">
+    <w:lvl w:ilvl="1" w:tplc="E1EEE1E6">
       <w:numFmt w:val="decimal"/>
       <w:lvlText w:val=""/>
       <w:lvlJc w:val="left"/>
     </w:lvl>
-    <w:lvl w:ilvl="2" w:tplc="50A2D650">
+    <w:lvl w:ilvl="2" w:tplc="F73688D8">
       <w:numFmt w:val="decimal"/>
       <w:lvlText w:val=""/>
       <w:lvlJc w:val="left"/>
     </w:lvl>
-    <w:lvl w:ilvl="3" w:tplc="5C104076">
+    <w:lvl w:ilvl="3" w:tplc="6412600E">
       <w:numFmt w:val="decimal"/>
       <w:lvlText w:val=""/>
       <w:lvlJc w:val="left"/>
     </w:lvl>
-    <w:lvl w:ilvl="4" w:tplc="3BC43204">
+    <w:lvl w:ilvl="4" w:tplc="6EE00018">
       <w:numFmt w:val="decimal"/>
       <w:lvlText w:val=""/>
       <w:lvlJc w:val="left"/>
     </w:lvl>
-    <w:lvl w:ilvl="5" w:tplc="46AA70AE">
+    <w:lvl w:ilvl="5" w:tplc="F90A9BF6">
       <w:numFmt w:val="decimal"/>
       <w:lvlText w:val=""/>
       <w:lvlJc w:val="left"/>
     </w:lvl>
-    <w:lvl w:ilvl="6" w:tplc="36C21C9A">
+    <w:lvl w:ilvl="6" w:tplc="C532C942">
       <w:numFmt w:val="decimal"/>
       <w:lvlText w:val=""/>
       <w:lvlJc w:val="left"/>
     </w:lvl>
-    <w:lvl w:ilvl="7" w:tplc="B4E6803A">
+    <w:lvl w:ilvl="7" w:tplc="917009B8">
       <w:numFmt w:val="decimal"/>
       <w:lvlText w:val=""/>
       <w:lvlJc w:val="left"/>
     </w:lvl>
-    <w:lvl w:ilvl="8" w:tplc="9698B77C">
+    <w:lvl w:ilvl="8" w:tplc="2B20E8D0">
       <w:numFmt w:val="decimal"/>
       <w:lvlText w:val=""/>
       <w:lvlJc w:val="left"/>
     </w:lvl>
   </w:abstractNum>
   <w:abstractNum w:abstractNumId="4" w15:restartNumberingAfterBreak="0">
-    <w:nsid w:val="445E122D"/>
+    <w:nsid w:val="271916B1"/>
     <w:multiLevelType w:val="hybridMultilevel"/>
-    <w:tmpl w:val="F03A72E6"/>
-    <w:lvl w:ilvl="0" w:tplc="7EEEE060">
+    <w:tmpl w:val="8AF685E4"/>
+    <w:lvl w:ilvl="0" w:tplc="241CC132">
       <w:start w:val="1"/>
       <w:numFmt w:val="decimal"/>
       <w:lvlText w:val="%1."/>
@@ -19477,138 +19682,52 @@
         <w:ind w:left="640" w:hanging="360"/>
       </w:pPr>
     </w:lvl>
-    <w:lvl w:ilvl="1" w:tplc="3C807214">
+    <w:lvl w:ilvl="1" w:tplc="458CA31A">
       <w:numFmt w:val="decimal"/>
       <w:lvlText w:val=""/>
       <w:lvlJc w:val="left"/>
     </w:lvl>
-    <w:lvl w:ilvl="2" w:tplc="CE5C5AEC">
+    <w:lvl w:ilvl="2" w:tplc="B936D18C">
       <w:numFmt w:val="decimal"/>
       <w:lvlText w:val=""/>
       <w:lvlJc w:val="left"/>
     </w:lvl>
-    <w:lvl w:ilvl="3" w:tplc="9C26D15C">
+    <w:lvl w:ilvl="3" w:tplc="63C638E4">
       <w:numFmt w:val="decimal"/>
       <w:lvlText w:val=""/>
       <w:lvlJc w:val="left"/>
     </w:lvl>
-    <w:lvl w:ilvl="4" w:tplc="6422C844">
+    <w:lvl w:ilvl="4" w:tplc="0C56C3E6">
       <w:numFmt w:val="decimal"/>
       <w:lvlText w:val=""/>
       <w:lvlJc w:val="left"/>
     </w:lvl>
-    <w:lvl w:ilvl="5" w:tplc="8D4C1B96">
+    <w:lvl w:ilvl="5" w:tplc="D0F6F134">
       <w:numFmt w:val="decimal"/>
       <w:lvlText w:val=""/>
       <w:lvlJc w:val="left"/>
     </w:lvl>
-    <w:lvl w:ilvl="6" w:tplc="CCF0BF52">
+    <w:lvl w:ilvl="6" w:tplc="0FDCDD78">
       <w:numFmt w:val="decimal"/>
       <w:lvlText w:val=""/>
       <w:lvlJc w:val="left"/>
     </w:lvl>
-    <w:lvl w:ilvl="7" w:tplc="2DFEF2B0">
+    <w:lvl w:ilvl="7" w:tplc="E6B2EFEA">
       <w:numFmt w:val="decimal"/>
       <w:lvlText w:val=""/>
       <w:lvlJc w:val="left"/>
     </w:lvl>
-    <w:lvl w:ilvl="8" w:tplc="0F8CD38E">
+    <w:lvl w:ilvl="8" w:tplc="9DF8BB84">
       <w:numFmt w:val="decimal"/>
       <w:lvlText w:val=""/>
       <w:lvlJc w:val="left"/>
     </w:lvl>
   </w:abstractNum>
   <w:abstractNum w:abstractNumId="5" w15:restartNumberingAfterBreak="0">
-    <w:nsid w:val="4736220E"/>
+    <w:nsid w:val="35554E62"/>
     <w:multiLevelType w:val="hybridMultilevel"/>
-    <w:tmpl w:val="1D1C2E2C"/>
-    <w:lvl w:ilvl="0" w:tplc="C7385FBC">
-      <w:start w:val="1"/>
-      <w:numFmt w:val="bullet"/>
-      <w:lvlText w:val="●"/>
-      <w:lvlJc w:val="left"/>
-      <w:pPr>
-        <w:ind w:left="720" w:hanging="360"/>
-      </w:pPr>
-    </w:lvl>
-    <w:lvl w:ilvl="1" w:tplc="3C6699DE">
-      <w:start w:val="1"/>
-      <w:numFmt w:val="bullet"/>
-      <w:lvlText w:val="○"/>
-      <w:lvlJc w:val="left"/>
-      <w:pPr>
-        <w:ind w:left="1440" w:hanging="360"/>
-      </w:pPr>
-    </w:lvl>
-    <w:lvl w:ilvl="2" w:tplc="42402354">
-      <w:start w:val="1"/>
-      <w:numFmt w:val="bullet"/>
-      <w:lvlText w:val="■"/>
-      <w:lvlJc w:val="left"/>
-      <w:pPr>
-        <w:ind w:left="2160" w:hanging="360"/>
-      </w:pPr>
-    </w:lvl>
-    <w:lvl w:ilvl="3" w:tplc="CD42149A">
-      <w:start w:val="1"/>
-      <w:numFmt w:val="bullet"/>
-      <w:lvlText w:val="●"/>
-      <w:lvlJc w:val="left"/>
-      <w:pPr>
-        <w:ind w:left="2880" w:hanging="360"/>
-      </w:pPr>
-    </w:lvl>
-    <w:lvl w:ilvl="4" w:tplc="B1E4068C">
-      <w:start w:val="1"/>
-      <w:numFmt w:val="bullet"/>
-      <w:lvlText w:val="○"/>
-      <w:lvlJc w:val="left"/>
-      <w:pPr>
-        <w:ind w:left="3600" w:hanging="360"/>
-      </w:pPr>
-    </w:lvl>
-    <w:lvl w:ilvl="5" w:tplc="85884122">
-      <w:start w:val="1"/>
-      <w:numFmt w:val="bullet"/>
-      <w:lvlText w:val="■"/>
-      <w:lvlJc w:val="left"/>
-      <w:pPr>
-        <w:ind w:left="4320" w:hanging="360"/>
-      </w:pPr>
-    </w:lvl>
-    <w:lvl w:ilvl="6" w:tplc="2EFCDF08">
-      <w:start w:val="1"/>
-      <w:numFmt w:val="bullet"/>
-      <w:lvlText w:val="●"/>
-      <w:lvlJc w:val="left"/>
-      <w:pPr>
-        <w:ind w:left="5040" w:hanging="360"/>
-      </w:pPr>
-    </w:lvl>
-    <w:lvl w:ilvl="7" w:tplc="B276D16C">
-      <w:start w:val="1"/>
-      <w:numFmt w:val="bullet"/>
-      <w:lvlText w:val="●"/>
-      <w:lvlJc w:val="left"/>
-      <w:pPr>
-        <w:ind w:left="5760" w:hanging="360"/>
-      </w:pPr>
-    </w:lvl>
-    <w:lvl w:ilvl="8" w:tplc="D61A6620">
-      <w:start w:val="1"/>
-      <w:numFmt w:val="bullet"/>
-      <w:lvlText w:val="●"/>
-      <w:lvlJc w:val="left"/>
-      <w:pPr>
-        <w:ind w:left="6480" w:hanging="360"/>
-      </w:pPr>
-    </w:lvl>
-  </w:abstractNum>
-  <w:abstractNum w:abstractNumId="6" w15:restartNumberingAfterBreak="0">
-    <w:nsid w:val="64C53556"/>
-    <w:multiLevelType w:val="hybridMultilevel"/>
-    <w:tmpl w:val="B7BC235A"/>
-    <w:lvl w:ilvl="0" w:tplc="8736A682">
+    <w:tmpl w:val="ABC0938C"/>
+    <w:lvl w:ilvl="0" w:tplc="F4E6B134">
       <w:start w:val="1"/>
       <w:numFmt w:val="decimal"/>
       <w:lvlText w:val="%1."/>
@@ -19617,144 +19736,234 @@
         <w:ind w:left="640" w:hanging="360"/>
       </w:pPr>
     </w:lvl>
-    <w:lvl w:ilvl="1" w:tplc="5E7E9328">
+    <w:lvl w:ilvl="1" w:tplc="894EE380">
       <w:numFmt w:val="decimal"/>
       <w:lvlText w:val=""/>
       <w:lvlJc w:val="left"/>
     </w:lvl>
-    <w:lvl w:ilvl="2" w:tplc="DC7C1BF4">
+    <w:lvl w:ilvl="2" w:tplc="2F9E4B4E">
       <w:numFmt w:val="decimal"/>
       <w:lvlText w:val=""/>
       <w:lvlJc w:val="left"/>
     </w:lvl>
-    <w:lvl w:ilvl="3" w:tplc="EABE024C">
+    <w:lvl w:ilvl="3" w:tplc="539AA28A">
       <w:numFmt w:val="decimal"/>
       <w:lvlText w:val=""/>
       <w:lvlJc w:val="left"/>
     </w:lvl>
-    <w:lvl w:ilvl="4" w:tplc="9D2E9672">
+    <w:lvl w:ilvl="4" w:tplc="0882AD66">
       <w:numFmt w:val="decimal"/>
       <w:lvlText w:val=""/>
       <w:lvlJc w:val="left"/>
     </w:lvl>
-    <w:lvl w:ilvl="5" w:tplc="2B4209FA">
+    <w:lvl w:ilvl="5" w:tplc="B7F4BE76">
       <w:numFmt w:val="decimal"/>
       <w:lvlText w:val=""/>
       <w:lvlJc w:val="left"/>
     </w:lvl>
-    <w:lvl w:ilvl="6" w:tplc="3DEA944E">
+    <w:lvl w:ilvl="6" w:tplc="60286FB8">
       <w:numFmt w:val="decimal"/>
       <w:lvlText w:val=""/>
       <w:lvlJc w:val="left"/>
     </w:lvl>
-    <w:lvl w:ilvl="7" w:tplc="F0CA1E16">
+    <w:lvl w:ilvl="7" w:tplc="7C88E1B2">
       <w:numFmt w:val="decimal"/>
       <w:lvlText w:val=""/>
       <w:lvlJc w:val="left"/>
     </w:lvl>
-    <w:lvl w:ilvl="8" w:tplc="BA54A2BA">
+    <w:lvl w:ilvl="8" w:tplc="F4D2B454">
       <w:numFmt w:val="decimal"/>
       <w:lvlText w:val=""/>
       <w:lvlJc w:val="left"/>
     </w:lvl>
   </w:abstractNum>
+  <w:abstractNum w:abstractNumId="6" w15:restartNumberingAfterBreak="0">
+    <w:nsid w:val="4D590BEF"/>
+    <w:multiLevelType w:val="hybridMultilevel"/>
+    <w:tmpl w:val="0DD86D14"/>
+    <w:lvl w:ilvl="0" w:tplc="39668BAE">
+      <w:start w:val="1"/>
+      <w:numFmt w:val="bullet"/>
+      <w:lvlText w:val="●"/>
+      <w:lvlJc w:val="left"/>
+      <w:pPr>
+        <w:ind w:left="720" w:hanging="360"/>
+      </w:pPr>
+    </w:lvl>
+    <w:lvl w:ilvl="1" w:tplc="3C026696">
+      <w:start w:val="1"/>
+      <w:numFmt w:val="bullet"/>
+      <w:lvlText w:val="○"/>
+      <w:lvlJc w:val="left"/>
+      <w:pPr>
+        <w:ind w:left="1440" w:hanging="360"/>
+      </w:pPr>
+    </w:lvl>
+    <w:lvl w:ilvl="2" w:tplc="E9D64DC2">
+      <w:start w:val="1"/>
+      <w:numFmt w:val="bullet"/>
+      <w:lvlText w:val="■"/>
+      <w:lvlJc w:val="left"/>
+      <w:pPr>
+        <w:ind w:left="2160" w:hanging="360"/>
+      </w:pPr>
+    </w:lvl>
+    <w:lvl w:ilvl="3" w:tplc="6BAACDBE">
+      <w:start w:val="1"/>
+      <w:numFmt w:val="bullet"/>
+      <w:lvlText w:val="●"/>
+      <w:lvlJc w:val="left"/>
+      <w:pPr>
+        <w:ind w:left="2880" w:hanging="360"/>
+      </w:pPr>
+    </w:lvl>
+    <w:lvl w:ilvl="4" w:tplc="88E43DE6">
+      <w:start w:val="1"/>
+      <w:numFmt w:val="bullet"/>
+      <w:lvlText w:val="○"/>
+      <w:lvlJc w:val="left"/>
+      <w:pPr>
+        <w:ind w:left="3600" w:hanging="360"/>
+      </w:pPr>
+    </w:lvl>
+    <w:lvl w:ilvl="5" w:tplc="01207FC2">
+      <w:start w:val="1"/>
+      <w:numFmt w:val="bullet"/>
+      <w:lvlText w:val="■"/>
+      <w:lvlJc w:val="left"/>
+      <w:pPr>
+        <w:ind w:left="4320" w:hanging="360"/>
+      </w:pPr>
+    </w:lvl>
+    <w:lvl w:ilvl="6" w:tplc="AD7E2A2C">
+      <w:start w:val="1"/>
+      <w:numFmt w:val="bullet"/>
+      <w:lvlText w:val="●"/>
+      <w:lvlJc w:val="left"/>
+      <w:pPr>
+        <w:ind w:left="5040" w:hanging="360"/>
+      </w:pPr>
+    </w:lvl>
+    <w:lvl w:ilvl="7" w:tplc="2E7C92BE">
+      <w:start w:val="1"/>
+      <w:numFmt w:val="bullet"/>
+      <w:lvlText w:val="●"/>
+      <w:lvlJc w:val="left"/>
+      <w:pPr>
+        <w:ind w:left="5760" w:hanging="360"/>
+      </w:pPr>
+    </w:lvl>
+    <w:lvl w:ilvl="8" w:tplc="F236C87C">
+      <w:start w:val="1"/>
+      <w:numFmt w:val="bullet"/>
+      <w:lvlText w:val="●"/>
+      <w:lvlJc w:val="left"/>
+      <w:pPr>
+        <w:ind w:left="6480" w:hanging="360"/>
+      </w:pPr>
+    </w:lvl>
+  </w:abstractNum>
   <w:abstractNum w:abstractNumId="7" w15:restartNumberingAfterBreak="0">
-    <w:nsid w:val="68583A13"/>
+    <w:nsid w:val="585B565A"/>
     <w:multiLevelType w:val="hybridMultilevel"/>
-    <w:tmpl w:val="7882A2FA"/>
-    <w:lvl w:ilvl="0" w:tplc="B9929344">
+    <w:tmpl w:val="18527ECC"/>
+    <w:lvl w:ilvl="0" w:tplc="E6A859D2">
       <w:start w:val="1"/>
-      <w:numFmt w:val="decimal"/>
-      <w:lvlText w:val="%1."/>
+      <w:numFmt w:val="bullet"/>
+      <w:lvlText w:val="•"/>
       <w:lvlJc w:val="left"/>
       <w:pPr>
-        <w:ind w:left="640" w:hanging="360"/>
+        <w:ind w:left="640" w:hanging="320"/>
       </w:pPr>
     </w:lvl>
-    <w:lvl w:ilvl="1" w:tplc="2E7A7F5A">
+    <w:lvl w:ilvl="1" w:tplc="646CF072">
+      <w:start w:val="1"/>
+      <w:numFmt w:val="bullet"/>
+      <w:lvlText w:val="–"/>
+      <w:lvlJc w:val="left"/>
+      <w:pPr>
+        <w:ind w:left="1100" w:hanging="320"/>
+      </w:pPr>
+    </w:lvl>
+    <w:lvl w:ilvl="2" w:tplc="C91812DC">
       <w:numFmt w:val="decimal"/>
       <w:lvlText w:val=""/>
       <w:lvlJc w:val="left"/>
     </w:lvl>
-    <w:lvl w:ilvl="2" w:tplc="29200A92">
+    <w:lvl w:ilvl="3" w:tplc="CFEA01D4">
       <w:numFmt w:val="decimal"/>
       <w:lvlText w:val=""/>
       <w:lvlJc w:val="left"/>
     </w:lvl>
-    <w:lvl w:ilvl="3" w:tplc="F00699E4">
+    <w:lvl w:ilvl="4" w:tplc="98A43522">
       <w:numFmt w:val="decimal"/>
       <w:lvlText w:val=""/>
       <w:lvlJc w:val="left"/>
     </w:lvl>
-    <w:lvl w:ilvl="4" w:tplc="390CCFAE">
+    <w:lvl w:ilvl="5" w:tplc="BC548B26">
       <w:numFmt w:val="decimal"/>
       <w:lvlText w:val=""/>
       <w:lvlJc w:val="left"/>
     </w:lvl>
-    <w:lvl w:ilvl="5" w:tplc="05CEFDAA">
+    <w:lvl w:ilvl="6" w:tplc="9A40F83A">
       <w:numFmt w:val="decimal"/>
       <w:lvlText w:val=""/>
       <w:lvlJc w:val="left"/>
     </w:lvl>
-    <w:lvl w:ilvl="6" w:tplc="21FC346E">
+    <w:lvl w:ilvl="7" w:tplc="79506142">
       <w:numFmt w:val="decimal"/>
       <w:lvlText w:val=""/>
       <w:lvlJc w:val="left"/>
     </w:lvl>
-    <w:lvl w:ilvl="7" w:tplc="DA92B498">
-      <w:numFmt w:val="decimal"/>
-      <w:lvlText w:val=""/>
-      <w:lvlJc w:val="left"/>
-    </w:lvl>
-    <w:lvl w:ilvl="8" w:tplc="B338226A">
+    <w:lvl w:ilvl="8" w:tplc="C004FD20">
       <w:numFmt w:val="decimal"/>
       <w:lvlText w:val=""/>
       <w:lvlJc w:val="left"/>
     </w:lvl>
   </w:abstractNum>
-  <w:num w:numId="1" w16cid:durableId="1335377671">
+  <w:num w:numId="1" w16cid:durableId="451827365">
+    <w:abstractNumId w:val="6"/>
+    <w:lvlOverride w:ilvl="0">
+      <w:startOverride w:val="1"/>
+    </w:lvlOverride>
+  </w:num>
+  <w:num w:numId="2" w16cid:durableId="1564871646">
+    <w:abstractNumId w:val="2"/>
+    <w:lvlOverride w:ilvl="0">
+      <w:startOverride w:val="1"/>
+    </w:lvlOverride>
+  </w:num>
+  <w:num w:numId="3" w16cid:durableId="524750742">
+    <w:abstractNumId w:val="7"/>
+    <w:lvlOverride w:ilvl="0">
+      <w:startOverride w:val="1"/>
+    </w:lvlOverride>
+  </w:num>
+  <w:num w:numId="4" w16cid:durableId="2102095232">
     <w:abstractNumId w:val="5"/>
     <w:lvlOverride w:ilvl="0">
       <w:startOverride w:val="1"/>
     </w:lvlOverride>
   </w:num>
-  <w:num w:numId="2" w16cid:durableId="1940260328">
+  <w:num w:numId="5" w16cid:durableId="1816533270">
+    <w:abstractNumId w:val="1"/>
+    <w:lvlOverride w:ilvl="0">
+      <w:startOverride w:val="1"/>
+    </w:lvlOverride>
+  </w:num>
+  <w:num w:numId="6" w16cid:durableId="112288691">
+    <w:abstractNumId w:val="3"/>
+    <w:lvlOverride w:ilvl="0">
+      <w:startOverride w:val="1"/>
+    </w:lvlOverride>
+  </w:num>
+  <w:num w:numId="7" w16cid:durableId="685642596">
     <w:abstractNumId w:val="4"/>
     <w:lvlOverride w:ilvl="0">
       <w:startOverride w:val="1"/>
     </w:lvlOverride>
   </w:num>
-  <w:num w:numId="3" w16cid:durableId="1418211166">
-    <w:abstractNumId w:val="2"/>
-    <w:lvlOverride w:ilvl="0">
-      <w:startOverride w:val="1"/>
-    </w:lvlOverride>
-  </w:num>
-  <w:num w:numId="4" w16cid:durableId="1739204733">
-    <w:abstractNumId w:val="7"/>
-    <w:lvlOverride w:ilvl="0">
-      <w:startOverride w:val="1"/>
-    </w:lvlOverride>
-  </w:num>
-  <w:num w:numId="5" w16cid:durableId="1213228716">
-    <w:abstractNumId w:val="6"/>
-    <w:lvlOverride w:ilvl="0">
-      <w:startOverride w:val="1"/>
-    </w:lvlOverride>
-  </w:num>
-  <w:num w:numId="6" w16cid:durableId="1318339751">
-    <w:abstractNumId w:val="3"/>
-    <w:lvlOverride w:ilvl="0">
-      <w:startOverride w:val="1"/>
-    </w:lvlOverride>
-  </w:num>
-  <w:num w:numId="7" w16cid:durableId="592781443">
-    <w:abstractNumId w:val="1"/>
-    <w:lvlOverride w:ilvl="0">
-      <w:startOverride w:val="1"/>
-    </w:lvlOverride>
-  </w:num>
-  <w:num w:numId="8" w16cid:durableId="1127743970">
+  <w:num w:numId="8" w16cid:durableId="907955011">
     <w:abstractNumId w:val="0"/>
     <w:lvlOverride w:ilvl="0">
       <w:startOverride w:val="1"/>
@@ -20344,7 +20553,7 @@
     <w:autoRedefine/>
     <w:uiPriority w:val="39"/>
     <w:unhideWhenUsed/>
-    <w:rsid w:val="009C528E"/>
+    <w:rsid w:val="00E16541"/>
     <w:pPr>
       <w:spacing w:after="100"/>
     </w:pPr>
@@ -20356,7 +20565,7 @@
     <w:autoRedefine/>
     <w:uiPriority w:val="39"/>
     <w:unhideWhenUsed/>
-    <w:rsid w:val="009C528E"/>
+    <w:rsid w:val="00E16541"/>
     <w:pPr>
       <w:spacing w:after="100"/>
       <w:ind w:left="260"/>

</xml_diff>